<commit_message>
Add FAQ and Feedback
</commit_message>
<xml_diff>
--- a/docs/SRS.docx
+++ b/docs/SRS.docx
@@ -90,13 +90,20 @@
           <w:rFonts w:ascii="Times New Roman" w:eastAsia="Times New Roman" w:hAnsi="Times New Roman" w:cs="Times New Roman"/>
           <w:lang w:val="en-IN" w:eastAsia="en-IN" w:bidi="gu-IN"/>
         </w:rPr>
-        <w:t>02</w:t>
+        <w:t>0</w:t>
       </w:r>
       <w:r>
         <w:rPr>
           <w:rFonts w:ascii="Times New Roman" w:eastAsia="Times New Roman" w:hAnsi="Times New Roman" w:cs="Times New Roman"/>
           <w:lang w:val="en-IN" w:eastAsia="en-IN" w:bidi="gu-IN"/>
         </w:rPr>
+        <w:t>2</w:t>
+      </w:r>
+      <w:r>
+        <w:rPr>
+          <w:rFonts w:ascii="Times New Roman" w:eastAsia="Times New Roman" w:hAnsi="Times New Roman" w:cs="Times New Roman"/>
+          <w:lang w:val="en-IN" w:eastAsia="en-IN" w:bidi="gu-IN"/>
+        </w:rPr>
         <w:t>-</w:t>
       </w:r>
       <w:r>
@@ -104,7 +111,14 @@
           <w:rFonts w:ascii="Times New Roman" w:eastAsia="Times New Roman" w:hAnsi="Times New Roman" w:cs="Times New Roman"/>
           <w:lang w:val="en-IN" w:eastAsia="en-IN" w:bidi="gu-IN"/>
         </w:rPr>
-        <w:t>04</w:t>
+        <w:t>0</w:t>
+      </w:r>
+      <w:r>
+        <w:rPr>
+          <w:rFonts w:ascii="Times New Roman" w:eastAsia="Times New Roman" w:hAnsi="Times New Roman" w:cs="Times New Roman"/>
+          <w:lang w:val="en-IN" w:eastAsia="en-IN" w:bidi="gu-IN"/>
+        </w:rPr>
+        <w:t>5</w:t>
       </w:r>
       <w:r>
         <w:rPr>
@@ -540,37 +554,43 @@
         </w:rPr>
         <w:t>Mandi Price Intelligence</w:t>
       </w:r>
-    </w:p>
-    <w:p>
-      <w:pPr>
-        <w:pStyle w:val="ListParagraph"/>
-        <w:numPr>
-          <w:ilvl w:val="1"/>
-          <w:numId w:val="63"/>
-        </w:numPr>
-        <w:spacing w:before="100" w:beforeAutospacing="1" w:after="100" w:afterAutospacing="1" w:line="240" w:lineRule="auto"/>
+      <w:r>
         <w:rPr>
           <w:rFonts w:ascii="Times New Roman" w:eastAsia="Times New Roman" w:hAnsi="Times New Roman" w:cs="Times New Roman"/>
           <w:lang w:val="en-IN" w:eastAsia="en-IN" w:bidi="gu-IN"/>
         </w:rPr>
-      </w:pPr>
+        <w:br/>
+        <w:t xml:space="preserve">     </w:t>
+      </w:r>
       <w:r>
         <w:rPr>
           <w:rFonts w:ascii="Times New Roman" w:eastAsia="Times New Roman" w:hAnsi="Times New Roman" w:cs="Times New Roman"/>
           <w:lang w:val="en-IN" w:eastAsia="en-IN" w:bidi="gu-IN"/>
         </w:rPr>
+        <w:t xml:space="preserve">3.3 </w:t>
+      </w:r>
+      <w:r>
+        <w:rPr>
+          <w:rFonts w:ascii="Times New Roman" w:eastAsia="Times New Roman" w:hAnsi="Times New Roman" w:cs="Times New Roman"/>
+          <w:lang w:val="en-IN" w:eastAsia="en-IN" w:bidi="gu-IN"/>
+        </w:rPr>
         <w:t>Government Subsidy System</w:t>
       </w:r>
-    </w:p>
-    <w:p>
-      <w:pPr>
-        <w:spacing w:before="100" w:beforeAutospacing="1" w:after="100" w:afterAutospacing="1" w:line="240" w:lineRule="auto"/>
-        <w:ind w:left="883"/>
+      <w:r>
         <w:rPr>
           <w:rFonts w:ascii="Times New Roman" w:eastAsia="Times New Roman" w:hAnsi="Times New Roman" w:cs="Times New Roman"/>
           <w:lang w:val="en-IN" w:eastAsia="en-IN" w:bidi="gu-IN"/>
         </w:rPr>
-      </w:pPr>
+        <w:t xml:space="preserve"> </w:t>
+      </w:r>
+      <w:r>
+        <w:rPr>
+          <w:rFonts w:ascii="Times New Roman" w:eastAsia="Times New Roman" w:hAnsi="Times New Roman" w:cs="Times New Roman"/>
+          <w:lang w:val="en-IN" w:eastAsia="en-IN" w:bidi="gu-IN"/>
+        </w:rPr>
+        <w:br/>
+        <w:t xml:space="preserve">     </w:t>
+      </w:r>
       <w:r>
         <w:rPr>
           <w:rFonts w:ascii="Times New Roman" w:eastAsia="Times New Roman" w:hAnsi="Times New Roman" w:cs="Times New Roman"/>
@@ -806,21 +826,18 @@
         </w:rPr>
         <w:t>Other Requirements</w:t>
       </w:r>
-    </w:p>
-    <w:p>
-      <w:pPr>
-        <w:spacing w:before="100" w:beforeAutospacing="1" w:after="100" w:afterAutospacing="1" w:line="240" w:lineRule="auto"/>
+      <w:r>
         <w:rPr>
           <w:rFonts w:ascii="Times New Roman" w:eastAsia="Times New Roman" w:hAnsi="Times New Roman" w:cs="Times New Roman"/>
           <w:lang w:val="en-IN" w:eastAsia="en-IN" w:bidi="gu-IN"/>
         </w:rPr>
-      </w:pPr>
+        <w:br/>
+      </w:r>
       <w:r>
         <w:rPr>
           <w:rFonts w:ascii="Times New Roman" w:eastAsia="Times New Roman" w:hAnsi="Times New Roman" w:cs="Times New Roman"/>
           <w:lang w:val="en-IN" w:eastAsia="en-IN" w:bidi="gu-IN"/>
         </w:rPr>
-        <w:lastRenderedPageBreak/>
         <w:t>Appendix A: Glossary</w:t>
       </w:r>
       <w:r>
@@ -854,11 +871,7 @@
           <w:lang w:val="en-IN" w:eastAsia="en-IN"/>
         </w:rPr>
       </w:pPr>
-    </w:p>
-    <w:p>
-      <w:pPr>
-        <w:spacing w:before="100" w:beforeAutospacing="1" w:after="100" w:afterAutospacing="1" w:line="240" w:lineRule="auto"/>
-        <w:outlineLvl w:val="0"/>
+      <w:r>
         <w:rPr>
           <w:rFonts w:ascii="Times New Roman" w:eastAsia="Times New Roman" w:hAnsi="Times New Roman" w:cs="Times New Roman"/>
           <w:b/>
@@ -868,6 +881,600 @@
           <w:szCs w:val="48"/>
           <w:lang w:val="en-IN" w:eastAsia="en-IN"/>
         </w:rPr>
+        <w:lastRenderedPageBreak/>
+        <w:t>1. Introduction</w:t>
+      </w:r>
+    </w:p>
+    <w:p>
+      <w:pPr>
+        <w:spacing w:before="100" w:beforeAutospacing="1" w:after="100" w:afterAutospacing="1" w:line="240" w:lineRule="auto"/>
+        <w:outlineLvl w:val="1"/>
+        <w:rPr>
+          <w:rFonts w:ascii="Times New Roman" w:eastAsia="Times New Roman" w:hAnsi="Times New Roman" w:cs="Times New Roman"/>
+          <w:b/>
+          <w:bCs/>
+          <w:sz w:val="36"/>
+          <w:szCs w:val="36"/>
+          <w:lang w:val="en-IN" w:eastAsia="en-IN"/>
+        </w:rPr>
+      </w:pPr>
+      <w:r>
+        <w:rPr>
+          <w:rFonts w:ascii="Times New Roman" w:eastAsia="Times New Roman" w:hAnsi="Times New Roman" w:cs="Times New Roman"/>
+          <w:b/>
+          <w:bCs/>
+          <w:sz w:val="36"/>
+          <w:szCs w:val="36"/>
+          <w:lang w:val="en-IN" w:eastAsia="en-IN"/>
+        </w:rPr>
+        <w:t>1.1 Purpose</w:t>
+      </w:r>
+    </w:p>
+    <w:p>
+      <w:pPr>
+        <w:spacing w:before="100" w:beforeAutospacing="1" w:after="100" w:afterAutospacing="1" w:line="240" w:lineRule="auto"/>
+        <w:rPr>
+          <w:rFonts w:ascii="Times New Roman" w:eastAsia="Times New Roman" w:hAnsi="Times New Roman" w:cs="Times New Roman"/>
+          <w:lang w:val="en-IN" w:eastAsia="en-IN"/>
+        </w:rPr>
+      </w:pPr>
+      <w:proofErr w:type="spellStart"/>
+      <w:r>
+        <w:rPr>
+          <w:rFonts w:ascii="Times New Roman" w:eastAsia="Times New Roman" w:hAnsi="Times New Roman" w:cs="Times New Roman"/>
+          <w:lang w:val="en-IN" w:eastAsia="en-IN"/>
+        </w:rPr>
+        <w:t>AgriCare</w:t>
+      </w:r>
+      <w:proofErr w:type="spellEnd"/>
+      <w:r>
+        <w:rPr>
+          <w:rFonts w:ascii="Times New Roman" w:eastAsia="Times New Roman" w:hAnsi="Times New Roman" w:cs="Times New Roman"/>
+          <w:lang w:val="en-IN" w:eastAsia="en-IN"/>
+        </w:rPr>
+        <w:t xml:space="preserve"> is a web-based agriculture management system designed to empower farmers using modern technologies such as Artificial Intelligence, real-time market data, and government resources to improve decision-making and productivity.</w:t>
+      </w:r>
+    </w:p>
+    <w:p>
+      <w:pPr>
+        <w:spacing w:before="100" w:beforeAutospacing="1" w:after="100" w:afterAutospacing="1" w:line="240" w:lineRule="auto"/>
+        <w:outlineLvl w:val="1"/>
+        <w:rPr>
+          <w:rFonts w:ascii="Times New Roman" w:eastAsia="Times New Roman" w:hAnsi="Times New Roman" w:cs="Times New Roman"/>
+          <w:b/>
+          <w:bCs/>
+          <w:sz w:val="36"/>
+          <w:szCs w:val="36"/>
+          <w:lang w:val="en-IN" w:eastAsia="en-IN"/>
+        </w:rPr>
+      </w:pPr>
+      <w:r>
+        <w:rPr>
+          <w:rFonts w:ascii="Times New Roman" w:eastAsia="Times New Roman" w:hAnsi="Times New Roman" w:cs="Times New Roman"/>
+          <w:b/>
+          <w:bCs/>
+          <w:sz w:val="36"/>
+          <w:szCs w:val="36"/>
+          <w:lang w:val="en-IN" w:eastAsia="en-IN"/>
+        </w:rPr>
+        <w:t>1.2 Document Conventions</w:t>
+      </w:r>
+    </w:p>
+    <w:p>
+      <w:pPr>
+        <w:spacing w:before="100" w:beforeAutospacing="1" w:after="100" w:afterAutospacing="1" w:line="240" w:lineRule="auto"/>
+        <w:rPr>
+          <w:rFonts w:ascii="Times New Roman" w:eastAsia="Times New Roman" w:hAnsi="Times New Roman" w:cs="Times New Roman"/>
+          <w:lang w:val="en-IN" w:eastAsia="en-IN"/>
+        </w:rPr>
+      </w:pPr>
+      <w:r>
+        <w:rPr>
+          <w:rFonts w:ascii="Times New Roman" w:eastAsia="Times New Roman" w:hAnsi="Times New Roman" w:cs="Times New Roman"/>
+          <w:lang w:val="en-IN" w:eastAsia="en-IN"/>
+        </w:rPr>
+        <w:t>This document is structured using numbered sections and clear headings. Technical terms are defined in the glossary.</w:t>
+      </w:r>
+    </w:p>
+    <w:p>
+      <w:pPr>
+        <w:spacing w:before="100" w:beforeAutospacing="1" w:after="100" w:afterAutospacing="1" w:line="240" w:lineRule="auto"/>
+        <w:outlineLvl w:val="1"/>
+        <w:rPr>
+          <w:rFonts w:ascii="Times New Roman" w:eastAsia="Times New Roman" w:hAnsi="Times New Roman" w:cs="Times New Roman"/>
+          <w:b/>
+          <w:bCs/>
+          <w:sz w:val="36"/>
+          <w:szCs w:val="36"/>
+          <w:lang w:val="en-IN" w:eastAsia="en-IN"/>
+        </w:rPr>
+      </w:pPr>
+      <w:r>
+        <w:rPr>
+          <w:rFonts w:ascii="Times New Roman" w:eastAsia="Times New Roman" w:hAnsi="Times New Roman" w:cs="Times New Roman"/>
+          <w:b/>
+          <w:bCs/>
+          <w:sz w:val="36"/>
+          <w:szCs w:val="36"/>
+          <w:lang w:val="en-IN" w:eastAsia="en-IN"/>
+        </w:rPr>
+        <w:t>1.3 Intended Audience</w:t>
+      </w:r>
+      <w:r>
+        <w:rPr>
+          <w:rFonts w:ascii="Times New Roman" w:eastAsia="Times New Roman" w:hAnsi="Times New Roman" w:cs="Times New Roman"/>
+          <w:b/>
+          <w:bCs/>
+          <w:sz w:val="36"/>
+          <w:szCs w:val="36"/>
+          <w:lang w:val="en-IN" w:eastAsia="en-IN"/>
+        </w:rPr>
+        <w:t xml:space="preserve"> </w:t>
+      </w:r>
+      <w:r>
+        <w:rPr>
+          <w:rFonts w:ascii="Times New Roman" w:eastAsia="Times New Roman" w:hAnsi="Times New Roman" w:cs="Times New Roman"/>
+          <w:b/>
+          <w:bCs/>
+          <w:sz w:val="36"/>
+          <w:szCs w:val="36"/>
+          <w:lang w:val="en-IN" w:eastAsia="en-IN"/>
+        </w:rPr>
+        <w:t>and Reading Suggestions</w:t>
+      </w:r>
+    </w:p>
+    <w:p>
+      <w:pPr>
+        <w:numPr>
+          <w:ilvl w:val="0"/>
+          <w:numId w:val="43"/>
+        </w:numPr>
+        <w:spacing w:before="100" w:beforeAutospacing="1" w:after="100" w:afterAutospacing="1" w:line="240" w:lineRule="auto"/>
+        <w:rPr>
+          <w:rFonts w:ascii="Times New Roman" w:eastAsia="Times New Roman" w:hAnsi="Times New Roman" w:cs="Times New Roman"/>
+          <w:lang w:val="en-IN" w:eastAsia="en-IN"/>
+        </w:rPr>
+      </w:pPr>
+      <w:r>
+        <w:rPr>
+          <w:rFonts w:ascii="Times New Roman" w:eastAsia="Times New Roman" w:hAnsi="Times New Roman" w:cs="Times New Roman"/>
+          <w:lang w:val="en-IN" w:eastAsia="en-IN"/>
+        </w:rPr>
+        <w:t xml:space="preserve">Project Developers &amp; Maintainers </w:t>
+      </w:r>
+    </w:p>
+    <w:p>
+      <w:pPr>
+        <w:numPr>
+          <w:ilvl w:val="0"/>
+          <w:numId w:val="43"/>
+        </w:numPr>
+        <w:spacing w:before="100" w:beforeAutospacing="1" w:after="100" w:afterAutospacing="1" w:line="240" w:lineRule="auto"/>
+        <w:rPr>
+          <w:rFonts w:ascii="Times New Roman" w:eastAsia="Times New Roman" w:hAnsi="Times New Roman" w:cs="Times New Roman"/>
+          <w:lang w:val="en-IN" w:eastAsia="en-IN"/>
+        </w:rPr>
+      </w:pPr>
+      <w:r>
+        <w:rPr>
+          <w:rFonts w:ascii="Times New Roman" w:eastAsia="Times New Roman" w:hAnsi="Times New Roman" w:cs="Times New Roman"/>
+          <w:lang w:val="en-IN" w:eastAsia="en-IN"/>
+        </w:rPr>
+        <w:t xml:space="preserve">Faculty Evaluators </w:t>
+      </w:r>
+    </w:p>
+    <w:p>
+      <w:pPr>
+        <w:numPr>
+          <w:ilvl w:val="0"/>
+          <w:numId w:val="43"/>
+        </w:numPr>
+        <w:spacing w:before="100" w:beforeAutospacing="1" w:after="100" w:afterAutospacing="1" w:line="240" w:lineRule="auto"/>
+        <w:rPr>
+          <w:rFonts w:ascii="Times New Roman" w:eastAsia="Times New Roman" w:hAnsi="Times New Roman" w:cs="Times New Roman"/>
+          <w:lang w:val="en-IN" w:eastAsia="en-IN"/>
+        </w:rPr>
+      </w:pPr>
+      <w:r>
+        <w:rPr>
+          <w:rFonts w:ascii="Times New Roman" w:eastAsia="Times New Roman" w:hAnsi="Times New Roman" w:cs="Times New Roman"/>
+          <w:lang w:val="en-IN" w:eastAsia="en-IN"/>
+        </w:rPr>
+        <w:t xml:space="preserve">Farmers (End Users) </w:t>
+      </w:r>
+    </w:p>
+    <w:p>
+      <w:pPr>
+        <w:numPr>
+          <w:ilvl w:val="0"/>
+          <w:numId w:val="43"/>
+        </w:numPr>
+        <w:spacing w:before="100" w:beforeAutospacing="1" w:after="100" w:afterAutospacing="1" w:line="240" w:lineRule="auto"/>
+        <w:rPr>
+          <w:rFonts w:ascii="Times New Roman" w:eastAsia="Times New Roman" w:hAnsi="Times New Roman" w:cs="Times New Roman"/>
+          <w:lang w:val="en-IN" w:eastAsia="en-IN"/>
+        </w:rPr>
+      </w:pPr>
+      <w:r>
+        <w:rPr>
+          <w:rFonts w:ascii="Times New Roman" w:eastAsia="Times New Roman" w:hAnsi="Times New Roman" w:cs="Times New Roman"/>
+          <w:lang w:val="en-IN" w:eastAsia="en-IN"/>
+        </w:rPr>
+        <w:t xml:space="preserve">System Administrators </w:t>
+      </w:r>
+    </w:p>
+    <w:p>
+      <w:pPr>
+        <w:spacing w:before="100" w:beforeAutospacing="1" w:after="100" w:afterAutospacing="1" w:line="240" w:lineRule="auto"/>
+        <w:outlineLvl w:val="1"/>
+        <w:rPr>
+          <w:rFonts w:ascii="Times New Roman" w:eastAsia="Times New Roman" w:hAnsi="Times New Roman" w:cs="Times New Roman"/>
+          <w:b/>
+          <w:bCs/>
+          <w:sz w:val="36"/>
+          <w:szCs w:val="36"/>
+          <w:lang w:val="en-IN" w:eastAsia="en-IN"/>
+        </w:rPr>
+      </w:pPr>
+      <w:r>
+        <w:rPr>
+          <w:rFonts w:ascii="Times New Roman" w:eastAsia="Times New Roman" w:hAnsi="Times New Roman" w:cs="Times New Roman"/>
+          <w:b/>
+          <w:bCs/>
+          <w:sz w:val="36"/>
+          <w:szCs w:val="36"/>
+          <w:lang w:val="en-IN" w:eastAsia="en-IN"/>
+        </w:rPr>
+        <w:t>1.4 Project Scope</w:t>
+      </w:r>
+    </w:p>
+    <w:p>
+      <w:pPr>
+        <w:spacing w:before="100" w:beforeAutospacing="1" w:after="100" w:afterAutospacing="1" w:line="240" w:lineRule="auto"/>
+        <w:rPr>
+          <w:rFonts w:ascii="Times New Roman" w:eastAsia="Times New Roman" w:hAnsi="Times New Roman" w:cs="Times New Roman"/>
+          <w:lang w:val="en-IN" w:eastAsia="en-IN"/>
+        </w:rPr>
+      </w:pPr>
+      <w:r>
+        <w:rPr>
+          <w:rFonts w:ascii="Times New Roman" w:eastAsia="Times New Roman" w:hAnsi="Times New Roman" w:cs="Times New Roman"/>
+          <w:lang w:val="en-IN" w:eastAsia="en-IN"/>
+        </w:rPr>
+        <w:t xml:space="preserve">The </w:t>
+      </w:r>
+      <w:proofErr w:type="spellStart"/>
+      <w:r>
+        <w:rPr>
+          <w:rFonts w:ascii="Times New Roman" w:eastAsia="Times New Roman" w:hAnsi="Times New Roman" w:cs="Times New Roman"/>
+          <w:lang w:val="en-IN" w:eastAsia="en-IN"/>
+        </w:rPr>
+        <w:t>AgriCare</w:t>
+      </w:r>
+      <w:proofErr w:type="spellEnd"/>
+      <w:r>
+        <w:rPr>
+          <w:rFonts w:ascii="Times New Roman" w:eastAsia="Times New Roman" w:hAnsi="Times New Roman" w:cs="Times New Roman"/>
+          <w:lang w:val="en-IN" w:eastAsia="en-IN"/>
+        </w:rPr>
+        <w:t xml:space="preserve"> system provides:</w:t>
+      </w:r>
+    </w:p>
+    <w:p>
+      <w:pPr>
+        <w:numPr>
+          <w:ilvl w:val="0"/>
+          <w:numId w:val="44"/>
+        </w:numPr>
+        <w:spacing w:before="100" w:beforeAutospacing="1" w:after="100" w:afterAutospacing="1" w:line="240" w:lineRule="auto"/>
+        <w:rPr>
+          <w:rFonts w:ascii="Times New Roman" w:eastAsia="Times New Roman" w:hAnsi="Times New Roman" w:cs="Times New Roman"/>
+          <w:lang w:val="en-IN" w:eastAsia="en-IN"/>
+        </w:rPr>
+      </w:pPr>
+      <w:r>
+        <w:rPr>
+          <w:rFonts w:ascii="Times New Roman" w:eastAsia="Times New Roman" w:hAnsi="Times New Roman" w:cs="Times New Roman"/>
+          <w:lang w:val="en-IN" w:eastAsia="en-IN"/>
+        </w:rPr>
+        <w:t xml:space="preserve">AI-based crop disease detection using </w:t>
+      </w:r>
+      <w:r>
+        <w:rPr>
+          <w:rFonts w:ascii="Times New Roman" w:eastAsia="Times New Roman" w:hAnsi="Times New Roman" w:cs="Times New Roman"/>
+          <w:lang w:val="en-IN" w:eastAsia="en-IN"/>
+        </w:rPr>
+        <w:t>trained Model</w:t>
+      </w:r>
+      <w:r>
+        <w:rPr>
+          <w:rFonts w:ascii="Times New Roman" w:eastAsia="Times New Roman" w:hAnsi="Times New Roman" w:cs="Times New Roman"/>
+          <w:lang w:val="en-IN" w:eastAsia="en-IN"/>
+        </w:rPr>
+        <w:t xml:space="preserve"> </w:t>
+      </w:r>
+    </w:p>
+    <w:p>
+      <w:pPr>
+        <w:numPr>
+          <w:ilvl w:val="0"/>
+          <w:numId w:val="44"/>
+        </w:numPr>
+        <w:spacing w:before="100" w:beforeAutospacing="1" w:after="100" w:afterAutospacing="1" w:line="240" w:lineRule="auto"/>
+        <w:rPr>
+          <w:rFonts w:ascii="Times New Roman" w:eastAsia="Times New Roman" w:hAnsi="Times New Roman" w:cs="Times New Roman"/>
+          <w:lang w:val="en-IN" w:eastAsia="en-IN"/>
+        </w:rPr>
+      </w:pPr>
+      <w:r>
+        <w:rPr>
+          <w:rFonts w:ascii="Times New Roman" w:eastAsia="Times New Roman" w:hAnsi="Times New Roman" w:cs="Times New Roman"/>
+          <w:lang w:val="en-IN" w:eastAsia="en-IN"/>
+        </w:rPr>
+        <w:t xml:space="preserve">Live mandi prices using </w:t>
+      </w:r>
+      <w:proofErr w:type="spellStart"/>
+      <w:r>
+        <w:rPr>
+          <w:rFonts w:ascii="Times New Roman" w:eastAsia="Times New Roman" w:hAnsi="Times New Roman" w:cs="Times New Roman"/>
+          <w:lang w:val="en-IN" w:eastAsia="en-IN"/>
+        </w:rPr>
+        <w:t>Agmarknet</w:t>
+      </w:r>
+      <w:proofErr w:type="spellEnd"/>
+      <w:r>
+        <w:rPr>
+          <w:rFonts w:ascii="Times New Roman" w:eastAsia="Times New Roman" w:hAnsi="Times New Roman" w:cs="Times New Roman"/>
+          <w:lang w:val="en-IN" w:eastAsia="en-IN"/>
+        </w:rPr>
+        <w:t xml:space="preserve"> API </w:t>
+      </w:r>
+    </w:p>
+    <w:p>
+      <w:pPr>
+        <w:numPr>
+          <w:ilvl w:val="0"/>
+          <w:numId w:val="44"/>
+        </w:numPr>
+        <w:spacing w:before="100" w:beforeAutospacing="1" w:after="100" w:afterAutospacing="1" w:line="240" w:lineRule="auto"/>
+        <w:rPr>
+          <w:rFonts w:ascii="Times New Roman" w:eastAsia="Times New Roman" w:hAnsi="Times New Roman" w:cs="Times New Roman"/>
+          <w:lang w:val="en-IN" w:eastAsia="en-IN"/>
+        </w:rPr>
+      </w:pPr>
+      <w:r>
+        <w:rPr>
+          <w:rFonts w:ascii="Times New Roman" w:eastAsia="Times New Roman" w:hAnsi="Times New Roman" w:cs="Times New Roman"/>
+          <w:lang w:val="en-IN" w:eastAsia="en-IN"/>
+        </w:rPr>
+        <w:t xml:space="preserve">Crop calendar for seasonal farming guidance </w:t>
+      </w:r>
+    </w:p>
+    <w:p>
+      <w:pPr>
+        <w:numPr>
+          <w:ilvl w:val="0"/>
+          <w:numId w:val="44"/>
+        </w:numPr>
+        <w:spacing w:before="100" w:beforeAutospacing="1" w:after="100" w:afterAutospacing="1" w:line="240" w:lineRule="auto"/>
+        <w:rPr>
+          <w:rFonts w:ascii="Times New Roman" w:eastAsia="Times New Roman" w:hAnsi="Times New Roman" w:cs="Times New Roman"/>
+          <w:lang w:val="en-IN" w:eastAsia="en-IN"/>
+        </w:rPr>
+      </w:pPr>
+      <w:r>
+        <w:rPr>
+          <w:rFonts w:ascii="Times New Roman" w:eastAsia="Times New Roman" w:hAnsi="Times New Roman" w:cs="Times New Roman"/>
+          <w:lang w:val="en-IN" w:eastAsia="en-IN"/>
+        </w:rPr>
+        <w:t xml:space="preserve">Government subsidy information portal </w:t>
+      </w:r>
+    </w:p>
+    <w:p>
+      <w:pPr>
+        <w:numPr>
+          <w:ilvl w:val="0"/>
+          <w:numId w:val="44"/>
+        </w:numPr>
+        <w:spacing w:before="100" w:beforeAutospacing="1" w:after="100" w:afterAutospacing="1" w:line="240" w:lineRule="auto"/>
+        <w:rPr>
+          <w:rFonts w:ascii="Times New Roman" w:eastAsia="Times New Roman" w:hAnsi="Times New Roman" w:cs="Times New Roman"/>
+          <w:lang w:val="en-IN" w:eastAsia="en-IN"/>
+        </w:rPr>
+      </w:pPr>
+      <w:r>
+        <w:rPr>
+          <w:rFonts w:ascii="Times New Roman" w:eastAsia="Times New Roman" w:hAnsi="Times New Roman" w:cs="Times New Roman"/>
+          <w:lang w:val="en-IN" w:eastAsia="en-IN"/>
+        </w:rPr>
+        <w:t xml:space="preserve">Local agricultural shop locator using GPS </w:t>
+      </w:r>
+    </w:p>
+    <w:p>
+      <w:pPr>
+        <w:numPr>
+          <w:ilvl w:val="0"/>
+          <w:numId w:val="44"/>
+        </w:numPr>
+        <w:spacing w:before="100" w:beforeAutospacing="1" w:after="100" w:afterAutospacing="1" w:line="240" w:lineRule="auto"/>
+        <w:rPr>
+          <w:rFonts w:ascii="Times New Roman" w:eastAsia="Times New Roman" w:hAnsi="Times New Roman" w:cs="Times New Roman"/>
+          <w:lang w:val="en-IN" w:eastAsia="en-IN"/>
+        </w:rPr>
+      </w:pPr>
+      <w:r>
+        <w:rPr>
+          <w:rFonts w:ascii="Times New Roman" w:eastAsia="Times New Roman" w:hAnsi="Times New Roman" w:cs="Times New Roman"/>
+          <w:lang w:val="en-IN" w:eastAsia="en-IN"/>
+        </w:rPr>
+        <w:t xml:space="preserve">Multilingual support (English, Gujarati, Hindi) </w:t>
+      </w:r>
+    </w:p>
+    <w:p>
+      <w:pPr>
+        <w:spacing w:before="100" w:beforeAutospacing="1" w:after="100" w:afterAutospacing="1" w:line="240" w:lineRule="auto"/>
+        <w:outlineLvl w:val="1"/>
+        <w:rPr>
+          <w:rFonts w:ascii="Times New Roman" w:eastAsia="Times New Roman" w:hAnsi="Times New Roman" w:cs="Times New Roman"/>
+          <w:b/>
+          <w:bCs/>
+          <w:sz w:val="36"/>
+          <w:szCs w:val="36"/>
+          <w:lang w:val="en-IN" w:eastAsia="en-IN"/>
+        </w:rPr>
+      </w:pPr>
+      <w:r>
+        <w:rPr>
+          <w:rFonts w:ascii="Times New Roman" w:eastAsia="Times New Roman" w:hAnsi="Times New Roman" w:cs="Times New Roman"/>
+          <w:b/>
+          <w:bCs/>
+          <w:sz w:val="36"/>
+          <w:szCs w:val="36"/>
+          <w:lang w:val="en-IN" w:eastAsia="en-IN"/>
+        </w:rPr>
+        <w:t>1.5 References</w:t>
+      </w:r>
+    </w:p>
+    <w:p>
+      <w:pPr>
+        <w:numPr>
+          <w:ilvl w:val="0"/>
+          <w:numId w:val="45"/>
+        </w:numPr>
+        <w:spacing w:before="100" w:beforeAutospacing="1" w:after="100" w:afterAutospacing="1" w:line="240" w:lineRule="auto"/>
+        <w:rPr>
+          <w:rFonts w:ascii="Times New Roman" w:eastAsia="Times New Roman" w:hAnsi="Times New Roman" w:cs="Times New Roman"/>
+          <w:lang w:val="en-IN" w:eastAsia="en-IN"/>
+        </w:rPr>
+      </w:pPr>
+      <w:r>
+        <w:rPr>
+          <w:rFonts w:ascii="Times New Roman" w:eastAsia="Times New Roman" w:hAnsi="Times New Roman" w:cs="Times New Roman"/>
+          <w:lang w:val="en-IN" w:eastAsia="en-IN"/>
+        </w:rPr>
+        <w:t xml:space="preserve">Rajib Mall – Fundamentals of Software Engineering </w:t>
+      </w:r>
+    </w:p>
+    <w:p>
+      <w:pPr>
+        <w:numPr>
+          <w:ilvl w:val="0"/>
+          <w:numId w:val="45"/>
+        </w:numPr>
+        <w:spacing w:before="100" w:beforeAutospacing="1" w:after="100" w:afterAutospacing="1" w:line="240" w:lineRule="auto"/>
+        <w:rPr>
+          <w:rFonts w:ascii="Times New Roman" w:eastAsia="Times New Roman" w:hAnsi="Times New Roman" w:cs="Times New Roman"/>
+          <w:lang w:val="en-IN" w:eastAsia="en-IN"/>
+        </w:rPr>
+      </w:pPr>
+      <w:proofErr w:type="spellStart"/>
+      <w:r>
+        <w:rPr>
+          <w:rFonts w:ascii="Times New Roman" w:eastAsia="Times New Roman" w:hAnsi="Times New Roman" w:cs="Times New Roman"/>
+          <w:lang w:val="en-IN" w:eastAsia="en-IN"/>
+        </w:rPr>
+        <w:t>OpenWeatherMap</w:t>
+      </w:r>
+      <w:proofErr w:type="spellEnd"/>
+      <w:r>
+        <w:rPr>
+          <w:rFonts w:ascii="Times New Roman" w:eastAsia="Times New Roman" w:hAnsi="Times New Roman" w:cs="Times New Roman"/>
+          <w:lang w:val="en-IN" w:eastAsia="en-IN"/>
+        </w:rPr>
+        <w:t xml:space="preserve"> API </w:t>
+      </w:r>
+    </w:p>
+    <w:p>
+      <w:pPr>
+        <w:numPr>
+          <w:ilvl w:val="0"/>
+          <w:numId w:val="45"/>
+        </w:numPr>
+        <w:spacing w:before="100" w:beforeAutospacing="1" w:after="100" w:afterAutospacing="1" w:line="240" w:lineRule="auto"/>
+        <w:rPr>
+          <w:rFonts w:ascii="Times New Roman" w:eastAsia="Times New Roman" w:hAnsi="Times New Roman" w:cs="Times New Roman"/>
+          <w:lang w:val="en-IN" w:eastAsia="en-IN"/>
+        </w:rPr>
+      </w:pPr>
+      <w:proofErr w:type="spellStart"/>
+      <w:r>
+        <w:rPr>
+          <w:rFonts w:ascii="Times New Roman" w:eastAsia="Times New Roman" w:hAnsi="Times New Roman" w:cs="Times New Roman"/>
+          <w:lang w:val="en-IN" w:eastAsia="en-IN"/>
+        </w:rPr>
+        <w:t>Agmarknet</w:t>
+      </w:r>
+      <w:proofErr w:type="spellEnd"/>
+      <w:r>
+        <w:rPr>
+          <w:rFonts w:ascii="Times New Roman" w:eastAsia="Times New Roman" w:hAnsi="Times New Roman" w:cs="Times New Roman"/>
+          <w:lang w:val="en-IN" w:eastAsia="en-IN"/>
+        </w:rPr>
+        <w:t xml:space="preserve"> API </w:t>
+      </w:r>
+      <w:r>
+        <w:rPr>
+          <w:rFonts w:ascii="Times New Roman" w:eastAsia="Times New Roman" w:hAnsi="Times New Roman" w:cs="Times New Roman"/>
+          <w:lang w:val="en-IN" w:eastAsia="en-IN"/>
+        </w:rPr>
+        <w:t xml:space="preserve"> </w:t>
+      </w:r>
+    </w:p>
+    <w:p>
+      <w:pPr>
+        <w:numPr>
+          <w:ilvl w:val="0"/>
+          <w:numId w:val="45"/>
+        </w:numPr>
+        <w:spacing w:before="100" w:beforeAutospacing="1" w:after="100" w:afterAutospacing="1" w:line="240" w:lineRule="auto"/>
+        <w:rPr>
+          <w:rFonts w:ascii="Times New Roman" w:eastAsia="Times New Roman" w:hAnsi="Times New Roman" w:cs="Times New Roman"/>
+          <w:lang w:val="en-IN" w:eastAsia="en-IN"/>
+        </w:rPr>
+      </w:pPr>
+      <w:proofErr w:type="spellStart"/>
+      <w:r>
+        <w:rPr>
+          <w:rFonts w:ascii="Times New Roman" w:eastAsia="Times New Roman" w:hAnsi="Times New Roman" w:cs="Times New Roman"/>
+          <w:lang w:val="en-IN" w:eastAsia="en-IN"/>
+        </w:rPr>
+        <w:t>Supabase</w:t>
+      </w:r>
+      <w:proofErr w:type="spellEnd"/>
+      <w:r>
+        <w:rPr>
+          <w:rFonts w:ascii="Times New Roman" w:eastAsia="Times New Roman" w:hAnsi="Times New Roman" w:cs="Times New Roman"/>
+          <w:lang w:val="en-IN" w:eastAsia="en-IN"/>
+        </w:rPr>
+        <w:t xml:space="preserve"> Documentation </w:t>
+      </w:r>
+    </w:p>
+    <w:p>
+      <w:pPr>
+        <w:spacing w:before="100" w:beforeAutospacing="1" w:after="100" w:afterAutospacing="1" w:line="240" w:lineRule="auto"/>
+        <w:ind w:left="720"/>
+        <w:rPr>
+          <w:rFonts w:ascii="Times New Roman" w:eastAsia="Times New Roman" w:hAnsi="Times New Roman" w:cs="Times New Roman"/>
+          <w:lang w:val="en-IN" w:eastAsia="en-IN"/>
+        </w:rPr>
+      </w:pPr>
+    </w:p>
+    <w:p>
+      <w:pPr>
+        <w:spacing w:after="0" w:line="240" w:lineRule="auto"/>
+        <w:rPr>
+          <w:rFonts w:ascii="Times New Roman" w:eastAsia="Times New Roman" w:hAnsi="Times New Roman" w:cs="Times New Roman"/>
+          <w:lang w:val="en-IN" w:eastAsia="en-IN"/>
+        </w:rPr>
+      </w:pPr>
+    </w:p>
+    <w:p>
+      <w:pPr>
+        <w:spacing w:after="0" w:line="240" w:lineRule="auto"/>
+        <w:rPr>
+          <w:rFonts w:ascii="Times New Roman" w:eastAsia="Times New Roman" w:hAnsi="Times New Roman" w:cs="Times New Roman"/>
+          <w:lang w:val="en-IN" w:eastAsia="en-IN"/>
+        </w:rPr>
       </w:pPr>
     </w:p>
     <w:p>
@@ -884,11 +1491,7 @@
           <w:lang w:val="en-IN" w:eastAsia="en-IN"/>
         </w:rPr>
       </w:pPr>
-    </w:p>
-    <w:p>
-      <w:pPr>
-        <w:spacing w:before="100" w:beforeAutospacing="1" w:after="100" w:afterAutospacing="1" w:line="240" w:lineRule="auto"/>
-        <w:outlineLvl w:val="0"/>
+      <w:r>
         <w:rPr>
           <w:rFonts w:ascii="Times New Roman" w:eastAsia="Times New Roman" w:hAnsi="Times New Roman" w:cs="Times New Roman"/>
           <w:b/>
@@ -898,184 +1501,8 @@
           <w:szCs w:val="48"/>
           <w:lang w:val="en-IN" w:eastAsia="en-IN"/>
         </w:rPr>
-      </w:pPr>
-    </w:p>
-    <w:p>
-      <w:pPr>
-        <w:spacing w:before="100" w:beforeAutospacing="1" w:after="100" w:afterAutospacing="1" w:line="240" w:lineRule="auto"/>
-        <w:outlineLvl w:val="0"/>
-        <w:rPr>
-          <w:rFonts w:ascii="Times New Roman" w:eastAsia="Times New Roman" w:hAnsi="Times New Roman" w:cs="Times New Roman"/>
-          <w:b/>
-          <w:bCs/>
-          <w:kern w:val="36"/>
-          <w:sz w:val="48"/>
-          <w:szCs w:val="48"/>
-          <w:lang w:val="en-IN" w:eastAsia="en-IN"/>
-        </w:rPr>
-      </w:pPr>
-    </w:p>
-    <w:p>
-      <w:pPr>
-        <w:spacing w:before="100" w:beforeAutospacing="1" w:after="100" w:afterAutospacing="1" w:line="240" w:lineRule="auto"/>
-        <w:outlineLvl w:val="0"/>
-        <w:rPr>
-          <w:rFonts w:ascii="Times New Roman" w:eastAsia="Times New Roman" w:hAnsi="Times New Roman" w:cs="Times New Roman"/>
-          <w:b/>
-          <w:bCs/>
-          <w:kern w:val="36"/>
-          <w:sz w:val="48"/>
-          <w:szCs w:val="48"/>
-          <w:lang w:val="en-IN" w:eastAsia="en-IN"/>
-        </w:rPr>
-      </w:pPr>
-    </w:p>
-    <w:p>
-      <w:pPr>
-        <w:spacing w:before="100" w:beforeAutospacing="1" w:after="100" w:afterAutospacing="1" w:line="240" w:lineRule="auto"/>
-        <w:outlineLvl w:val="0"/>
-        <w:rPr>
-          <w:rFonts w:ascii="Times New Roman" w:eastAsia="Times New Roman" w:hAnsi="Times New Roman" w:cs="Times New Roman"/>
-          <w:b/>
-          <w:bCs/>
-          <w:kern w:val="36"/>
-          <w:sz w:val="48"/>
-          <w:szCs w:val="48"/>
-          <w:lang w:val="en-IN" w:eastAsia="en-IN"/>
-        </w:rPr>
-      </w:pPr>
-    </w:p>
-    <w:p>
-      <w:pPr>
-        <w:spacing w:before="100" w:beforeAutospacing="1" w:after="100" w:afterAutospacing="1" w:line="240" w:lineRule="auto"/>
-        <w:outlineLvl w:val="0"/>
-        <w:rPr>
-          <w:rFonts w:ascii="Times New Roman" w:eastAsia="Times New Roman" w:hAnsi="Times New Roman" w:cs="Times New Roman"/>
-          <w:b/>
-          <w:bCs/>
-          <w:kern w:val="36"/>
-          <w:sz w:val="48"/>
-          <w:szCs w:val="48"/>
-          <w:lang w:val="en-IN" w:eastAsia="en-IN"/>
-        </w:rPr>
-      </w:pPr>
-    </w:p>
-    <w:p>
-      <w:pPr>
-        <w:spacing w:before="100" w:beforeAutospacing="1" w:after="100" w:afterAutospacing="1" w:line="240" w:lineRule="auto"/>
-        <w:outlineLvl w:val="0"/>
-        <w:rPr>
-          <w:rFonts w:ascii="Times New Roman" w:eastAsia="Times New Roman" w:hAnsi="Times New Roman" w:cs="Times New Roman"/>
-          <w:b/>
-          <w:bCs/>
-          <w:kern w:val="36"/>
-          <w:sz w:val="48"/>
-          <w:szCs w:val="48"/>
-          <w:lang w:val="en-IN" w:eastAsia="en-IN"/>
-        </w:rPr>
-      </w:pPr>
-    </w:p>
-    <w:p>
-      <w:pPr>
-        <w:spacing w:before="100" w:beforeAutospacing="1" w:after="100" w:afterAutospacing="1" w:line="240" w:lineRule="auto"/>
-        <w:outlineLvl w:val="0"/>
-        <w:rPr>
-          <w:rFonts w:ascii="Times New Roman" w:eastAsia="Times New Roman" w:hAnsi="Times New Roman" w:cs="Times New Roman"/>
-          <w:b/>
-          <w:bCs/>
-          <w:kern w:val="36"/>
-          <w:sz w:val="48"/>
-          <w:szCs w:val="48"/>
-          <w:lang w:val="en-IN" w:eastAsia="en-IN"/>
-        </w:rPr>
-      </w:pPr>
-    </w:p>
-    <w:p>
-      <w:pPr>
-        <w:spacing w:before="100" w:beforeAutospacing="1" w:after="100" w:afterAutospacing="1" w:line="240" w:lineRule="auto"/>
-        <w:outlineLvl w:val="0"/>
-        <w:rPr>
-          <w:rFonts w:ascii="Times New Roman" w:eastAsia="Times New Roman" w:hAnsi="Times New Roman" w:cs="Times New Roman"/>
-          <w:b/>
-          <w:bCs/>
-          <w:kern w:val="36"/>
-          <w:sz w:val="48"/>
-          <w:szCs w:val="48"/>
-          <w:lang w:val="en-IN" w:eastAsia="en-IN"/>
-        </w:rPr>
-      </w:pPr>
-    </w:p>
-    <w:p>
-      <w:pPr>
-        <w:spacing w:before="100" w:beforeAutospacing="1" w:after="100" w:afterAutospacing="1" w:line="240" w:lineRule="auto"/>
-        <w:outlineLvl w:val="0"/>
-        <w:rPr>
-          <w:rFonts w:ascii="Times New Roman" w:eastAsia="Times New Roman" w:hAnsi="Times New Roman" w:cs="Times New Roman"/>
-          <w:b/>
-          <w:bCs/>
-          <w:kern w:val="36"/>
-          <w:sz w:val="48"/>
-          <w:szCs w:val="48"/>
-          <w:lang w:val="en-IN" w:eastAsia="en-IN"/>
-        </w:rPr>
-      </w:pPr>
-    </w:p>
-    <w:p>
-      <w:pPr>
-        <w:spacing w:before="100" w:beforeAutospacing="1" w:after="100" w:afterAutospacing="1" w:line="240" w:lineRule="auto"/>
-        <w:outlineLvl w:val="0"/>
-        <w:rPr>
-          <w:rFonts w:ascii="Times New Roman" w:eastAsia="Times New Roman" w:hAnsi="Times New Roman" w:cs="Times New Roman"/>
-          <w:b/>
-          <w:bCs/>
-          <w:kern w:val="36"/>
-          <w:sz w:val="48"/>
-          <w:szCs w:val="48"/>
-          <w:lang w:val="en-IN" w:eastAsia="en-IN"/>
-        </w:rPr>
-      </w:pPr>
-    </w:p>
-    <w:p>
-      <w:pPr>
-        <w:spacing w:before="100" w:beforeAutospacing="1" w:after="100" w:afterAutospacing="1" w:line="240" w:lineRule="auto"/>
-        <w:outlineLvl w:val="0"/>
-        <w:rPr>
-          <w:rFonts w:ascii="Times New Roman" w:eastAsia="Times New Roman" w:hAnsi="Times New Roman" w:cs="Times New Roman"/>
-          <w:b/>
-          <w:bCs/>
-          <w:kern w:val="36"/>
-          <w:sz w:val="48"/>
-          <w:szCs w:val="48"/>
-          <w:lang w:val="en-IN" w:eastAsia="en-IN"/>
-        </w:rPr>
-      </w:pPr>
-    </w:p>
-    <w:p>
-      <w:pPr>
-        <w:spacing w:before="100" w:beforeAutospacing="1" w:after="100" w:afterAutospacing="1" w:line="240" w:lineRule="auto"/>
-        <w:outlineLvl w:val="0"/>
-        <w:rPr>
-          <w:rFonts w:ascii="Times New Roman" w:eastAsia="Times New Roman" w:hAnsi="Times New Roman" w:cs="Times New Roman"/>
-          <w:b/>
-          <w:bCs/>
-          <w:kern w:val="36"/>
-          <w:sz w:val="48"/>
-          <w:szCs w:val="48"/>
-          <w:lang w:val="en-IN" w:eastAsia="en-IN"/>
-        </w:rPr>
-      </w:pPr>
-      <w:r>
-        <w:rPr>
-          <w:rFonts w:ascii="Times New Roman" w:eastAsia="Times New Roman" w:hAnsi="Times New Roman" w:cs="Times New Roman"/>
-          <w:b/>
-          <w:bCs/>
-          <w:kern w:val="36"/>
-          <w:sz w:val="48"/>
-          <w:szCs w:val="48"/>
-          <w:lang w:val="en-IN" w:eastAsia="en-IN"/>
-        </w:rPr>
         <w:lastRenderedPageBreak/>
-        <w:t>1. Introduction</w:t>
+        <w:t>2. Overall Description</w:t>
       </w:r>
     </w:p>
     <w:p>
@@ -1100,7 +1527,7 @@
           <w:szCs w:val="36"/>
           <w:lang w:val="en-IN" w:eastAsia="en-IN"/>
         </w:rPr>
-        <w:t>1.1 Purpose</w:t>
+        <w:t>2.1 Product Perspective</w:t>
       </w:r>
     </w:p>
     <w:p>
@@ -1125,7 +1552,87 @@
           <w:rFonts w:ascii="Times New Roman" w:eastAsia="Times New Roman" w:hAnsi="Times New Roman" w:cs="Times New Roman"/>
           <w:lang w:val="en-IN" w:eastAsia="en-IN"/>
         </w:rPr>
-        <w:t xml:space="preserve"> is a web-based agriculture management system designed to empower farmers using modern technologies such as Artificial Intelligence, real-time market data, and government resources to improve decision-making and productivity.</w:t>
+        <w:t xml:space="preserve"> is a standalone web application that integrates:</w:t>
+      </w:r>
+    </w:p>
+    <w:p>
+      <w:pPr>
+        <w:numPr>
+          <w:ilvl w:val="0"/>
+          <w:numId w:val="46"/>
+        </w:numPr>
+        <w:spacing w:before="100" w:beforeAutospacing="1" w:after="100" w:afterAutospacing="1" w:line="240" w:lineRule="auto"/>
+        <w:rPr>
+          <w:rFonts w:ascii="Times New Roman" w:eastAsia="Times New Roman" w:hAnsi="Times New Roman" w:cs="Times New Roman"/>
+          <w:lang w:val="en-IN" w:eastAsia="en-IN"/>
+        </w:rPr>
+      </w:pPr>
+      <w:r>
+        <w:rPr>
+          <w:rFonts w:ascii="Times New Roman" w:eastAsia="Times New Roman" w:hAnsi="Times New Roman" w:cs="Times New Roman"/>
+          <w:lang w:val="en-IN" w:eastAsia="en-IN"/>
+        </w:rPr>
+        <w:t xml:space="preserve">AI-based disease detection </w:t>
+      </w:r>
+    </w:p>
+    <w:p>
+      <w:pPr>
+        <w:numPr>
+          <w:ilvl w:val="0"/>
+          <w:numId w:val="46"/>
+        </w:numPr>
+        <w:spacing w:before="100" w:beforeAutospacing="1" w:after="100" w:afterAutospacing="1" w:line="240" w:lineRule="auto"/>
+        <w:rPr>
+          <w:rFonts w:ascii="Times New Roman" w:eastAsia="Times New Roman" w:hAnsi="Times New Roman" w:cs="Times New Roman"/>
+          <w:lang w:val="en-IN" w:eastAsia="en-IN"/>
+        </w:rPr>
+      </w:pPr>
+      <w:r>
+        <w:rPr>
+          <w:rFonts w:ascii="Times New Roman" w:eastAsia="Times New Roman" w:hAnsi="Times New Roman" w:cs="Times New Roman"/>
+          <w:lang w:val="en-IN" w:eastAsia="en-IN"/>
+        </w:rPr>
+        <w:t xml:space="preserve">Real-time market price APIs </w:t>
+      </w:r>
+    </w:p>
+    <w:p>
+      <w:pPr>
+        <w:numPr>
+          <w:ilvl w:val="0"/>
+          <w:numId w:val="46"/>
+        </w:numPr>
+        <w:spacing w:before="100" w:beforeAutospacing="1" w:after="100" w:afterAutospacing="1" w:line="240" w:lineRule="auto"/>
+        <w:rPr>
+          <w:rFonts w:ascii="Times New Roman" w:eastAsia="Times New Roman" w:hAnsi="Times New Roman" w:cs="Times New Roman"/>
+          <w:lang w:val="en-IN" w:eastAsia="en-IN"/>
+        </w:rPr>
+      </w:pPr>
+      <w:r>
+        <w:rPr>
+          <w:rFonts w:ascii="Times New Roman" w:eastAsia="Times New Roman" w:hAnsi="Times New Roman" w:cs="Times New Roman"/>
+          <w:lang w:val="en-IN" w:eastAsia="en-IN"/>
+        </w:rPr>
+        <w:t xml:space="preserve">Government scheme data </w:t>
+      </w:r>
+    </w:p>
+    <w:p>
+      <w:pPr>
+        <w:numPr>
+          <w:ilvl w:val="0"/>
+          <w:numId w:val="46"/>
+        </w:numPr>
+        <w:spacing w:before="100" w:beforeAutospacing="1" w:after="100" w:afterAutospacing="1" w:line="240" w:lineRule="auto"/>
+        <w:rPr>
+          <w:rFonts w:ascii="Times New Roman" w:eastAsia="Times New Roman" w:hAnsi="Times New Roman" w:cs="Times New Roman"/>
+          <w:lang w:val="en-IN" w:eastAsia="en-IN"/>
+        </w:rPr>
+      </w:pPr>
+      <w:r>
+        <w:rPr>
+          <w:rFonts w:ascii="Times New Roman" w:eastAsia="Times New Roman" w:hAnsi="Times New Roman" w:cs="Times New Roman"/>
+          <w:lang w:val="en-IN" w:eastAsia="en-IN"/>
+        </w:rPr>
+        <w:t xml:space="preserve">Location-based services </w:t>
       </w:r>
     </w:p>
     <w:p>
@@ -1150,23 +1657,167 @@
           <w:szCs w:val="36"/>
           <w:lang w:val="en-IN" w:eastAsia="en-IN"/>
         </w:rPr>
-        <w:t>1.2 Document Conventions</w:t>
-      </w:r>
-    </w:p>
-    <w:p>
-      <w:pPr>
-        <w:spacing w:before="100" w:beforeAutospacing="1" w:after="100" w:afterAutospacing="1" w:line="240" w:lineRule="auto"/>
-        <w:rPr>
-          <w:rFonts w:ascii="Times New Roman" w:eastAsia="Times New Roman" w:hAnsi="Times New Roman" w:cs="Times New Roman"/>
-          <w:lang w:val="en-IN" w:eastAsia="en-IN"/>
-        </w:rPr>
-      </w:pPr>
-      <w:r>
-        <w:rPr>
-          <w:rFonts w:ascii="Times New Roman" w:eastAsia="Times New Roman" w:hAnsi="Times New Roman" w:cs="Times New Roman"/>
-          <w:lang w:val="en-IN" w:eastAsia="en-IN"/>
-        </w:rPr>
-        <w:t>This document is structured using numbered sections and clear headings. Technical terms are defined in the glossary.</w:t>
+        <w:t>2.2 Product Features</w:t>
+      </w:r>
+    </w:p>
+    <w:p>
+      <w:pPr>
+        <w:numPr>
+          <w:ilvl w:val="0"/>
+          <w:numId w:val="47"/>
+        </w:numPr>
+        <w:spacing w:before="100" w:beforeAutospacing="1" w:after="100" w:afterAutospacing="1" w:line="240" w:lineRule="auto"/>
+        <w:rPr>
+          <w:rFonts w:ascii="Times New Roman" w:eastAsia="Times New Roman" w:hAnsi="Times New Roman" w:cs="Times New Roman"/>
+          <w:lang w:val="en-IN" w:eastAsia="en-IN"/>
+        </w:rPr>
+      </w:pPr>
+      <w:r>
+        <w:rPr>
+          <w:rFonts w:ascii="Times New Roman" w:eastAsia="Times New Roman" w:hAnsi="Times New Roman" w:cs="Times New Roman"/>
+          <w:lang w:val="en-IN" w:eastAsia="en-IN"/>
+        </w:rPr>
+        <w:t xml:space="preserve">User Registration and Login </w:t>
+      </w:r>
+    </w:p>
+    <w:p>
+      <w:pPr>
+        <w:numPr>
+          <w:ilvl w:val="0"/>
+          <w:numId w:val="47"/>
+        </w:numPr>
+        <w:spacing w:before="100" w:beforeAutospacing="1" w:after="100" w:afterAutospacing="1" w:line="240" w:lineRule="auto"/>
+        <w:rPr>
+          <w:rFonts w:ascii="Times New Roman" w:eastAsia="Times New Roman" w:hAnsi="Times New Roman" w:cs="Times New Roman"/>
+          <w:lang w:val="en-IN" w:eastAsia="en-IN"/>
+        </w:rPr>
+      </w:pPr>
+      <w:r>
+        <w:rPr>
+          <w:rFonts w:ascii="Times New Roman" w:eastAsia="Times New Roman" w:hAnsi="Times New Roman" w:cs="Times New Roman"/>
+          <w:lang w:val="en-IN" w:eastAsia="en-IN"/>
+        </w:rPr>
+        <w:t xml:space="preserve">Farmer Dashboard </w:t>
+      </w:r>
+    </w:p>
+    <w:p>
+      <w:pPr>
+        <w:numPr>
+          <w:ilvl w:val="0"/>
+          <w:numId w:val="47"/>
+        </w:numPr>
+        <w:spacing w:before="100" w:beforeAutospacing="1" w:after="100" w:afterAutospacing="1" w:line="240" w:lineRule="auto"/>
+        <w:rPr>
+          <w:rFonts w:ascii="Times New Roman" w:eastAsia="Times New Roman" w:hAnsi="Times New Roman" w:cs="Times New Roman"/>
+          <w:lang w:val="en-IN" w:eastAsia="en-IN"/>
+        </w:rPr>
+      </w:pPr>
+      <w:r>
+        <w:rPr>
+          <w:rFonts w:ascii="Times New Roman" w:eastAsia="Times New Roman" w:hAnsi="Times New Roman" w:cs="Times New Roman"/>
+          <w:lang w:val="en-IN" w:eastAsia="en-IN"/>
+        </w:rPr>
+        <w:t xml:space="preserve">Admin Panel </w:t>
+      </w:r>
+    </w:p>
+    <w:p>
+      <w:pPr>
+        <w:numPr>
+          <w:ilvl w:val="0"/>
+          <w:numId w:val="47"/>
+        </w:numPr>
+        <w:spacing w:before="100" w:beforeAutospacing="1" w:after="100" w:afterAutospacing="1" w:line="240" w:lineRule="auto"/>
+        <w:rPr>
+          <w:rFonts w:ascii="Times New Roman" w:eastAsia="Times New Roman" w:hAnsi="Times New Roman" w:cs="Times New Roman"/>
+          <w:lang w:val="en-IN" w:eastAsia="en-IN"/>
+        </w:rPr>
+      </w:pPr>
+      <w:r>
+        <w:rPr>
+          <w:rFonts w:ascii="Times New Roman" w:eastAsia="Times New Roman" w:hAnsi="Times New Roman" w:cs="Times New Roman"/>
+          <w:lang w:val="en-IN" w:eastAsia="en-IN"/>
+        </w:rPr>
+        <w:t xml:space="preserve">AI Crop Disease Detection </w:t>
+      </w:r>
+    </w:p>
+    <w:p>
+      <w:pPr>
+        <w:numPr>
+          <w:ilvl w:val="0"/>
+          <w:numId w:val="47"/>
+        </w:numPr>
+        <w:spacing w:before="100" w:beforeAutospacing="1" w:after="100" w:afterAutospacing="1" w:line="240" w:lineRule="auto"/>
+        <w:rPr>
+          <w:rFonts w:ascii="Times New Roman" w:eastAsia="Times New Roman" w:hAnsi="Times New Roman" w:cs="Times New Roman"/>
+          <w:lang w:val="en-IN" w:eastAsia="en-IN"/>
+        </w:rPr>
+      </w:pPr>
+      <w:r>
+        <w:rPr>
+          <w:rFonts w:ascii="Times New Roman" w:eastAsia="Times New Roman" w:hAnsi="Times New Roman" w:cs="Times New Roman"/>
+          <w:lang w:val="en-IN" w:eastAsia="en-IN"/>
+        </w:rPr>
+        <w:t xml:space="preserve">Live Market Prices </w:t>
+      </w:r>
+    </w:p>
+    <w:p>
+      <w:pPr>
+        <w:numPr>
+          <w:ilvl w:val="0"/>
+          <w:numId w:val="47"/>
+        </w:numPr>
+        <w:spacing w:before="100" w:beforeAutospacing="1" w:after="100" w:afterAutospacing="1" w:line="240" w:lineRule="auto"/>
+        <w:rPr>
+          <w:rFonts w:ascii="Times New Roman" w:eastAsia="Times New Roman" w:hAnsi="Times New Roman" w:cs="Times New Roman"/>
+          <w:lang w:val="en-IN" w:eastAsia="en-IN"/>
+        </w:rPr>
+      </w:pPr>
+      <w:r>
+        <w:rPr>
+          <w:rFonts w:ascii="Times New Roman" w:eastAsia="Times New Roman" w:hAnsi="Times New Roman" w:cs="Times New Roman"/>
+          <w:lang w:val="en-IN" w:eastAsia="en-IN"/>
+        </w:rPr>
+        <w:t xml:space="preserve">Crop Calendar </w:t>
+      </w:r>
+    </w:p>
+    <w:p>
+      <w:pPr>
+        <w:numPr>
+          <w:ilvl w:val="0"/>
+          <w:numId w:val="47"/>
+        </w:numPr>
+        <w:spacing w:before="100" w:beforeAutospacing="1" w:after="100" w:afterAutospacing="1" w:line="240" w:lineRule="auto"/>
+        <w:rPr>
+          <w:rFonts w:ascii="Times New Roman" w:eastAsia="Times New Roman" w:hAnsi="Times New Roman" w:cs="Times New Roman"/>
+          <w:lang w:val="en-IN" w:eastAsia="en-IN"/>
+        </w:rPr>
+      </w:pPr>
+      <w:r>
+        <w:rPr>
+          <w:rFonts w:ascii="Times New Roman" w:eastAsia="Times New Roman" w:hAnsi="Times New Roman" w:cs="Times New Roman"/>
+          <w:lang w:val="en-IN" w:eastAsia="en-IN"/>
+        </w:rPr>
+        <w:t xml:space="preserve">Government Subsidy Information </w:t>
+      </w:r>
+    </w:p>
+    <w:p>
+      <w:pPr>
+        <w:numPr>
+          <w:ilvl w:val="0"/>
+          <w:numId w:val="47"/>
+        </w:numPr>
+        <w:spacing w:before="100" w:beforeAutospacing="1" w:after="100" w:afterAutospacing="1" w:line="240" w:lineRule="auto"/>
+        <w:rPr>
+          <w:rFonts w:ascii="Times New Roman" w:eastAsia="Times New Roman" w:hAnsi="Times New Roman" w:cs="Times New Roman"/>
+          <w:lang w:val="en-IN" w:eastAsia="en-IN"/>
+        </w:rPr>
+      </w:pPr>
+      <w:r>
+        <w:rPr>
+          <w:rFonts w:ascii="Times New Roman" w:eastAsia="Times New Roman" w:hAnsi="Times New Roman" w:cs="Times New Roman"/>
+          <w:lang w:val="en-IN" w:eastAsia="en-IN"/>
+        </w:rPr>
+        <w:t xml:space="preserve">Language Translation </w:t>
       </w:r>
     </w:p>
     <w:p>
@@ -1191,9 +1842,203 @@
           <w:szCs w:val="36"/>
           <w:lang w:val="en-IN" w:eastAsia="en-IN"/>
         </w:rPr>
-        <w:t>1.3 Intended Audience</w:t>
-      </w:r>
-      <w:r>
+        <w:t>2.3 User Classes and Characteristics</w:t>
+      </w:r>
+    </w:p>
+    <w:p>
+      <w:pPr>
+        <w:spacing w:before="100" w:beforeAutospacing="1" w:after="100" w:afterAutospacing="1" w:line="240" w:lineRule="auto"/>
+        <w:outlineLvl w:val="2"/>
+        <w:rPr>
+          <w:rFonts w:ascii="Times New Roman" w:eastAsia="Times New Roman" w:hAnsi="Times New Roman" w:cs="Times New Roman"/>
+          <w:b/>
+          <w:bCs/>
+          <w:sz w:val="27"/>
+          <w:szCs w:val="27"/>
+          <w:lang w:val="en-IN" w:eastAsia="en-IN"/>
+        </w:rPr>
+      </w:pPr>
+      <w:r>
+        <w:rPr>
+          <w:rFonts w:ascii="Times New Roman" w:eastAsia="Times New Roman" w:hAnsi="Times New Roman" w:cs="Times New Roman"/>
+          <w:b/>
+          <w:bCs/>
+          <w:sz w:val="27"/>
+          <w:szCs w:val="27"/>
+          <w:lang w:val="en-IN" w:eastAsia="en-IN"/>
+        </w:rPr>
+        <w:t>Farmer</w:t>
+      </w:r>
+    </w:p>
+    <w:p>
+      <w:pPr>
+        <w:numPr>
+          <w:ilvl w:val="0"/>
+          <w:numId w:val="48"/>
+        </w:numPr>
+        <w:spacing w:before="100" w:beforeAutospacing="1" w:after="100" w:afterAutospacing="1" w:line="240" w:lineRule="auto"/>
+        <w:rPr>
+          <w:rFonts w:ascii="Times New Roman" w:eastAsia="Times New Roman" w:hAnsi="Times New Roman" w:cs="Times New Roman"/>
+          <w:lang w:val="en-IN" w:eastAsia="en-IN"/>
+        </w:rPr>
+      </w:pPr>
+      <w:r>
+        <w:rPr>
+          <w:rFonts w:ascii="Times New Roman" w:eastAsia="Times New Roman" w:hAnsi="Times New Roman" w:cs="Times New Roman"/>
+          <w:lang w:val="en-IN" w:eastAsia="en-IN"/>
+        </w:rPr>
+        <w:t xml:space="preserve">Upload crop images </w:t>
+      </w:r>
+    </w:p>
+    <w:p>
+      <w:pPr>
+        <w:numPr>
+          <w:ilvl w:val="0"/>
+          <w:numId w:val="48"/>
+        </w:numPr>
+        <w:spacing w:before="100" w:beforeAutospacing="1" w:after="100" w:afterAutospacing="1" w:line="240" w:lineRule="auto"/>
+        <w:rPr>
+          <w:rFonts w:ascii="Times New Roman" w:eastAsia="Times New Roman" w:hAnsi="Times New Roman" w:cs="Times New Roman"/>
+          <w:lang w:val="en-IN" w:eastAsia="en-IN"/>
+        </w:rPr>
+      </w:pPr>
+      <w:r>
+        <w:rPr>
+          <w:rFonts w:ascii="Times New Roman" w:eastAsia="Times New Roman" w:hAnsi="Times New Roman" w:cs="Times New Roman"/>
+          <w:lang w:val="en-IN" w:eastAsia="en-IN"/>
+        </w:rPr>
+        <w:t xml:space="preserve">View disease results and suggestions </w:t>
+      </w:r>
+    </w:p>
+    <w:p>
+      <w:pPr>
+        <w:numPr>
+          <w:ilvl w:val="0"/>
+          <w:numId w:val="48"/>
+        </w:numPr>
+        <w:spacing w:before="100" w:beforeAutospacing="1" w:after="100" w:afterAutospacing="1" w:line="240" w:lineRule="auto"/>
+        <w:rPr>
+          <w:rFonts w:ascii="Times New Roman" w:eastAsia="Times New Roman" w:hAnsi="Times New Roman" w:cs="Times New Roman"/>
+          <w:lang w:val="en-IN" w:eastAsia="en-IN"/>
+        </w:rPr>
+      </w:pPr>
+      <w:r>
+        <w:rPr>
+          <w:rFonts w:ascii="Times New Roman" w:eastAsia="Times New Roman" w:hAnsi="Times New Roman" w:cs="Times New Roman"/>
+          <w:lang w:val="en-IN" w:eastAsia="en-IN"/>
+        </w:rPr>
+        <w:t xml:space="preserve">Access crop calendar and subsidies </w:t>
+      </w:r>
+    </w:p>
+    <w:p>
+      <w:pPr>
+        <w:numPr>
+          <w:ilvl w:val="0"/>
+          <w:numId w:val="48"/>
+        </w:numPr>
+        <w:spacing w:before="100" w:beforeAutospacing="1" w:after="100" w:afterAutospacing="1" w:line="240" w:lineRule="auto"/>
+        <w:rPr>
+          <w:rFonts w:ascii="Times New Roman" w:eastAsia="Times New Roman" w:hAnsi="Times New Roman" w:cs="Times New Roman"/>
+          <w:lang w:val="en-IN" w:eastAsia="en-IN"/>
+        </w:rPr>
+      </w:pPr>
+      <w:r>
+        <w:rPr>
+          <w:rFonts w:ascii="Times New Roman" w:eastAsia="Times New Roman" w:hAnsi="Times New Roman" w:cs="Times New Roman"/>
+          <w:lang w:val="en-IN" w:eastAsia="en-IN"/>
+        </w:rPr>
+        <w:t xml:space="preserve">Find nearby shops </w:t>
+      </w:r>
+    </w:p>
+    <w:p>
+      <w:pPr>
+        <w:spacing w:before="100" w:beforeAutospacing="1" w:after="100" w:afterAutospacing="1" w:line="240" w:lineRule="auto"/>
+        <w:outlineLvl w:val="2"/>
+        <w:rPr>
+          <w:rFonts w:ascii="Times New Roman" w:eastAsia="Times New Roman" w:hAnsi="Times New Roman" w:cs="Times New Roman"/>
+          <w:b/>
+          <w:bCs/>
+          <w:sz w:val="27"/>
+          <w:szCs w:val="27"/>
+          <w:lang w:val="en-IN" w:eastAsia="en-IN"/>
+        </w:rPr>
+      </w:pPr>
+      <w:r>
+        <w:rPr>
+          <w:rFonts w:ascii="Times New Roman" w:eastAsia="Times New Roman" w:hAnsi="Times New Roman" w:cs="Times New Roman"/>
+          <w:b/>
+          <w:bCs/>
+          <w:sz w:val="27"/>
+          <w:szCs w:val="27"/>
+          <w:lang w:val="en-IN" w:eastAsia="en-IN"/>
+        </w:rPr>
+        <w:t>Admin</w:t>
+      </w:r>
+    </w:p>
+    <w:p>
+      <w:pPr>
+        <w:numPr>
+          <w:ilvl w:val="0"/>
+          <w:numId w:val="49"/>
+        </w:numPr>
+        <w:spacing w:before="100" w:beforeAutospacing="1" w:after="100" w:afterAutospacing="1" w:line="240" w:lineRule="auto"/>
+        <w:rPr>
+          <w:rFonts w:ascii="Times New Roman" w:eastAsia="Times New Roman" w:hAnsi="Times New Roman" w:cs="Times New Roman"/>
+          <w:lang w:val="en-IN" w:eastAsia="en-IN"/>
+        </w:rPr>
+      </w:pPr>
+      <w:r>
+        <w:rPr>
+          <w:rFonts w:ascii="Times New Roman" w:eastAsia="Times New Roman" w:hAnsi="Times New Roman" w:cs="Times New Roman"/>
+          <w:lang w:val="en-IN" w:eastAsia="en-IN"/>
+        </w:rPr>
+        <w:t xml:space="preserve">Manage users </w:t>
+      </w:r>
+    </w:p>
+    <w:p>
+      <w:pPr>
+        <w:numPr>
+          <w:ilvl w:val="0"/>
+          <w:numId w:val="49"/>
+        </w:numPr>
+        <w:spacing w:before="100" w:beforeAutospacing="1" w:after="100" w:afterAutospacing="1" w:line="240" w:lineRule="auto"/>
+        <w:rPr>
+          <w:rFonts w:ascii="Times New Roman" w:eastAsia="Times New Roman" w:hAnsi="Times New Roman" w:cs="Times New Roman"/>
+          <w:lang w:val="en-IN" w:eastAsia="en-IN"/>
+        </w:rPr>
+      </w:pPr>
+      <w:r>
+        <w:rPr>
+          <w:rFonts w:ascii="Times New Roman" w:eastAsia="Times New Roman" w:hAnsi="Times New Roman" w:cs="Times New Roman"/>
+          <w:lang w:val="en-IN" w:eastAsia="en-IN"/>
+        </w:rPr>
+        <w:t xml:space="preserve">Update subsidy and pesticide data </w:t>
+      </w:r>
+    </w:p>
+    <w:p>
+      <w:pPr>
+        <w:numPr>
+          <w:ilvl w:val="0"/>
+          <w:numId w:val="49"/>
+        </w:numPr>
+        <w:spacing w:before="100" w:beforeAutospacing="1" w:after="100" w:afterAutospacing="1" w:line="240" w:lineRule="auto"/>
+        <w:rPr>
+          <w:rFonts w:ascii="Times New Roman" w:eastAsia="Times New Roman" w:hAnsi="Times New Roman" w:cs="Times New Roman"/>
+          <w:lang w:val="en-IN" w:eastAsia="en-IN"/>
+        </w:rPr>
+      </w:pPr>
+      <w:r>
+        <w:rPr>
+          <w:rFonts w:ascii="Times New Roman" w:eastAsia="Times New Roman" w:hAnsi="Times New Roman" w:cs="Times New Roman"/>
+          <w:lang w:val="en-IN" w:eastAsia="en-IN"/>
+        </w:rPr>
+        <w:t xml:space="preserve">Monitor system data </w:t>
+      </w:r>
+    </w:p>
+    <w:p>
+      <w:pPr>
+        <w:spacing w:before="100" w:beforeAutospacing="1" w:after="100" w:afterAutospacing="1" w:line="240" w:lineRule="auto"/>
+        <w:outlineLvl w:val="1"/>
         <w:rPr>
           <w:rFonts w:ascii="Times New Roman" w:eastAsia="Times New Roman" w:hAnsi="Times New Roman" w:cs="Times New Roman"/>
           <w:b/>
@@ -1202,8 +2047,7 @@
           <w:szCs w:val="36"/>
           <w:lang w:val="en-IN" w:eastAsia="en-IN"/>
         </w:rPr>
-        <w:t xml:space="preserve"> </w:t>
-      </w:r>
+      </w:pPr>
       <w:r>
         <w:rPr>
           <w:rFonts w:ascii="Times New Roman" w:eastAsia="Times New Roman" w:hAnsi="Times New Roman" w:cs="Times New Roman"/>
@@ -1213,14 +2057,14 @@
           <w:szCs w:val="36"/>
           <w:lang w:val="en-IN" w:eastAsia="en-IN"/>
         </w:rPr>
-        <w:t>and Reading Suggestions</w:t>
+        <w:t>2.4 Operating Environment</w:t>
       </w:r>
     </w:p>
     <w:p>
       <w:pPr>
         <w:numPr>
           <w:ilvl w:val="0"/>
-          <w:numId w:val="43"/>
+          <w:numId w:val="50"/>
         </w:numPr>
         <w:spacing w:before="100" w:beforeAutospacing="1" w:after="100" w:afterAutospacing="1" w:line="240" w:lineRule="auto"/>
         <w:rPr>
@@ -1233,14 +2077,14 @@
           <w:rFonts w:ascii="Times New Roman" w:eastAsia="Times New Roman" w:hAnsi="Times New Roman" w:cs="Times New Roman"/>
           <w:lang w:val="en-IN" w:eastAsia="en-IN"/>
         </w:rPr>
-        <w:t xml:space="preserve">Project Developers &amp; Maintainers </w:t>
+        <w:t xml:space="preserve">Client: Web browser (Chrome, Edge, Firefox) </w:t>
       </w:r>
     </w:p>
     <w:p>
       <w:pPr>
         <w:numPr>
           <w:ilvl w:val="0"/>
-          <w:numId w:val="43"/>
+          <w:numId w:val="50"/>
         </w:numPr>
         <w:spacing w:before="100" w:beforeAutospacing="1" w:after="100" w:afterAutospacing="1" w:line="240" w:lineRule="auto"/>
         <w:rPr>
@@ -1253,14 +2097,14 @@
           <w:rFonts w:ascii="Times New Roman" w:eastAsia="Times New Roman" w:hAnsi="Times New Roman" w:cs="Times New Roman"/>
           <w:lang w:val="en-IN" w:eastAsia="en-IN"/>
         </w:rPr>
-        <w:t xml:space="preserve">Faculty Evaluators </w:t>
+        <w:t xml:space="preserve">Server: PHP 8.x environment </w:t>
       </w:r>
     </w:p>
     <w:p>
       <w:pPr>
         <w:numPr>
           <w:ilvl w:val="0"/>
-          <w:numId w:val="43"/>
+          <w:numId w:val="50"/>
         </w:numPr>
         <w:spacing w:before="100" w:beforeAutospacing="1" w:after="100" w:afterAutospacing="1" w:line="240" w:lineRule="auto"/>
         <w:rPr>
@@ -1273,14 +2117,14 @@
           <w:rFonts w:ascii="Times New Roman" w:eastAsia="Times New Roman" w:hAnsi="Times New Roman" w:cs="Times New Roman"/>
           <w:lang w:val="en-IN" w:eastAsia="en-IN"/>
         </w:rPr>
-        <w:t xml:space="preserve">Farmers (End Users) </w:t>
+        <w:t xml:space="preserve">Platform: Windows/Linux </w:t>
       </w:r>
     </w:p>
     <w:p>
       <w:pPr>
         <w:numPr>
           <w:ilvl w:val="0"/>
-          <w:numId w:val="43"/>
+          <w:numId w:val="50"/>
         </w:numPr>
         <w:spacing w:before="100" w:beforeAutospacing="1" w:after="100" w:afterAutospacing="1" w:line="240" w:lineRule="auto"/>
         <w:rPr>
@@ -1293,7 +2137,23 @@
           <w:rFonts w:ascii="Times New Roman" w:eastAsia="Times New Roman" w:hAnsi="Times New Roman" w:cs="Times New Roman"/>
           <w:lang w:val="en-IN" w:eastAsia="en-IN"/>
         </w:rPr>
-        <w:t xml:space="preserve">System Administrators </w:t>
+        <w:t xml:space="preserve">Cloud Database: </w:t>
+      </w:r>
+      <w:proofErr w:type="spellStart"/>
+      <w:r>
+        <w:rPr>
+          <w:rFonts w:ascii="Times New Roman" w:eastAsia="Times New Roman" w:hAnsi="Times New Roman" w:cs="Times New Roman"/>
+          <w:lang w:val="en-IN" w:eastAsia="en-IN"/>
+        </w:rPr>
+        <w:t>Supabase</w:t>
+      </w:r>
+      <w:proofErr w:type="spellEnd"/>
+      <w:r>
+        <w:rPr>
+          <w:rFonts w:ascii="Times New Roman" w:eastAsia="Times New Roman" w:hAnsi="Times New Roman" w:cs="Times New Roman"/>
+          <w:lang w:val="en-IN" w:eastAsia="en-IN"/>
+        </w:rPr>
+        <w:t xml:space="preserve"> </w:t>
       </w:r>
     </w:p>
     <w:p>
@@ -1318,46 +2178,15 @@
           <w:szCs w:val="36"/>
           <w:lang w:val="en-IN" w:eastAsia="en-IN"/>
         </w:rPr>
-        <w:t>1.4 Project Scope</w:t>
-      </w:r>
-    </w:p>
-    <w:p>
-      <w:pPr>
-        <w:spacing w:before="100" w:beforeAutospacing="1" w:after="100" w:afterAutospacing="1" w:line="240" w:lineRule="auto"/>
-        <w:rPr>
-          <w:rFonts w:ascii="Times New Roman" w:eastAsia="Times New Roman" w:hAnsi="Times New Roman" w:cs="Times New Roman"/>
-          <w:lang w:val="en-IN" w:eastAsia="en-IN"/>
-        </w:rPr>
-      </w:pPr>
-      <w:r>
-        <w:rPr>
-          <w:rFonts w:ascii="Times New Roman" w:eastAsia="Times New Roman" w:hAnsi="Times New Roman" w:cs="Times New Roman"/>
-          <w:lang w:val="en-IN" w:eastAsia="en-IN"/>
-        </w:rPr>
-        <w:t xml:space="preserve">The </w:t>
-      </w:r>
-      <w:proofErr w:type="spellStart"/>
-      <w:r>
-        <w:rPr>
-          <w:rFonts w:ascii="Times New Roman" w:eastAsia="Times New Roman" w:hAnsi="Times New Roman" w:cs="Times New Roman"/>
-          <w:lang w:val="en-IN" w:eastAsia="en-IN"/>
-        </w:rPr>
-        <w:t>AgriCare</w:t>
-      </w:r>
-      <w:proofErr w:type="spellEnd"/>
-      <w:r>
-        <w:rPr>
-          <w:rFonts w:ascii="Times New Roman" w:eastAsia="Times New Roman" w:hAnsi="Times New Roman" w:cs="Times New Roman"/>
-          <w:lang w:val="en-IN" w:eastAsia="en-IN"/>
-        </w:rPr>
-        <w:t xml:space="preserve"> system provides:</w:t>
+        <w:lastRenderedPageBreak/>
+        <w:t>2.5 Design and Implementation Constraints</w:t>
       </w:r>
     </w:p>
     <w:p>
       <w:pPr>
         <w:numPr>
           <w:ilvl w:val="0"/>
-          <w:numId w:val="44"/>
+          <w:numId w:val="51"/>
         </w:numPr>
         <w:spacing w:before="100" w:beforeAutospacing="1" w:after="100" w:afterAutospacing="1" w:line="240" w:lineRule="auto"/>
         <w:rPr>
@@ -1370,14 +2199,14 @@
           <w:rFonts w:ascii="Times New Roman" w:eastAsia="Times New Roman" w:hAnsi="Times New Roman" w:cs="Times New Roman"/>
           <w:lang w:val="en-IN" w:eastAsia="en-IN"/>
         </w:rPr>
-        <w:t xml:space="preserve">AI-based crop disease detection using Gemini AI </w:t>
+        <w:t xml:space="preserve">Internet connection required </w:t>
       </w:r>
     </w:p>
     <w:p>
       <w:pPr>
         <w:numPr>
           <w:ilvl w:val="0"/>
-          <w:numId w:val="44"/>
+          <w:numId w:val="51"/>
         </w:numPr>
         <w:spacing w:before="100" w:beforeAutospacing="1" w:after="100" w:afterAutospacing="1" w:line="240" w:lineRule="auto"/>
         <w:rPr>
@@ -1390,30 +2219,14 @@
           <w:rFonts w:ascii="Times New Roman" w:eastAsia="Times New Roman" w:hAnsi="Times New Roman" w:cs="Times New Roman"/>
           <w:lang w:val="en-IN" w:eastAsia="en-IN"/>
         </w:rPr>
-        <w:t xml:space="preserve">Live mandi prices using </w:t>
-      </w:r>
-      <w:proofErr w:type="spellStart"/>
-      <w:r>
-        <w:rPr>
-          <w:rFonts w:ascii="Times New Roman" w:eastAsia="Times New Roman" w:hAnsi="Times New Roman" w:cs="Times New Roman"/>
-          <w:lang w:val="en-IN" w:eastAsia="en-IN"/>
-        </w:rPr>
-        <w:t>Agmarknet</w:t>
-      </w:r>
-      <w:proofErr w:type="spellEnd"/>
-      <w:r>
-        <w:rPr>
-          <w:rFonts w:ascii="Times New Roman" w:eastAsia="Times New Roman" w:hAnsi="Times New Roman" w:cs="Times New Roman"/>
-          <w:lang w:val="en-IN" w:eastAsia="en-IN"/>
-        </w:rPr>
-        <w:t xml:space="preserve"> API </w:t>
+        <w:t xml:space="preserve">API dependency for live data </w:t>
       </w:r>
     </w:p>
     <w:p>
       <w:pPr>
         <w:numPr>
           <w:ilvl w:val="0"/>
-          <w:numId w:val="44"/>
+          <w:numId w:val="51"/>
         </w:numPr>
         <w:spacing w:before="100" w:beforeAutospacing="1" w:after="100" w:afterAutospacing="1" w:line="240" w:lineRule="auto"/>
         <w:rPr>
@@ -1426,14 +2239,14 @@
           <w:rFonts w:ascii="Times New Roman" w:eastAsia="Times New Roman" w:hAnsi="Times New Roman" w:cs="Times New Roman"/>
           <w:lang w:val="en-IN" w:eastAsia="en-IN"/>
         </w:rPr>
-        <w:t xml:space="preserve">Crop calendar for seasonal farming guidance </w:t>
+        <w:t xml:space="preserve">AI accuracy depends on image quality </w:t>
       </w:r>
     </w:p>
     <w:p>
       <w:pPr>
         <w:numPr>
           <w:ilvl w:val="0"/>
-          <w:numId w:val="44"/>
+          <w:numId w:val="51"/>
         </w:numPr>
         <w:spacing w:before="100" w:beforeAutospacing="1" w:after="100" w:afterAutospacing="1" w:line="240" w:lineRule="auto"/>
         <w:rPr>
@@ -1446,53 +2259,18 @@
           <w:rFonts w:ascii="Times New Roman" w:eastAsia="Times New Roman" w:hAnsi="Times New Roman" w:cs="Times New Roman"/>
           <w:lang w:val="en-IN" w:eastAsia="en-IN"/>
         </w:rPr>
-        <w:t xml:space="preserve">Government subsidy information portal </w:t>
-      </w:r>
-    </w:p>
-    <w:p>
-      <w:pPr>
-        <w:numPr>
-          <w:ilvl w:val="0"/>
-          <w:numId w:val="44"/>
-        </w:numPr>
-        <w:spacing w:before="100" w:beforeAutospacing="1" w:after="100" w:afterAutospacing="1" w:line="240" w:lineRule="auto"/>
-        <w:rPr>
-          <w:rFonts w:ascii="Times New Roman" w:eastAsia="Times New Roman" w:hAnsi="Times New Roman" w:cs="Times New Roman"/>
-          <w:lang w:val="en-IN" w:eastAsia="en-IN"/>
-        </w:rPr>
-      </w:pPr>
-      <w:r>
-        <w:rPr>
-          <w:rFonts w:ascii="Times New Roman" w:eastAsia="Times New Roman" w:hAnsi="Times New Roman" w:cs="Times New Roman"/>
-          <w:lang w:val="en-IN" w:eastAsia="en-IN"/>
-        </w:rPr>
-        <w:t xml:space="preserve">Local agricultural shop locator using GPS </w:t>
-      </w:r>
-    </w:p>
-    <w:p>
-      <w:pPr>
-        <w:numPr>
-          <w:ilvl w:val="0"/>
-          <w:numId w:val="44"/>
-        </w:numPr>
-        <w:spacing w:before="100" w:beforeAutospacing="1" w:after="100" w:afterAutospacing="1" w:line="240" w:lineRule="auto"/>
-        <w:rPr>
-          <w:rFonts w:ascii="Times New Roman" w:eastAsia="Times New Roman" w:hAnsi="Times New Roman" w:cs="Times New Roman"/>
-          <w:lang w:val="en-IN" w:eastAsia="en-IN"/>
-        </w:rPr>
-      </w:pPr>
-      <w:r>
-        <w:rPr>
-          <w:rFonts w:ascii="Times New Roman" w:eastAsia="Times New Roman" w:hAnsi="Times New Roman" w:cs="Times New Roman"/>
-          <w:lang w:val="en-IN" w:eastAsia="en-IN"/>
-        </w:rPr>
-        <w:t xml:space="preserve">Multilingual support (English, Gujarati, Hindi) </w:t>
-      </w:r>
-    </w:p>
-    <w:p>
-      <w:pPr>
-        <w:spacing w:before="100" w:beforeAutospacing="1" w:after="100" w:afterAutospacing="1" w:line="240" w:lineRule="auto"/>
-        <w:outlineLvl w:val="1"/>
+        <w:t xml:space="preserve">Browser compatibility required </w:t>
+      </w:r>
+    </w:p>
+    <w:p>
+      <w:pPr>
+        <w:spacing w:after="0" w:line="240" w:lineRule="auto"/>
+        <w:rPr>
+          <w:rFonts w:ascii="Times New Roman" w:eastAsia="Times New Roman" w:hAnsi="Times New Roman" w:cs="Times New Roman"/>
+          <w:lang w:val="en-IN" w:eastAsia="en-IN"/>
+        </w:rPr>
+      </w:pPr>
+      <w:r>
         <w:rPr>
           <w:rFonts w:ascii="Times New Roman" w:eastAsia="Times New Roman" w:hAnsi="Times New Roman" w:cs="Times New Roman"/>
           <w:b/>
@@ -1501,6 +2279,238 @@
           <w:szCs w:val="36"/>
           <w:lang w:val="en-IN" w:eastAsia="en-IN"/>
         </w:rPr>
+        <w:t>2.6 User Documentation</w:t>
+      </w:r>
+    </w:p>
+    <w:p>
+      <w:pPr>
+        <w:spacing w:before="100" w:beforeAutospacing="1" w:after="100" w:afterAutospacing="1" w:line="240" w:lineRule="auto"/>
+        <w:rPr>
+          <w:rFonts w:ascii="Times New Roman" w:eastAsia="Times New Roman" w:hAnsi="Times New Roman" w:cs="Times New Roman"/>
+          <w:lang w:val="en-IN" w:eastAsia="en-IN"/>
+        </w:rPr>
+      </w:pPr>
+      <w:r>
+        <w:rPr>
+          <w:rFonts w:ascii="Times New Roman" w:eastAsia="Times New Roman" w:hAnsi="Times New Roman" w:cs="Times New Roman"/>
+          <w:lang w:val="en-IN" w:eastAsia="en-IN"/>
+        </w:rPr>
+        <w:t xml:space="preserve">The </w:t>
+      </w:r>
+      <w:proofErr w:type="spellStart"/>
+      <w:r>
+        <w:rPr>
+          <w:rFonts w:ascii="Times New Roman" w:eastAsia="Times New Roman" w:hAnsi="Times New Roman" w:cs="Times New Roman"/>
+          <w:lang w:val="en-IN" w:eastAsia="en-IN"/>
+        </w:rPr>
+        <w:t>AgriCare</w:t>
+      </w:r>
+      <w:proofErr w:type="spellEnd"/>
+      <w:r>
+        <w:rPr>
+          <w:rFonts w:ascii="Times New Roman" w:eastAsia="Times New Roman" w:hAnsi="Times New Roman" w:cs="Times New Roman"/>
+          <w:lang w:val="en-IN" w:eastAsia="en-IN"/>
+        </w:rPr>
+        <w:t xml:space="preserve"> system provides user-friendly documentation to help users understand and effectively use the platform. The documentation includes:</w:t>
+      </w:r>
+    </w:p>
+    <w:p>
+      <w:pPr>
+        <w:numPr>
+          <w:ilvl w:val="0"/>
+          <w:numId w:val="59"/>
+        </w:numPr>
+        <w:spacing w:before="100" w:beforeAutospacing="1" w:after="100" w:afterAutospacing="1" w:line="240" w:lineRule="auto"/>
+        <w:rPr>
+          <w:rFonts w:ascii="Times New Roman" w:eastAsia="Times New Roman" w:hAnsi="Times New Roman" w:cs="Times New Roman"/>
+          <w:lang w:val="en-IN" w:eastAsia="en-IN"/>
+        </w:rPr>
+      </w:pPr>
+      <w:r>
+        <w:rPr>
+          <w:rFonts w:ascii="Times New Roman" w:eastAsia="Times New Roman" w:hAnsi="Times New Roman" w:cs="Times New Roman"/>
+          <w:b/>
+          <w:bCs/>
+          <w:lang w:val="en-IN" w:eastAsia="en-IN"/>
+        </w:rPr>
+        <w:t>About Section</w:t>
+      </w:r>
+      <w:r>
+        <w:rPr>
+          <w:rFonts w:ascii="Times New Roman" w:eastAsia="Times New Roman" w:hAnsi="Times New Roman" w:cs="Times New Roman"/>
+          <w:lang w:val="en-IN" w:eastAsia="en-IN"/>
+        </w:rPr>
+        <w:t xml:space="preserve">: Provides an overview of the system, its purpose, and features. </w:t>
+      </w:r>
+    </w:p>
+    <w:p>
+      <w:pPr>
+        <w:numPr>
+          <w:ilvl w:val="0"/>
+          <w:numId w:val="59"/>
+        </w:numPr>
+        <w:spacing w:before="100" w:beforeAutospacing="1" w:after="100" w:afterAutospacing="1" w:line="240" w:lineRule="auto"/>
+        <w:rPr>
+          <w:rFonts w:ascii="Times New Roman" w:eastAsia="Times New Roman" w:hAnsi="Times New Roman" w:cs="Times New Roman"/>
+          <w:lang w:val="en-IN" w:eastAsia="en-IN"/>
+        </w:rPr>
+      </w:pPr>
+      <w:r>
+        <w:rPr>
+          <w:rFonts w:ascii="Times New Roman" w:eastAsia="Times New Roman" w:hAnsi="Times New Roman" w:cs="Times New Roman"/>
+          <w:b/>
+          <w:bCs/>
+          <w:lang w:val="en-IN" w:eastAsia="en-IN"/>
+        </w:rPr>
+        <w:t>User Dashboard Guide</w:t>
+      </w:r>
+      <w:r>
+        <w:rPr>
+          <w:rFonts w:ascii="Times New Roman" w:eastAsia="Times New Roman" w:hAnsi="Times New Roman" w:cs="Times New Roman"/>
+          <w:lang w:val="en-IN" w:eastAsia="en-IN"/>
+        </w:rPr>
+        <w:t xml:space="preserve">: Explains how farmers can navigate the dashboard, use AI detection, view mandi prices, and access subsidies. </w:t>
+      </w:r>
+    </w:p>
+    <w:p>
+      <w:pPr>
+        <w:numPr>
+          <w:ilvl w:val="0"/>
+          <w:numId w:val="59"/>
+        </w:numPr>
+        <w:spacing w:before="100" w:beforeAutospacing="1" w:after="100" w:afterAutospacing="1" w:line="240" w:lineRule="auto"/>
+        <w:rPr>
+          <w:rFonts w:ascii="Times New Roman" w:eastAsia="Times New Roman" w:hAnsi="Times New Roman" w:cs="Times New Roman"/>
+          <w:lang w:val="en-IN" w:eastAsia="en-IN"/>
+        </w:rPr>
+      </w:pPr>
+      <w:r>
+        <w:rPr>
+          <w:rFonts w:ascii="Times New Roman" w:eastAsia="Times New Roman" w:hAnsi="Times New Roman" w:cs="Times New Roman"/>
+          <w:b/>
+          <w:bCs/>
+          <w:lang w:val="en-IN" w:eastAsia="en-IN"/>
+        </w:rPr>
+        <w:t>Image Upload Instructions</w:t>
+      </w:r>
+      <w:r>
+        <w:rPr>
+          <w:rFonts w:ascii="Times New Roman" w:eastAsia="Times New Roman" w:hAnsi="Times New Roman" w:cs="Times New Roman"/>
+          <w:lang w:val="en-IN" w:eastAsia="en-IN"/>
+        </w:rPr>
+        <w:t xml:space="preserve">: Step-by-step guidance for uploading crop images for disease detection. </w:t>
+      </w:r>
+    </w:p>
+    <w:p>
+      <w:pPr>
+        <w:numPr>
+          <w:ilvl w:val="0"/>
+          <w:numId w:val="59"/>
+        </w:numPr>
+        <w:spacing w:before="100" w:beforeAutospacing="1" w:after="100" w:afterAutospacing="1" w:line="240" w:lineRule="auto"/>
+        <w:rPr>
+          <w:rFonts w:ascii="Times New Roman" w:eastAsia="Times New Roman" w:hAnsi="Times New Roman" w:cs="Times New Roman"/>
+          <w:lang w:val="en-IN" w:eastAsia="en-IN"/>
+        </w:rPr>
+      </w:pPr>
+      <w:r>
+        <w:rPr>
+          <w:rFonts w:ascii="Times New Roman" w:eastAsia="Times New Roman" w:hAnsi="Times New Roman" w:cs="Times New Roman"/>
+          <w:b/>
+          <w:bCs/>
+          <w:lang w:val="en-IN" w:eastAsia="en-IN"/>
+        </w:rPr>
+        <w:t>Crop Calendar Guide</w:t>
+      </w:r>
+      <w:r>
+        <w:rPr>
+          <w:rFonts w:ascii="Times New Roman" w:eastAsia="Times New Roman" w:hAnsi="Times New Roman" w:cs="Times New Roman"/>
+          <w:lang w:val="en-IN" w:eastAsia="en-IN"/>
+        </w:rPr>
+        <w:t xml:space="preserve">: Instructions for understanding seasonal crop planning. </w:t>
+      </w:r>
+    </w:p>
+    <w:p>
+      <w:pPr>
+        <w:numPr>
+          <w:ilvl w:val="0"/>
+          <w:numId w:val="59"/>
+        </w:numPr>
+        <w:spacing w:before="100" w:beforeAutospacing="1" w:after="100" w:afterAutospacing="1" w:line="240" w:lineRule="auto"/>
+        <w:rPr>
+          <w:rFonts w:ascii="Times New Roman" w:eastAsia="Times New Roman" w:hAnsi="Times New Roman" w:cs="Times New Roman"/>
+          <w:lang w:val="en-IN" w:eastAsia="en-IN"/>
+        </w:rPr>
+      </w:pPr>
+      <w:r>
+        <w:rPr>
+          <w:rFonts w:ascii="Times New Roman" w:eastAsia="Times New Roman" w:hAnsi="Times New Roman" w:cs="Times New Roman"/>
+          <w:b/>
+          <w:bCs/>
+          <w:lang w:val="en-IN" w:eastAsia="en-IN"/>
+        </w:rPr>
+        <w:t>Shop Locator Help</w:t>
+      </w:r>
+      <w:r>
+        <w:rPr>
+          <w:rFonts w:ascii="Times New Roman" w:eastAsia="Times New Roman" w:hAnsi="Times New Roman" w:cs="Times New Roman"/>
+          <w:lang w:val="en-IN" w:eastAsia="en-IN"/>
+        </w:rPr>
+        <w:t xml:space="preserve">: Guidance on how to find nearby agricultural shops using location services. </w:t>
+      </w:r>
+    </w:p>
+    <w:p>
+      <w:pPr>
+        <w:numPr>
+          <w:ilvl w:val="0"/>
+          <w:numId w:val="59"/>
+        </w:numPr>
+        <w:spacing w:before="100" w:beforeAutospacing="1" w:after="100" w:afterAutospacing="1" w:line="240" w:lineRule="auto"/>
+        <w:rPr>
+          <w:rFonts w:ascii="Times New Roman" w:eastAsia="Times New Roman" w:hAnsi="Times New Roman" w:cs="Times New Roman"/>
+          <w:lang w:val="en-IN" w:eastAsia="en-IN"/>
+        </w:rPr>
+      </w:pPr>
+      <w:r>
+        <w:rPr>
+          <w:rFonts w:ascii="Times New Roman" w:eastAsia="Times New Roman" w:hAnsi="Times New Roman" w:cs="Times New Roman"/>
+          <w:b/>
+          <w:bCs/>
+          <w:lang w:val="en-IN" w:eastAsia="en-IN"/>
+        </w:rPr>
+        <w:t>Multilingual Support Guide</w:t>
+      </w:r>
+      <w:r>
+        <w:rPr>
+          <w:rFonts w:ascii="Times New Roman" w:eastAsia="Times New Roman" w:hAnsi="Times New Roman" w:cs="Times New Roman"/>
+          <w:lang w:val="en-IN" w:eastAsia="en-IN"/>
+        </w:rPr>
+        <w:t xml:space="preserve">: Instructions for switching between English, Gujarati, and Hindi. </w:t>
+      </w:r>
+    </w:p>
+    <w:p>
+      <w:pPr>
+        <w:spacing w:before="100" w:beforeAutospacing="1" w:after="100" w:afterAutospacing="1" w:line="240" w:lineRule="auto"/>
+        <w:rPr>
+          <w:rFonts w:ascii="Times New Roman" w:eastAsia="Times New Roman" w:hAnsi="Times New Roman" w:cs="Times New Roman"/>
+          <w:lang w:val="en-IN" w:eastAsia="en-IN"/>
+        </w:rPr>
+      </w:pPr>
+      <w:r>
+        <w:rPr>
+          <w:rFonts w:ascii="Times New Roman" w:eastAsia="Times New Roman" w:hAnsi="Times New Roman" w:cs="Times New Roman"/>
+          <w:lang w:val="en-IN" w:eastAsia="en-IN"/>
+        </w:rPr>
+        <w:t>The system is designed with a simple and intuitive interface so that even users with basic technical knowledge can operate it easily.</w:t>
+      </w:r>
+    </w:p>
+    <w:p>
+      <w:pPr>
+        <w:spacing w:before="100" w:beforeAutospacing="1" w:after="100" w:afterAutospacing="1" w:line="240" w:lineRule="auto"/>
+        <w:rPr>
+          <w:rFonts w:ascii="Times New Roman" w:eastAsia="Times New Roman" w:hAnsi="Times New Roman" w:cs="Times New Roman"/>
+          <w:lang w:val="en-IN" w:eastAsia="en-IN"/>
+        </w:rPr>
       </w:pPr>
       <w:r>
         <w:rPr>
@@ -1511,520 +2521,7 @@
           <w:szCs w:val="36"/>
           <w:lang w:val="en-IN" w:eastAsia="en-IN"/>
         </w:rPr>
-        <w:t>1.5 References</w:t>
-      </w:r>
-    </w:p>
-    <w:p>
-      <w:pPr>
-        <w:numPr>
-          <w:ilvl w:val="0"/>
-          <w:numId w:val="45"/>
-        </w:numPr>
-        <w:spacing w:before="100" w:beforeAutospacing="1" w:after="100" w:afterAutospacing="1" w:line="240" w:lineRule="auto"/>
-        <w:rPr>
-          <w:rFonts w:ascii="Times New Roman" w:eastAsia="Times New Roman" w:hAnsi="Times New Roman" w:cs="Times New Roman"/>
-          <w:lang w:val="en-IN" w:eastAsia="en-IN"/>
-        </w:rPr>
-      </w:pPr>
-      <w:r>
-        <w:rPr>
-          <w:rFonts w:ascii="Times New Roman" w:eastAsia="Times New Roman" w:hAnsi="Times New Roman" w:cs="Times New Roman"/>
-          <w:lang w:val="en-IN" w:eastAsia="en-IN"/>
-        </w:rPr>
-        <w:t xml:space="preserve">Rajib Mall – Fundamentals of Software Engineering </w:t>
-      </w:r>
-    </w:p>
-    <w:p>
-      <w:pPr>
-        <w:numPr>
-          <w:ilvl w:val="0"/>
-          <w:numId w:val="45"/>
-        </w:numPr>
-        <w:spacing w:before="100" w:beforeAutospacing="1" w:after="100" w:afterAutospacing="1" w:line="240" w:lineRule="auto"/>
-        <w:rPr>
-          <w:rFonts w:ascii="Times New Roman" w:eastAsia="Times New Roman" w:hAnsi="Times New Roman" w:cs="Times New Roman"/>
-          <w:lang w:val="en-IN" w:eastAsia="en-IN"/>
-        </w:rPr>
-      </w:pPr>
-      <w:proofErr w:type="spellStart"/>
-      <w:r>
-        <w:rPr>
-          <w:rFonts w:ascii="Times New Roman" w:eastAsia="Times New Roman" w:hAnsi="Times New Roman" w:cs="Times New Roman"/>
-          <w:lang w:val="en-IN" w:eastAsia="en-IN"/>
-        </w:rPr>
-        <w:t>OpenWeatherMap</w:t>
-      </w:r>
-      <w:proofErr w:type="spellEnd"/>
-      <w:r>
-        <w:rPr>
-          <w:rFonts w:ascii="Times New Roman" w:eastAsia="Times New Roman" w:hAnsi="Times New Roman" w:cs="Times New Roman"/>
-          <w:lang w:val="en-IN" w:eastAsia="en-IN"/>
-        </w:rPr>
-        <w:t xml:space="preserve"> API </w:t>
-      </w:r>
-    </w:p>
-    <w:p>
-      <w:pPr>
-        <w:numPr>
-          <w:ilvl w:val="0"/>
-          <w:numId w:val="45"/>
-        </w:numPr>
-        <w:spacing w:before="100" w:beforeAutospacing="1" w:after="100" w:afterAutospacing="1" w:line="240" w:lineRule="auto"/>
-        <w:rPr>
-          <w:rFonts w:ascii="Times New Roman" w:eastAsia="Times New Roman" w:hAnsi="Times New Roman" w:cs="Times New Roman"/>
-          <w:lang w:val="en-IN" w:eastAsia="en-IN"/>
-        </w:rPr>
-      </w:pPr>
-      <w:proofErr w:type="spellStart"/>
-      <w:r>
-        <w:rPr>
-          <w:rFonts w:ascii="Times New Roman" w:eastAsia="Times New Roman" w:hAnsi="Times New Roman" w:cs="Times New Roman"/>
-          <w:lang w:val="en-IN" w:eastAsia="en-IN"/>
-        </w:rPr>
-        <w:t>Agmarknet</w:t>
-      </w:r>
-      <w:proofErr w:type="spellEnd"/>
-      <w:r>
-        <w:rPr>
-          <w:rFonts w:ascii="Times New Roman" w:eastAsia="Times New Roman" w:hAnsi="Times New Roman" w:cs="Times New Roman"/>
-          <w:lang w:val="en-IN" w:eastAsia="en-IN"/>
-        </w:rPr>
-        <w:t xml:space="preserve"> API </w:t>
-      </w:r>
-    </w:p>
-    <w:p>
-      <w:pPr>
-        <w:numPr>
-          <w:ilvl w:val="0"/>
-          <w:numId w:val="45"/>
-        </w:numPr>
-        <w:spacing w:before="100" w:beforeAutospacing="1" w:after="100" w:afterAutospacing="1" w:line="240" w:lineRule="auto"/>
-        <w:rPr>
-          <w:rFonts w:ascii="Times New Roman" w:eastAsia="Times New Roman" w:hAnsi="Times New Roman" w:cs="Times New Roman"/>
-          <w:lang w:val="en-IN" w:eastAsia="en-IN"/>
-        </w:rPr>
-      </w:pPr>
-      <w:r>
-        <w:rPr>
-          <w:rFonts w:ascii="Times New Roman" w:eastAsia="Times New Roman" w:hAnsi="Times New Roman" w:cs="Times New Roman"/>
-          <w:lang w:val="en-IN" w:eastAsia="en-IN"/>
-        </w:rPr>
-        <w:t xml:space="preserve">Google Gemini AI Documentation </w:t>
-      </w:r>
-    </w:p>
-    <w:p>
-      <w:pPr>
-        <w:numPr>
-          <w:ilvl w:val="0"/>
-          <w:numId w:val="45"/>
-        </w:numPr>
-        <w:spacing w:before="100" w:beforeAutospacing="1" w:after="100" w:afterAutospacing="1" w:line="240" w:lineRule="auto"/>
-        <w:rPr>
-          <w:rFonts w:ascii="Times New Roman" w:eastAsia="Times New Roman" w:hAnsi="Times New Roman" w:cs="Times New Roman"/>
-          <w:lang w:val="en-IN" w:eastAsia="en-IN"/>
-        </w:rPr>
-      </w:pPr>
-      <w:proofErr w:type="spellStart"/>
-      <w:r>
-        <w:rPr>
-          <w:rFonts w:ascii="Times New Roman" w:eastAsia="Times New Roman" w:hAnsi="Times New Roman" w:cs="Times New Roman"/>
-          <w:lang w:val="en-IN" w:eastAsia="en-IN"/>
-        </w:rPr>
-        <w:t>Supabase</w:t>
-      </w:r>
-      <w:proofErr w:type="spellEnd"/>
-      <w:r>
-        <w:rPr>
-          <w:rFonts w:ascii="Times New Roman" w:eastAsia="Times New Roman" w:hAnsi="Times New Roman" w:cs="Times New Roman"/>
-          <w:lang w:val="en-IN" w:eastAsia="en-IN"/>
-        </w:rPr>
-        <w:t xml:space="preserve"> Documentation </w:t>
-      </w:r>
-    </w:p>
-    <w:p>
-      <w:pPr>
-        <w:spacing w:after="0" w:line="240" w:lineRule="auto"/>
-        <w:rPr>
-          <w:rFonts w:ascii="Times New Roman" w:eastAsia="Times New Roman" w:hAnsi="Times New Roman" w:cs="Times New Roman"/>
-          <w:lang w:val="en-IN" w:eastAsia="en-IN"/>
-        </w:rPr>
-      </w:pPr>
-    </w:p>
-    <w:p>
-      <w:pPr>
-        <w:spacing w:after="0" w:line="240" w:lineRule="auto"/>
-        <w:rPr>
-          <w:rFonts w:ascii="Times New Roman" w:eastAsia="Times New Roman" w:hAnsi="Times New Roman" w:cs="Times New Roman"/>
-          <w:lang w:val="en-IN" w:eastAsia="en-IN"/>
-        </w:rPr>
-      </w:pPr>
-    </w:p>
-    <w:p>
-      <w:pPr>
-        <w:spacing w:before="100" w:beforeAutospacing="1" w:after="100" w:afterAutospacing="1" w:line="240" w:lineRule="auto"/>
-        <w:outlineLvl w:val="0"/>
-        <w:rPr>
-          <w:rFonts w:ascii="Times New Roman" w:eastAsia="Times New Roman" w:hAnsi="Times New Roman" w:cs="Times New Roman"/>
-          <w:b/>
-          <w:bCs/>
-          <w:kern w:val="36"/>
-          <w:sz w:val="48"/>
-          <w:szCs w:val="48"/>
-          <w:lang w:val="en-IN" w:eastAsia="en-IN"/>
-        </w:rPr>
-      </w:pPr>
-      <w:r>
-        <w:rPr>
-          <w:rFonts w:ascii="Times New Roman" w:eastAsia="Times New Roman" w:hAnsi="Times New Roman" w:cs="Times New Roman"/>
-          <w:b/>
-          <w:bCs/>
-          <w:kern w:val="36"/>
-          <w:sz w:val="48"/>
-          <w:szCs w:val="48"/>
-          <w:lang w:val="en-IN" w:eastAsia="en-IN"/>
-        </w:rPr>
-        <w:lastRenderedPageBreak/>
-        <w:t>2. Overall Description</w:t>
-      </w:r>
-    </w:p>
-    <w:p>
-      <w:pPr>
-        <w:spacing w:before="100" w:beforeAutospacing="1" w:after="100" w:afterAutospacing="1" w:line="240" w:lineRule="auto"/>
-        <w:outlineLvl w:val="1"/>
-        <w:rPr>
-          <w:rFonts w:ascii="Times New Roman" w:eastAsia="Times New Roman" w:hAnsi="Times New Roman" w:cs="Times New Roman"/>
-          <w:b/>
-          <w:bCs/>
-          <w:sz w:val="36"/>
-          <w:szCs w:val="36"/>
-          <w:lang w:val="en-IN" w:eastAsia="en-IN"/>
-        </w:rPr>
-      </w:pPr>
-      <w:r>
-        <w:rPr>
-          <w:rFonts w:ascii="Times New Roman" w:eastAsia="Times New Roman" w:hAnsi="Times New Roman" w:cs="Times New Roman"/>
-          <w:b/>
-          <w:bCs/>
-          <w:sz w:val="36"/>
-          <w:szCs w:val="36"/>
-          <w:lang w:val="en-IN" w:eastAsia="en-IN"/>
-        </w:rPr>
-        <w:t>2.1 Product Perspective</w:t>
-      </w:r>
-    </w:p>
-    <w:p>
-      <w:pPr>
-        <w:spacing w:before="100" w:beforeAutospacing="1" w:after="100" w:afterAutospacing="1" w:line="240" w:lineRule="auto"/>
-        <w:rPr>
-          <w:rFonts w:ascii="Times New Roman" w:eastAsia="Times New Roman" w:hAnsi="Times New Roman" w:cs="Times New Roman"/>
-          <w:lang w:val="en-IN" w:eastAsia="en-IN"/>
-        </w:rPr>
-      </w:pPr>
-      <w:proofErr w:type="spellStart"/>
-      <w:r>
-        <w:rPr>
-          <w:rFonts w:ascii="Times New Roman" w:eastAsia="Times New Roman" w:hAnsi="Times New Roman" w:cs="Times New Roman"/>
-          <w:lang w:val="en-IN" w:eastAsia="en-IN"/>
-        </w:rPr>
-        <w:t>AgriCare</w:t>
-      </w:r>
-      <w:proofErr w:type="spellEnd"/>
-      <w:r>
-        <w:rPr>
-          <w:rFonts w:ascii="Times New Roman" w:eastAsia="Times New Roman" w:hAnsi="Times New Roman" w:cs="Times New Roman"/>
-          <w:lang w:val="en-IN" w:eastAsia="en-IN"/>
-        </w:rPr>
-        <w:t xml:space="preserve"> is a standalone web application that integrates:</w:t>
-      </w:r>
-    </w:p>
-    <w:p>
-      <w:pPr>
-        <w:numPr>
-          <w:ilvl w:val="0"/>
-          <w:numId w:val="46"/>
-        </w:numPr>
-        <w:spacing w:before="100" w:beforeAutospacing="1" w:after="100" w:afterAutospacing="1" w:line="240" w:lineRule="auto"/>
-        <w:rPr>
-          <w:rFonts w:ascii="Times New Roman" w:eastAsia="Times New Roman" w:hAnsi="Times New Roman" w:cs="Times New Roman"/>
-          <w:lang w:val="en-IN" w:eastAsia="en-IN"/>
-        </w:rPr>
-      </w:pPr>
-      <w:r>
-        <w:rPr>
-          <w:rFonts w:ascii="Times New Roman" w:eastAsia="Times New Roman" w:hAnsi="Times New Roman" w:cs="Times New Roman"/>
-          <w:lang w:val="en-IN" w:eastAsia="en-IN"/>
-        </w:rPr>
-        <w:t xml:space="preserve">AI-based disease detection </w:t>
-      </w:r>
-    </w:p>
-    <w:p>
-      <w:pPr>
-        <w:numPr>
-          <w:ilvl w:val="0"/>
-          <w:numId w:val="46"/>
-        </w:numPr>
-        <w:spacing w:before="100" w:beforeAutospacing="1" w:after="100" w:afterAutospacing="1" w:line="240" w:lineRule="auto"/>
-        <w:rPr>
-          <w:rFonts w:ascii="Times New Roman" w:eastAsia="Times New Roman" w:hAnsi="Times New Roman" w:cs="Times New Roman"/>
-          <w:lang w:val="en-IN" w:eastAsia="en-IN"/>
-        </w:rPr>
-      </w:pPr>
-      <w:r>
-        <w:rPr>
-          <w:rFonts w:ascii="Times New Roman" w:eastAsia="Times New Roman" w:hAnsi="Times New Roman" w:cs="Times New Roman"/>
-          <w:lang w:val="en-IN" w:eastAsia="en-IN"/>
-        </w:rPr>
-        <w:t xml:space="preserve">Real-time market price APIs </w:t>
-      </w:r>
-    </w:p>
-    <w:p>
-      <w:pPr>
-        <w:numPr>
-          <w:ilvl w:val="0"/>
-          <w:numId w:val="46"/>
-        </w:numPr>
-        <w:spacing w:before="100" w:beforeAutospacing="1" w:after="100" w:afterAutospacing="1" w:line="240" w:lineRule="auto"/>
-        <w:rPr>
-          <w:rFonts w:ascii="Times New Roman" w:eastAsia="Times New Roman" w:hAnsi="Times New Roman" w:cs="Times New Roman"/>
-          <w:lang w:val="en-IN" w:eastAsia="en-IN"/>
-        </w:rPr>
-      </w:pPr>
-      <w:r>
-        <w:rPr>
-          <w:rFonts w:ascii="Times New Roman" w:eastAsia="Times New Roman" w:hAnsi="Times New Roman" w:cs="Times New Roman"/>
-          <w:lang w:val="en-IN" w:eastAsia="en-IN"/>
-        </w:rPr>
-        <w:t xml:space="preserve">Government scheme data </w:t>
-      </w:r>
-    </w:p>
-    <w:p>
-      <w:pPr>
-        <w:numPr>
-          <w:ilvl w:val="0"/>
-          <w:numId w:val="46"/>
-        </w:numPr>
-        <w:spacing w:before="100" w:beforeAutospacing="1" w:after="100" w:afterAutospacing="1" w:line="240" w:lineRule="auto"/>
-        <w:rPr>
-          <w:rFonts w:ascii="Times New Roman" w:eastAsia="Times New Roman" w:hAnsi="Times New Roman" w:cs="Times New Roman"/>
-          <w:lang w:val="en-IN" w:eastAsia="en-IN"/>
-        </w:rPr>
-      </w:pPr>
-      <w:r>
-        <w:rPr>
-          <w:rFonts w:ascii="Times New Roman" w:eastAsia="Times New Roman" w:hAnsi="Times New Roman" w:cs="Times New Roman"/>
-          <w:lang w:val="en-IN" w:eastAsia="en-IN"/>
-        </w:rPr>
-        <w:t xml:space="preserve">Location-based services </w:t>
-      </w:r>
-    </w:p>
-    <w:p>
-      <w:pPr>
-        <w:spacing w:before="100" w:beforeAutospacing="1" w:after="100" w:afterAutospacing="1" w:line="240" w:lineRule="auto"/>
-        <w:outlineLvl w:val="1"/>
-        <w:rPr>
-          <w:rFonts w:ascii="Times New Roman" w:eastAsia="Times New Roman" w:hAnsi="Times New Roman" w:cs="Times New Roman"/>
-          <w:b/>
-          <w:bCs/>
-          <w:sz w:val="36"/>
-          <w:szCs w:val="36"/>
-          <w:lang w:val="en-IN" w:eastAsia="en-IN"/>
-        </w:rPr>
-      </w:pPr>
-      <w:r>
-        <w:rPr>
-          <w:rFonts w:ascii="Times New Roman" w:eastAsia="Times New Roman" w:hAnsi="Times New Roman" w:cs="Times New Roman"/>
-          <w:b/>
-          <w:bCs/>
-          <w:sz w:val="36"/>
-          <w:szCs w:val="36"/>
-          <w:lang w:val="en-IN" w:eastAsia="en-IN"/>
-        </w:rPr>
-        <w:t>2.2 Product Features</w:t>
-      </w:r>
-    </w:p>
-    <w:p>
-      <w:pPr>
-        <w:numPr>
-          <w:ilvl w:val="0"/>
-          <w:numId w:val="47"/>
-        </w:numPr>
-        <w:spacing w:before="100" w:beforeAutospacing="1" w:after="100" w:afterAutospacing="1" w:line="240" w:lineRule="auto"/>
-        <w:rPr>
-          <w:rFonts w:ascii="Times New Roman" w:eastAsia="Times New Roman" w:hAnsi="Times New Roman" w:cs="Times New Roman"/>
-          <w:lang w:val="en-IN" w:eastAsia="en-IN"/>
-        </w:rPr>
-      </w:pPr>
-      <w:r>
-        <w:rPr>
-          <w:rFonts w:ascii="Times New Roman" w:eastAsia="Times New Roman" w:hAnsi="Times New Roman" w:cs="Times New Roman"/>
-          <w:lang w:val="en-IN" w:eastAsia="en-IN"/>
-        </w:rPr>
-        <w:t xml:space="preserve">User Registration and Login </w:t>
-      </w:r>
-    </w:p>
-    <w:p>
-      <w:pPr>
-        <w:numPr>
-          <w:ilvl w:val="0"/>
-          <w:numId w:val="47"/>
-        </w:numPr>
-        <w:spacing w:before="100" w:beforeAutospacing="1" w:after="100" w:afterAutospacing="1" w:line="240" w:lineRule="auto"/>
-        <w:rPr>
-          <w:rFonts w:ascii="Times New Roman" w:eastAsia="Times New Roman" w:hAnsi="Times New Roman" w:cs="Times New Roman"/>
-          <w:lang w:val="en-IN" w:eastAsia="en-IN"/>
-        </w:rPr>
-      </w:pPr>
-      <w:r>
-        <w:rPr>
-          <w:rFonts w:ascii="Times New Roman" w:eastAsia="Times New Roman" w:hAnsi="Times New Roman" w:cs="Times New Roman"/>
-          <w:lang w:val="en-IN" w:eastAsia="en-IN"/>
-        </w:rPr>
-        <w:t xml:space="preserve">Farmer Dashboard </w:t>
-      </w:r>
-    </w:p>
-    <w:p>
-      <w:pPr>
-        <w:numPr>
-          <w:ilvl w:val="0"/>
-          <w:numId w:val="47"/>
-        </w:numPr>
-        <w:spacing w:before="100" w:beforeAutospacing="1" w:after="100" w:afterAutospacing="1" w:line="240" w:lineRule="auto"/>
-        <w:rPr>
-          <w:rFonts w:ascii="Times New Roman" w:eastAsia="Times New Roman" w:hAnsi="Times New Roman" w:cs="Times New Roman"/>
-          <w:lang w:val="en-IN" w:eastAsia="en-IN"/>
-        </w:rPr>
-      </w:pPr>
-      <w:r>
-        <w:rPr>
-          <w:rFonts w:ascii="Times New Roman" w:eastAsia="Times New Roman" w:hAnsi="Times New Roman" w:cs="Times New Roman"/>
-          <w:lang w:val="en-IN" w:eastAsia="en-IN"/>
-        </w:rPr>
-        <w:t xml:space="preserve">Admin Panel </w:t>
-      </w:r>
-    </w:p>
-    <w:p>
-      <w:pPr>
-        <w:numPr>
-          <w:ilvl w:val="0"/>
-          <w:numId w:val="47"/>
-        </w:numPr>
-        <w:spacing w:before="100" w:beforeAutospacing="1" w:after="100" w:afterAutospacing="1" w:line="240" w:lineRule="auto"/>
-        <w:rPr>
-          <w:rFonts w:ascii="Times New Roman" w:eastAsia="Times New Roman" w:hAnsi="Times New Roman" w:cs="Times New Roman"/>
-          <w:lang w:val="en-IN" w:eastAsia="en-IN"/>
-        </w:rPr>
-      </w:pPr>
-      <w:r>
-        <w:rPr>
-          <w:rFonts w:ascii="Times New Roman" w:eastAsia="Times New Roman" w:hAnsi="Times New Roman" w:cs="Times New Roman"/>
-          <w:lang w:val="en-IN" w:eastAsia="en-IN"/>
-        </w:rPr>
-        <w:t xml:space="preserve">AI Crop Disease Detection </w:t>
-      </w:r>
-    </w:p>
-    <w:p>
-      <w:pPr>
-        <w:numPr>
-          <w:ilvl w:val="0"/>
-          <w:numId w:val="47"/>
-        </w:numPr>
-        <w:spacing w:before="100" w:beforeAutospacing="1" w:after="100" w:afterAutospacing="1" w:line="240" w:lineRule="auto"/>
-        <w:rPr>
-          <w:rFonts w:ascii="Times New Roman" w:eastAsia="Times New Roman" w:hAnsi="Times New Roman" w:cs="Times New Roman"/>
-          <w:lang w:val="en-IN" w:eastAsia="en-IN"/>
-        </w:rPr>
-      </w:pPr>
-      <w:r>
-        <w:rPr>
-          <w:rFonts w:ascii="Times New Roman" w:eastAsia="Times New Roman" w:hAnsi="Times New Roman" w:cs="Times New Roman"/>
-          <w:lang w:val="en-IN" w:eastAsia="en-IN"/>
-        </w:rPr>
-        <w:t xml:space="preserve">Live Market Prices </w:t>
-      </w:r>
-    </w:p>
-    <w:p>
-      <w:pPr>
-        <w:numPr>
-          <w:ilvl w:val="0"/>
-          <w:numId w:val="47"/>
-        </w:numPr>
-        <w:spacing w:before="100" w:beforeAutospacing="1" w:after="100" w:afterAutospacing="1" w:line="240" w:lineRule="auto"/>
-        <w:rPr>
-          <w:rFonts w:ascii="Times New Roman" w:eastAsia="Times New Roman" w:hAnsi="Times New Roman" w:cs="Times New Roman"/>
-          <w:lang w:val="en-IN" w:eastAsia="en-IN"/>
-        </w:rPr>
-      </w:pPr>
-      <w:r>
-        <w:rPr>
-          <w:rFonts w:ascii="Times New Roman" w:eastAsia="Times New Roman" w:hAnsi="Times New Roman" w:cs="Times New Roman"/>
-          <w:lang w:val="en-IN" w:eastAsia="en-IN"/>
-        </w:rPr>
-        <w:t xml:space="preserve">Crop Calendar </w:t>
-      </w:r>
-    </w:p>
-    <w:p>
-      <w:pPr>
-        <w:numPr>
-          <w:ilvl w:val="0"/>
-          <w:numId w:val="47"/>
-        </w:numPr>
-        <w:spacing w:before="100" w:beforeAutospacing="1" w:after="100" w:afterAutospacing="1" w:line="240" w:lineRule="auto"/>
-        <w:rPr>
-          <w:rFonts w:ascii="Times New Roman" w:eastAsia="Times New Roman" w:hAnsi="Times New Roman" w:cs="Times New Roman"/>
-          <w:lang w:val="en-IN" w:eastAsia="en-IN"/>
-        </w:rPr>
-      </w:pPr>
-      <w:r>
-        <w:rPr>
-          <w:rFonts w:ascii="Times New Roman" w:eastAsia="Times New Roman" w:hAnsi="Times New Roman" w:cs="Times New Roman"/>
-          <w:lang w:val="en-IN" w:eastAsia="en-IN"/>
-        </w:rPr>
-        <w:t xml:space="preserve">Government Subsidy Information </w:t>
-      </w:r>
-    </w:p>
-    <w:p>
-      <w:pPr>
-        <w:numPr>
-          <w:ilvl w:val="0"/>
-          <w:numId w:val="47"/>
-        </w:numPr>
-        <w:spacing w:before="100" w:beforeAutospacing="1" w:after="100" w:afterAutospacing="1" w:line="240" w:lineRule="auto"/>
-        <w:rPr>
-          <w:rFonts w:ascii="Times New Roman" w:eastAsia="Times New Roman" w:hAnsi="Times New Roman" w:cs="Times New Roman"/>
-          <w:lang w:val="en-IN" w:eastAsia="en-IN"/>
-        </w:rPr>
-      </w:pPr>
-      <w:r>
-        <w:rPr>
-          <w:rFonts w:ascii="Times New Roman" w:eastAsia="Times New Roman" w:hAnsi="Times New Roman" w:cs="Times New Roman"/>
-          <w:lang w:val="en-IN" w:eastAsia="en-IN"/>
-        </w:rPr>
-        <w:t xml:space="preserve">Language Translation </w:t>
-      </w:r>
-    </w:p>
-    <w:p>
-      <w:pPr>
-        <w:spacing w:before="100" w:beforeAutospacing="1" w:after="100" w:afterAutospacing="1" w:line="240" w:lineRule="auto"/>
-        <w:outlineLvl w:val="1"/>
-        <w:rPr>
-          <w:rFonts w:ascii="Times New Roman" w:eastAsia="Times New Roman" w:hAnsi="Times New Roman" w:cs="Times New Roman"/>
-          <w:b/>
-          <w:bCs/>
-          <w:sz w:val="36"/>
-          <w:szCs w:val="36"/>
-          <w:lang w:val="en-IN" w:eastAsia="en-IN"/>
-        </w:rPr>
-      </w:pPr>
-      <w:r>
-        <w:rPr>
-          <w:rFonts w:ascii="Times New Roman" w:eastAsia="Times New Roman" w:hAnsi="Times New Roman" w:cs="Times New Roman"/>
-          <w:b/>
-          <w:bCs/>
-          <w:sz w:val="36"/>
-          <w:szCs w:val="36"/>
-          <w:lang w:val="en-IN" w:eastAsia="en-IN"/>
-        </w:rPr>
-        <w:t>2.3 User Classes and Characteristics</w:t>
+        <w:t>2.7 Assumptions and Dependencies</w:t>
       </w:r>
     </w:p>
     <w:p>
@@ -2049,14 +2546,14 @@
           <w:szCs w:val="27"/>
           <w:lang w:val="en-IN" w:eastAsia="en-IN"/>
         </w:rPr>
-        <w:t>Farmer</w:t>
+        <w:t>Assumptions</w:t>
       </w:r>
     </w:p>
     <w:p>
       <w:pPr>
         <w:numPr>
           <w:ilvl w:val="0"/>
-          <w:numId w:val="48"/>
+          <w:numId w:val="60"/>
         </w:numPr>
         <w:spacing w:before="100" w:beforeAutospacing="1" w:after="100" w:afterAutospacing="1" w:line="240" w:lineRule="auto"/>
         <w:rPr>
@@ -2069,14 +2566,14 @@
           <w:rFonts w:ascii="Times New Roman" w:eastAsia="Times New Roman" w:hAnsi="Times New Roman" w:cs="Times New Roman"/>
           <w:lang w:val="en-IN" w:eastAsia="en-IN"/>
         </w:rPr>
-        <w:t xml:space="preserve">Upload crop images </w:t>
+        <w:t xml:space="preserve">Users (farmers) have basic knowledge of smartphones or computers. </w:t>
       </w:r>
     </w:p>
     <w:p>
       <w:pPr>
         <w:numPr>
           <w:ilvl w:val="0"/>
-          <w:numId w:val="48"/>
+          <w:numId w:val="60"/>
         </w:numPr>
         <w:spacing w:before="100" w:beforeAutospacing="1" w:after="100" w:afterAutospacing="1" w:line="240" w:lineRule="auto"/>
         <w:rPr>
@@ -2089,14 +2586,14 @@
           <w:rFonts w:ascii="Times New Roman" w:eastAsia="Times New Roman" w:hAnsi="Times New Roman" w:cs="Times New Roman"/>
           <w:lang w:val="en-IN" w:eastAsia="en-IN"/>
         </w:rPr>
-        <w:t xml:space="preserve">View disease results and suggestions </w:t>
+        <w:t xml:space="preserve">Users have access to the internet. </w:t>
       </w:r>
     </w:p>
     <w:p>
       <w:pPr>
         <w:numPr>
           <w:ilvl w:val="0"/>
-          <w:numId w:val="48"/>
+          <w:numId w:val="60"/>
         </w:numPr>
         <w:spacing w:before="100" w:beforeAutospacing="1" w:after="100" w:afterAutospacing="1" w:line="240" w:lineRule="auto"/>
         <w:rPr>
@@ -2109,14 +2606,14 @@
           <w:rFonts w:ascii="Times New Roman" w:eastAsia="Times New Roman" w:hAnsi="Times New Roman" w:cs="Times New Roman"/>
           <w:lang w:val="en-IN" w:eastAsia="en-IN"/>
         </w:rPr>
-        <w:t xml:space="preserve">Access crop calendar and subsidies </w:t>
+        <w:t xml:space="preserve">Farmers can capture and upload clear images of crops. </w:t>
       </w:r>
     </w:p>
     <w:p>
       <w:pPr>
         <w:numPr>
           <w:ilvl w:val="0"/>
-          <w:numId w:val="48"/>
+          <w:numId w:val="60"/>
         </w:numPr>
         <w:spacing w:before="100" w:beforeAutospacing="1" w:after="100" w:afterAutospacing="1" w:line="240" w:lineRule="auto"/>
         <w:rPr>
@@ -2129,13 +2626,18 @@
           <w:rFonts w:ascii="Times New Roman" w:eastAsia="Times New Roman" w:hAnsi="Times New Roman" w:cs="Times New Roman"/>
           <w:lang w:val="en-IN" w:eastAsia="en-IN"/>
         </w:rPr>
-        <w:t xml:space="preserve">Find nearby shops </w:t>
-      </w:r>
-    </w:p>
-    <w:p>
-      <w:pPr>
-        <w:spacing w:before="100" w:beforeAutospacing="1" w:after="100" w:afterAutospacing="1" w:line="240" w:lineRule="auto"/>
-        <w:outlineLvl w:val="2"/>
+        <w:t xml:space="preserve">Users understand basic agricultural terms. </w:t>
+      </w:r>
+    </w:p>
+    <w:p>
+      <w:pPr>
+        <w:spacing w:before="100" w:beforeAutospacing="1" w:after="100" w:afterAutospacing="1" w:line="240" w:lineRule="auto"/>
+        <w:rPr>
+          <w:rFonts w:ascii="Times New Roman" w:eastAsia="Times New Roman" w:hAnsi="Times New Roman" w:cs="Times New Roman"/>
+          <w:lang w:val="en-IN" w:eastAsia="en-IN"/>
+        </w:rPr>
+      </w:pPr>
+      <w:r>
         <w:rPr>
           <w:rFonts w:ascii="Times New Roman" w:eastAsia="Times New Roman" w:hAnsi="Times New Roman" w:cs="Times New Roman"/>
           <w:b/>
@@ -2144,690 +2646,6 @@
           <w:szCs w:val="27"/>
           <w:lang w:val="en-IN" w:eastAsia="en-IN"/>
         </w:rPr>
-      </w:pPr>
-      <w:r>
-        <w:rPr>
-          <w:rFonts w:ascii="Times New Roman" w:eastAsia="Times New Roman" w:hAnsi="Times New Roman" w:cs="Times New Roman"/>
-          <w:b/>
-          <w:bCs/>
-          <w:sz w:val="27"/>
-          <w:szCs w:val="27"/>
-          <w:lang w:val="en-IN" w:eastAsia="en-IN"/>
-        </w:rPr>
-        <w:t>Admin</w:t>
-      </w:r>
-    </w:p>
-    <w:p>
-      <w:pPr>
-        <w:numPr>
-          <w:ilvl w:val="0"/>
-          <w:numId w:val="49"/>
-        </w:numPr>
-        <w:spacing w:before="100" w:beforeAutospacing="1" w:after="100" w:afterAutospacing="1" w:line="240" w:lineRule="auto"/>
-        <w:rPr>
-          <w:rFonts w:ascii="Times New Roman" w:eastAsia="Times New Roman" w:hAnsi="Times New Roman" w:cs="Times New Roman"/>
-          <w:lang w:val="en-IN" w:eastAsia="en-IN"/>
-        </w:rPr>
-      </w:pPr>
-      <w:r>
-        <w:rPr>
-          <w:rFonts w:ascii="Times New Roman" w:eastAsia="Times New Roman" w:hAnsi="Times New Roman" w:cs="Times New Roman"/>
-          <w:lang w:val="en-IN" w:eastAsia="en-IN"/>
-        </w:rPr>
-        <w:t xml:space="preserve">Manage users </w:t>
-      </w:r>
-    </w:p>
-    <w:p>
-      <w:pPr>
-        <w:numPr>
-          <w:ilvl w:val="0"/>
-          <w:numId w:val="49"/>
-        </w:numPr>
-        <w:spacing w:before="100" w:beforeAutospacing="1" w:after="100" w:afterAutospacing="1" w:line="240" w:lineRule="auto"/>
-        <w:rPr>
-          <w:rFonts w:ascii="Times New Roman" w:eastAsia="Times New Roman" w:hAnsi="Times New Roman" w:cs="Times New Roman"/>
-          <w:lang w:val="en-IN" w:eastAsia="en-IN"/>
-        </w:rPr>
-      </w:pPr>
-      <w:r>
-        <w:rPr>
-          <w:rFonts w:ascii="Times New Roman" w:eastAsia="Times New Roman" w:hAnsi="Times New Roman" w:cs="Times New Roman"/>
-          <w:lang w:val="en-IN" w:eastAsia="en-IN"/>
-        </w:rPr>
-        <w:t xml:space="preserve">Update subsidy and pesticide data </w:t>
-      </w:r>
-    </w:p>
-    <w:p>
-      <w:pPr>
-        <w:numPr>
-          <w:ilvl w:val="0"/>
-          <w:numId w:val="49"/>
-        </w:numPr>
-        <w:spacing w:before="100" w:beforeAutospacing="1" w:after="100" w:afterAutospacing="1" w:line="240" w:lineRule="auto"/>
-        <w:rPr>
-          <w:rFonts w:ascii="Times New Roman" w:eastAsia="Times New Roman" w:hAnsi="Times New Roman" w:cs="Times New Roman"/>
-          <w:lang w:val="en-IN" w:eastAsia="en-IN"/>
-        </w:rPr>
-      </w:pPr>
-      <w:r>
-        <w:rPr>
-          <w:rFonts w:ascii="Times New Roman" w:eastAsia="Times New Roman" w:hAnsi="Times New Roman" w:cs="Times New Roman"/>
-          <w:lang w:val="en-IN" w:eastAsia="en-IN"/>
-        </w:rPr>
-        <w:t xml:space="preserve">Monitor system data </w:t>
-      </w:r>
-    </w:p>
-    <w:p>
-      <w:pPr>
-        <w:spacing w:before="100" w:beforeAutospacing="1" w:after="100" w:afterAutospacing="1" w:line="240" w:lineRule="auto"/>
-        <w:outlineLvl w:val="1"/>
-        <w:rPr>
-          <w:rFonts w:ascii="Times New Roman" w:eastAsia="Times New Roman" w:hAnsi="Times New Roman" w:cs="Times New Roman"/>
-          <w:b/>
-          <w:bCs/>
-          <w:sz w:val="36"/>
-          <w:szCs w:val="36"/>
-          <w:lang w:val="en-IN" w:eastAsia="en-IN"/>
-        </w:rPr>
-      </w:pPr>
-      <w:r>
-        <w:rPr>
-          <w:rFonts w:ascii="Times New Roman" w:eastAsia="Times New Roman" w:hAnsi="Times New Roman" w:cs="Times New Roman"/>
-          <w:b/>
-          <w:bCs/>
-          <w:sz w:val="36"/>
-          <w:szCs w:val="36"/>
-          <w:lang w:val="en-IN" w:eastAsia="en-IN"/>
-        </w:rPr>
-        <w:t>2.4 Operating Environment</w:t>
-      </w:r>
-    </w:p>
-    <w:p>
-      <w:pPr>
-        <w:numPr>
-          <w:ilvl w:val="0"/>
-          <w:numId w:val="50"/>
-        </w:numPr>
-        <w:spacing w:before="100" w:beforeAutospacing="1" w:after="100" w:afterAutospacing="1" w:line="240" w:lineRule="auto"/>
-        <w:rPr>
-          <w:rFonts w:ascii="Times New Roman" w:eastAsia="Times New Roman" w:hAnsi="Times New Roman" w:cs="Times New Roman"/>
-          <w:lang w:val="en-IN" w:eastAsia="en-IN"/>
-        </w:rPr>
-      </w:pPr>
-      <w:r>
-        <w:rPr>
-          <w:rFonts w:ascii="Times New Roman" w:eastAsia="Times New Roman" w:hAnsi="Times New Roman" w:cs="Times New Roman"/>
-          <w:lang w:val="en-IN" w:eastAsia="en-IN"/>
-        </w:rPr>
-        <w:t xml:space="preserve">Client: Web browser (Chrome, Edge, Firefox) </w:t>
-      </w:r>
-    </w:p>
-    <w:p>
-      <w:pPr>
-        <w:numPr>
-          <w:ilvl w:val="0"/>
-          <w:numId w:val="50"/>
-        </w:numPr>
-        <w:spacing w:before="100" w:beforeAutospacing="1" w:after="100" w:afterAutospacing="1" w:line="240" w:lineRule="auto"/>
-        <w:rPr>
-          <w:rFonts w:ascii="Times New Roman" w:eastAsia="Times New Roman" w:hAnsi="Times New Roman" w:cs="Times New Roman"/>
-          <w:lang w:val="en-IN" w:eastAsia="en-IN"/>
-        </w:rPr>
-      </w:pPr>
-      <w:r>
-        <w:rPr>
-          <w:rFonts w:ascii="Times New Roman" w:eastAsia="Times New Roman" w:hAnsi="Times New Roman" w:cs="Times New Roman"/>
-          <w:lang w:val="en-IN" w:eastAsia="en-IN"/>
-        </w:rPr>
-        <w:t xml:space="preserve">Server: PHP 8.x environment </w:t>
-      </w:r>
-    </w:p>
-    <w:p>
-      <w:pPr>
-        <w:numPr>
-          <w:ilvl w:val="0"/>
-          <w:numId w:val="50"/>
-        </w:numPr>
-        <w:spacing w:before="100" w:beforeAutospacing="1" w:after="100" w:afterAutospacing="1" w:line="240" w:lineRule="auto"/>
-        <w:rPr>
-          <w:rFonts w:ascii="Times New Roman" w:eastAsia="Times New Roman" w:hAnsi="Times New Roman" w:cs="Times New Roman"/>
-          <w:lang w:val="en-IN" w:eastAsia="en-IN"/>
-        </w:rPr>
-      </w:pPr>
-      <w:r>
-        <w:rPr>
-          <w:rFonts w:ascii="Times New Roman" w:eastAsia="Times New Roman" w:hAnsi="Times New Roman" w:cs="Times New Roman"/>
-          <w:lang w:val="en-IN" w:eastAsia="en-IN"/>
-        </w:rPr>
-        <w:t xml:space="preserve">Platform: Windows/Linux </w:t>
-      </w:r>
-    </w:p>
-    <w:p>
-      <w:pPr>
-        <w:numPr>
-          <w:ilvl w:val="0"/>
-          <w:numId w:val="50"/>
-        </w:numPr>
-        <w:spacing w:before="100" w:beforeAutospacing="1" w:after="100" w:afterAutospacing="1" w:line="240" w:lineRule="auto"/>
-        <w:rPr>
-          <w:rFonts w:ascii="Times New Roman" w:eastAsia="Times New Roman" w:hAnsi="Times New Roman" w:cs="Times New Roman"/>
-          <w:lang w:val="en-IN" w:eastAsia="en-IN"/>
-        </w:rPr>
-      </w:pPr>
-      <w:r>
-        <w:rPr>
-          <w:rFonts w:ascii="Times New Roman" w:eastAsia="Times New Roman" w:hAnsi="Times New Roman" w:cs="Times New Roman"/>
-          <w:lang w:val="en-IN" w:eastAsia="en-IN"/>
-        </w:rPr>
-        <w:t xml:space="preserve">Cloud Database: </w:t>
-      </w:r>
-      <w:proofErr w:type="spellStart"/>
-      <w:r>
-        <w:rPr>
-          <w:rFonts w:ascii="Times New Roman" w:eastAsia="Times New Roman" w:hAnsi="Times New Roman" w:cs="Times New Roman"/>
-          <w:lang w:val="en-IN" w:eastAsia="en-IN"/>
-        </w:rPr>
-        <w:t>Supabase</w:t>
-      </w:r>
-      <w:proofErr w:type="spellEnd"/>
-      <w:r>
-        <w:rPr>
-          <w:rFonts w:ascii="Times New Roman" w:eastAsia="Times New Roman" w:hAnsi="Times New Roman" w:cs="Times New Roman"/>
-          <w:lang w:val="en-IN" w:eastAsia="en-IN"/>
-        </w:rPr>
-        <w:t xml:space="preserve"> </w:t>
-      </w:r>
-    </w:p>
-    <w:p>
-      <w:pPr>
-        <w:spacing w:before="100" w:beforeAutospacing="1" w:after="100" w:afterAutospacing="1" w:line="240" w:lineRule="auto"/>
-        <w:outlineLvl w:val="1"/>
-        <w:rPr>
-          <w:rFonts w:ascii="Times New Roman" w:eastAsia="Times New Roman" w:hAnsi="Times New Roman" w:cs="Times New Roman"/>
-          <w:b/>
-          <w:bCs/>
-          <w:sz w:val="36"/>
-          <w:szCs w:val="36"/>
-          <w:lang w:val="en-IN" w:eastAsia="en-IN"/>
-        </w:rPr>
-      </w:pPr>
-      <w:r>
-        <w:rPr>
-          <w:rFonts w:ascii="Times New Roman" w:eastAsia="Times New Roman" w:hAnsi="Times New Roman" w:cs="Times New Roman"/>
-          <w:b/>
-          <w:bCs/>
-          <w:sz w:val="36"/>
-          <w:szCs w:val="36"/>
-          <w:lang w:val="en-IN" w:eastAsia="en-IN"/>
-        </w:rPr>
-        <w:lastRenderedPageBreak/>
-        <w:t>2.5 Design and Implementation Constraints</w:t>
-      </w:r>
-    </w:p>
-    <w:p>
-      <w:pPr>
-        <w:numPr>
-          <w:ilvl w:val="0"/>
-          <w:numId w:val="51"/>
-        </w:numPr>
-        <w:spacing w:before="100" w:beforeAutospacing="1" w:after="100" w:afterAutospacing="1" w:line="240" w:lineRule="auto"/>
-        <w:rPr>
-          <w:rFonts w:ascii="Times New Roman" w:eastAsia="Times New Roman" w:hAnsi="Times New Roman" w:cs="Times New Roman"/>
-          <w:lang w:val="en-IN" w:eastAsia="en-IN"/>
-        </w:rPr>
-      </w:pPr>
-      <w:r>
-        <w:rPr>
-          <w:rFonts w:ascii="Times New Roman" w:eastAsia="Times New Roman" w:hAnsi="Times New Roman" w:cs="Times New Roman"/>
-          <w:lang w:val="en-IN" w:eastAsia="en-IN"/>
-        </w:rPr>
-        <w:t xml:space="preserve">Internet connection required </w:t>
-      </w:r>
-    </w:p>
-    <w:p>
-      <w:pPr>
-        <w:numPr>
-          <w:ilvl w:val="0"/>
-          <w:numId w:val="51"/>
-        </w:numPr>
-        <w:spacing w:before="100" w:beforeAutospacing="1" w:after="100" w:afterAutospacing="1" w:line="240" w:lineRule="auto"/>
-        <w:rPr>
-          <w:rFonts w:ascii="Times New Roman" w:eastAsia="Times New Roman" w:hAnsi="Times New Roman" w:cs="Times New Roman"/>
-          <w:lang w:val="en-IN" w:eastAsia="en-IN"/>
-        </w:rPr>
-      </w:pPr>
-      <w:r>
-        <w:rPr>
-          <w:rFonts w:ascii="Times New Roman" w:eastAsia="Times New Roman" w:hAnsi="Times New Roman" w:cs="Times New Roman"/>
-          <w:lang w:val="en-IN" w:eastAsia="en-IN"/>
-        </w:rPr>
-        <w:t xml:space="preserve">API dependency for live data </w:t>
-      </w:r>
-    </w:p>
-    <w:p>
-      <w:pPr>
-        <w:numPr>
-          <w:ilvl w:val="0"/>
-          <w:numId w:val="51"/>
-        </w:numPr>
-        <w:spacing w:before="100" w:beforeAutospacing="1" w:after="100" w:afterAutospacing="1" w:line="240" w:lineRule="auto"/>
-        <w:rPr>
-          <w:rFonts w:ascii="Times New Roman" w:eastAsia="Times New Roman" w:hAnsi="Times New Roman" w:cs="Times New Roman"/>
-          <w:lang w:val="en-IN" w:eastAsia="en-IN"/>
-        </w:rPr>
-      </w:pPr>
-      <w:r>
-        <w:rPr>
-          <w:rFonts w:ascii="Times New Roman" w:eastAsia="Times New Roman" w:hAnsi="Times New Roman" w:cs="Times New Roman"/>
-          <w:lang w:val="en-IN" w:eastAsia="en-IN"/>
-        </w:rPr>
-        <w:t xml:space="preserve">AI accuracy depends on image quality </w:t>
-      </w:r>
-    </w:p>
-    <w:p>
-      <w:pPr>
-        <w:numPr>
-          <w:ilvl w:val="0"/>
-          <w:numId w:val="51"/>
-        </w:numPr>
-        <w:spacing w:before="100" w:beforeAutospacing="1" w:after="100" w:afterAutospacing="1" w:line="240" w:lineRule="auto"/>
-        <w:rPr>
-          <w:rFonts w:ascii="Times New Roman" w:eastAsia="Times New Roman" w:hAnsi="Times New Roman" w:cs="Times New Roman"/>
-          <w:lang w:val="en-IN" w:eastAsia="en-IN"/>
-        </w:rPr>
-      </w:pPr>
-      <w:r>
-        <w:rPr>
-          <w:rFonts w:ascii="Times New Roman" w:eastAsia="Times New Roman" w:hAnsi="Times New Roman" w:cs="Times New Roman"/>
-          <w:lang w:val="en-IN" w:eastAsia="en-IN"/>
-        </w:rPr>
-        <w:t xml:space="preserve">Browser compatibility required </w:t>
-      </w:r>
-    </w:p>
-    <w:p>
-      <w:pPr>
-        <w:spacing w:after="0" w:line="240" w:lineRule="auto"/>
-        <w:rPr>
-          <w:rFonts w:ascii="Times New Roman" w:eastAsia="Times New Roman" w:hAnsi="Times New Roman" w:cs="Times New Roman"/>
-          <w:lang w:val="en-IN" w:eastAsia="en-IN"/>
-        </w:rPr>
-      </w:pPr>
-      <w:r>
-        <w:rPr>
-          <w:rFonts w:ascii="Times New Roman" w:eastAsia="Times New Roman" w:hAnsi="Times New Roman" w:cs="Times New Roman"/>
-          <w:b/>
-          <w:bCs/>
-          <w:sz w:val="36"/>
-          <w:szCs w:val="36"/>
-          <w:lang w:val="en-IN" w:eastAsia="en-IN"/>
-        </w:rPr>
-        <w:t>2.6 User Documentation</w:t>
-      </w:r>
-    </w:p>
-    <w:p>
-      <w:pPr>
-        <w:spacing w:before="100" w:beforeAutospacing="1" w:after="100" w:afterAutospacing="1" w:line="240" w:lineRule="auto"/>
-        <w:rPr>
-          <w:rFonts w:ascii="Times New Roman" w:eastAsia="Times New Roman" w:hAnsi="Times New Roman" w:cs="Times New Roman"/>
-          <w:lang w:val="en-IN" w:eastAsia="en-IN"/>
-        </w:rPr>
-      </w:pPr>
-      <w:r>
-        <w:rPr>
-          <w:rFonts w:ascii="Times New Roman" w:eastAsia="Times New Roman" w:hAnsi="Times New Roman" w:cs="Times New Roman"/>
-          <w:lang w:val="en-IN" w:eastAsia="en-IN"/>
-        </w:rPr>
-        <w:t xml:space="preserve">The </w:t>
-      </w:r>
-      <w:proofErr w:type="spellStart"/>
-      <w:r>
-        <w:rPr>
-          <w:rFonts w:ascii="Times New Roman" w:eastAsia="Times New Roman" w:hAnsi="Times New Roman" w:cs="Times New Roman"/>
-          <w:lang w:val="en-IN" w:eastAsia="en-IN"/>
-        </w:rPr>
-        <w:t>AgriCare</w:t>
-      </w:r>
-      <w:proofErr w:type="spellEnd"/>
-      <w:r>
-        <w:rPr>
-          <w:rFonts w:ascii="Times New Roman" w:eastAsia="Times New Roman" w:hAnsi="Times New Roman" w:cs="Times New Roman"/>
-          <w:lang w:val="en-IN" w:eastAsia="en-IN"/>
-        </w:rPr>
-        <w:t xml:space="preserve"> system provides user-friendly documentation to help users understand and effectively use the platform. The documentation includes:</w:t>
-      </w:r>
-    </w:p>
-    <w:p>
-      <w:pPr>
-        <w:numPr>
-          <w:ilvl w:val="0"/>
-          <w:numId w:val="59"/>
-        </w:numPr>
-        <w:spacing w:before="100" w:beforeAutospacing="1" w:after="100" w:afterAutospacing="1" w:line="240" w:lineRule="auto"/>
-        <w:rPr>
-          <w:rFonts w:ascii="Times New Roman" w:eastAsia="Times New Roman" w:hAnsi="Times New Roman" w:cs="Times New Roman"/>
-          <w:lang w:val="en-IN" w:eastAsia="en-IN"/>
-        </w:rPr>
-      </w:pPr>
-      <w:r>
-        <w:rPr>
-          <w:rFonts w:ascii="Times New Roman" w:eastAsia="Times New Roman" w:hAnsi="Times New Roman" w:cs="Times New Roman"/>
-          <w:b/>
-          <w:bCs/>
-          <w:lang w:val="en-IN" w:eastAsia="en-IN"/>
-        </w:rPr>
-        <w:t>About Section</w:t>
-      </w:r>
-      <w:r>
-        <w:rPr>
-          <w:rFonts w:ascii="Times New Roman" w:eastAsia="Times New Roman" w:hAnsi="Times New Roman" w:cs="Times New Roman"/>
-          <w:lang w:val="en-IN" w:eastAsia="en-IN"/>
-        </w:rPr>
-        <w:t xml:space="preserve">: Provides an overview of the system, its purpose, and features. </w:t>
-      </w:r>
-    </w:p>
-    <w:p>
-      <w:pPr>
-        <w:numPr>
-          <w:ilvl w:val="0"/>
-          <w:numId w:val="59"/>
-        </w:numPr>
-        <w:spacing w:before="100" w:beforeAutospacing="1" w:after="100" w:afterAutospacing="1" w:line="240" w:lineRule="auto"/>
-        <w:rPr>
-          <w:rFonts w:ascii="Times New Roman" w:eastAsia="Times New Roman" w:hAnsi="Times New Roman" w:cs="Times New Roman"/>
-          <w:lang w:val="en-IN" w:eastAsia="en-IN"/>
-        </w:rPr>
-      </w:pPr>
-      <w:r>
-        <w:rPr>
-          <w:rFonts w:ascii="Times New Roman" w:eastAsia="Times New Roman" w:hAnsi="Times New Roman" w:cs="Times New Roman"/>
-          <w:b/>
-          <w:bCs/>
-          <w:lang w:val="en-IN" w:eastAsia="en-IN"/>
-        </w:rPr>
-        <w:t>User Dashboard Guide</w:t>
-      </w:r>
-      <w:r>
-        <w:rPr>
-          <w:rFonts w:ascii="Times New Roman" w:eastAsia="Times New Roman" w:hAnsi="Times New Roman" w:cs="Times New Roman"/>
-          <w:lang w:val="en-IN" w:eastAsia="en-IN"/>
-        </w:rPr>
-        <w:t xml:space="preserve">: Explains how farmers can navigate the dashboard, use AI detection, view mandi prices, and access subsidies. </w:t>
-      </w:r>
-    </w:p>
-    <w:p>
-      <w:pPr>
-        <w:numPr>
-          <w:ilvl w:val="0"/>
-          <w:numId w:val="59"/>
-        </w:numPr>
-        <w:spacing w:before="100" w:beforeAutospacing="1" w:after="100" w:afterAutospacing="1" w:line="240" w:lineRule="auto"/>
-        <w:rPr>
-          <w:rFonts w:ascii="Times New Roman" w:eastAsia="Times New Roman" w:hAnsi="Times New Roman" w:cs="Times New Roman"/>
-          <w:lang w:val="en-IN" w:eastAsia="en-IN"/>
-        </w:rPr>
-      </w:pPr>
-      <w:r>
-        <w:rPr>
-          <w:rFonts w:ascii="Times New Roman" w:eastAsia="Times New Roman" w:hAnsi="Times New Roman" w:cs="Times New Roman"/>
-          <w:b/>
-          <w:bCs/>
-          <w:lang w:val="en-IN" w:eastAsia="en-IN"/>
-        </w:rPr>
-        <w:t>Image Upload Instructions</w:t>
-      </w:r>
-      <w:r>
-        <w:rPr>
-          <w:rFonts w:ascii="Times New Roman" w:eastAsia="Times New Roman" w:hAnsi="Times New Roman" w:cs="Times New Roman"/>
-          <w:lang w:val="en-IN" w:eastAsia="en-IN"/>
-        </w:rPr>
-        <w:t xml:space="preserve">: Step-by-step guidance for uploading crop images for disease detection. </w:t>
-      </w:r>
-    </w:p>
-    <w:p>
-      <w:pPr>
-        <w:numPr>
-          <w:ilvl w:val="0"/>
-          <w:numId w:val="59"/>
-        </w:numPr>
-        <w:spacing w:before="100" w:beforeAutospacing="1" w:after="100" w:afterAutospacing="1" w:line="240" w:lineRule="auto"/>
-        <w:rPr>
-          <w:rFonts w:ascii="Times New Roman" w:eastAsia="Times New Roman" w:hAnsi="Times New Roman" w:cs="Times New Roman"/>
-          <w:lang w:val="en-IN" w:eastAsia="en-IN"/>
-        </w:rPr>
-      </w:pPr>
-      <w:r>
-        <w:rPr>
-          <w:rFonts w:ascii="Times New Roman" w:eastAsia="Times New Roman" w:hAnsi="Times New Roman" w:cs="Times New Roman"/>
-          <w:b/>
-          <w:bCs/>
-          <w:lang w:val="en-IN" w:eastAsia="en-IN"/>
-        </w:rPr>
-        <w:t>Crop Calendar Guide</w:t>
-      </w:r>
-      <w:r>
-        <w:rPr>
-          <w:rFonts w:ascii="Times New Roman" w:eastAsia="Times New Roman" w:hAnsi="Times New Roman" w:cs="Times New Roman"/>
-          <w:lang w:val="en-IN" w:eastAsia="en-IN"/>
-        </w:rPr>
-        <w:t xml:space="preserve">: Instructions for understanding seasonal crop planning. </w:t>
-      </w:r>
-    </w:p>
-    <w:p>
-      <w:pPr>
-        <w:numPr>
-          <w:ilvl w:val="0"/>
-          <w:numId w:val="59"/>
-        </w:numPr>
-        <w:spacing w:before="100" w:beforeAutospacing="1" w:after="100" w:afterAutospacing="1" w:line="240" w:lineRule="auto"/>
-        <w:rPr>
-          <w:rFonts w:ascii="Times New Roman" w:eastAsia="Times New Roman" w:hAnsi="Times New Roman" w:cs="Times New Roman"/>
-          <w:lang w:val="en-IN" w:eastAsia="en-IN"/>
-        </w:rPr>
-      </w:pPr>
-      <w:r>
-        <w:rPr>
-          <w:rFonts w:ascii="Times New Roman" w:eastAsia="Times New Roman" w:hAnsi="Times New Roman" w:cs="Times New Roman"/>
-          <w:b/>
-          <w:bCs/>
-          <w:lang w:val="en-IN" w:eastAsia="en-IN"/>
-        </w:rPr>
-        <w:t>Shop Locator Help</w:t>
-      </w:r>
-      <w:r>
-        <w:rPr>
-          <w:rFonts w:ascii="Times New Roman" w:eastAsia="Times New Roman" w:hAnsi="Times New Roman" w:cs="Times New Roman"/>
-          <w:lang w:val="en-IN" w:eastAsia="en-IN"/>
-        </w:rPr>
-        <w:t xml:space="preserve">: Guidance on how to find nearby agricultural shops using location services. </w:t>
-      </w:r>
-    </w:p>
-    <w:p>
-      <w:pPr>
-        <w:numPr>
-          <w:ilvl w:val="0"/>
-          <w:numId w:val="59"/>
-        </w:numPr>
-        <w:spacing w:before="100" w:beforeAutospacing="1" w:after="100" w:afterAutospacing="1" w:line="240" w:lineRule="auto"/>
-        <w:rPr>
-          <w:rFonts w:ascii="Times New Roman" w:eastAsia="Times New Roman" w:hAnsi="Times New Roman" w:cs="Times New Roman"/>
-          <w:lang w:val="en-IN" w:eastAsia="en-IN"/>
-        </w:rPr>
-      </w:pPr>
-      <w:r>
-        <w:rPr>
-          <w:rFonts w:ascii="Times New Roman" w:eastAsia="Times New Roman" w:hAnsi="Times New Roman" w:cs="Times New Roman"/>
-          <w:b/>
-          <w:bCs/>
-          <w:lang w:val="en-IN" w:eastAsia="en-IN"/>
-        </w:rPr>
-        <w:t>Multilingual Support Guide</w:t>
-      </w:r>
-      <w:r>
-        <w:rPr>
-          <w:rFonts w:ascii="Times New Roman" w:eastAsia="Times New Roman" w:hAnsi="Times New Roman" w:cs="Times New Roman"/>
-          <w:lang w:val="en-IN" w:eastAsia="en-IN"/>
-        </w:rPr>
-        <w:t xml:space="preserve">: Instructions for switching between English, Gujarati, and Hindi. </w:t>
-      </w:r>
-    </w:p>
-    <w:p>
-      <w:pPr>
-        <w:spacing w:before="100" w:beforeAutospacing="1" w:after="100" w:afterAutospacing="1" w:line="240" w:lineRule="auto"/>
-        <w:rPr>
-          <w:rFonts w:ascii="Times New Roman" w:eastAsia="Times New Roman" w:hAnsi="Times New Roman" w:cs="Times New Roman"/>
-          <w:lang w:val="en-IN" w:eastAsia="en-IN"/>
-        </w:rPr>
-      </w:pPr>
-      <w:r>
-        <w:rPr>
-          <w:rFonts w:ascii="Times New Roman" w:eastAsia="Times New Roman" w:hAnsi="Times New Roman" w:cs="Times New Roman"/>
-          <w:lang w:val="en-IN" w:eastAsia="en-IN"/>
-        </w:rPr>
-        <w:t>The system is designed with a simple and intuitive interface so that even users with basic technical knowledge can operate it easily.</w:t>
-      </w:r>
-    </w:p>
-    <w:p>
-      <w:pPr>
-        <w:spacing w:before="100" w:beforeAutospacing="1" w:after="100" w:afterAutospacing="1" w:line="240" w:lineRule="auto"/>
-        <w:rPr>
-          <w:rFonts w:ascii="Times New Roman" w:eastAsia="Times New Roman" w:hAnsi="Times New Roman" w:cs="Times New Roman"/>
-          <w:lang w:val="en-IN" w:eastAsia="en-IN"/>
-        </w:rPr>
-      </w:pPr>
-      <w:r>
-        <w:rPr>
-          <w:rFonts w:ascii="Times New Roman" w:eastAsia="Times New Roman" w:hAnsi="Times New Roman" w:cs="Times New Roman"/>
-          <w:b/>
-          <w:bCs/>
-          <w:sz w:val="36"/>
-          <w:szCs w:val="36"/>
-          <w:lang w:val="en-IN" w:eastAsia="en-IN"/>
-        </w:rPr>
-        <w:t>2.7 Assumptions and Dependencies</w:t>
-      </w:r>
-    </w:p>
-    <w:p>
-      <w:pPr>
-        <w:spacing w:before="100" w:beforeAutospacing="1" w:after="100" w:afterAutospacing="1" w:line="240" w:lineRule="auto"/>
-        <w:outlineLvl w:val="2"/>
-        <w:rPr>
-          <w:rFonts w:ascii="Times New Roman" w:eastAsia="Times New Roman" w:hAnsi="Times New Roman" w:cs="Times New Roman"/>
-          <w:b/>
-          <w:bCs/>
-          <w:sz w:val="27"/>
-          <w:szCs w:val="27"/>
-          <w:lang w:val="en-IN" w:eastAsia="en-IN"/>
-        </w:rPr>
-      </w:pPr>
-      <w:r>
-        <w:rPr>
-          <w:rFonts w:ascii="Times New Roman" w:eastAsia="Times New Roman" w:hAnsi="Times New Roman" w:cs="Times New Roman"/>
-          <w:b/>
-          <w:bCs/>
-          <w:sz w:val="27"/>
-          <w:szCs w:val="27"/>
-          <w:lang w:val="en-IN" w:eastAsia="en-IN"/>
-        </w:rPr>
-        <w:t>Assumptions</w:t>
-      </w:r>
-    </w:p>
-    <w:p>
-      <w:pPr>
-        <w:numPr>
-          <w:ilvl w:val="0"/>
-          <w:numId w:val="60"/>
-        </w:numPr>
-        <w:spacing w:before="100" w:beforeAutospacing="1" w:after="100" w:afterAutospacing="1" w:line="240" w:lineRule="auto"/>
-        <w:rPr>
-          <w:rFonts w:ascii="Times New Roman" w:eastAsia="Times New Roman" w:hAnsi="Times New Roman" w:cs="Times New Roman"/>
-          <w:lang w:val="en-IN" w:eastAsia="en-IN"/>
-        </w:rPr>
-      </w:pPr>
-      <w:r>
-        <w:rPr>
-          <w:rFonts w:ascii="Times New Roman" w:eastAsia="Times New Roman" w:hAnsi="Times New Roman" w:cs="Times New Roman"/>
-          <w:lang w:val="en-IN" w:eastAsia="en-IN"/>
-        </w:rPr>
-        <w:t xml:space="preserve">Users (farmers) have basic knowledge of smartphones or computers. </w:t>
-      </w:r>
-    </w:p>
-    <w:p>
-      <w:pPr>
-        <w:numPr>
-          <w:ilvl w:val="0"/>
-          <w:numId w:val="60"/>
-        </w:numPr>
-        <w:spacing w:before="100" w:beforeAutospacing="1" w:after="100" w:afterAutospacing="1" w:line="240" w:lineRule="auto"/>
-        <w:rPr>
-          <w:rFonts w:ascii="Times New Roman" w:eastAsia="Times New Roman" w:hAnsi="Times New Roman" w:cs="Times New Roman"/>
-          <w:lang w:val="en-IN" w:eastAsia="en-IN"/>
-        </w:rPr>
-      </w:pPr>
-      <w:r>
-        <w:rPr>
-          <w:rFonts w:ascii="Times New Roman" w:eastAsia="Times New Roman" w:hAnsi="Times New Roman" w:cs="Times New Roman"/>
-          <w:lang w:val="en-IN" w:eastAsia="en-IN"/>
-        </w:rPr>
-        <w:t xml:space="preserve">Users have access to the internet. </w:t>
-      </w:r>
-    </w:p>
-    <w:p>
-      <w:pPr>
-        <w:numPr>
-          <w:ilvl w:val="0"/>
-          <w:numId w:val="60"/>
-        </w:numPr>
-        <w:spacing w:before="100" w:beforeAutospacing="1" w:after="100" w:afterAutospacing="1" w:line="240" w:lineRule="auto"/>
-        <w:rPr>
-          <w:rFonts w:ascii="Times New Roman" w:eastAsia="Times New Roman" w:hAnsi="Times New Roman" w:cs="Times New Roman"/>
-          <w:lang w:val="en-IN" w:eastAsia="en-IN"/>
-        </w:rPr>
-      </w:pPr>
-      <w:r>
-        <w:rPr>
-          <w:rFonts w:ascii="Times New Roman" w:eastAsia="Times New Roman" w:hAnsi="Times New Roman" w:cs="Times New Roman"/>
-          <w:lang w:val="en-IN" w:eastAsia="en-IN"/>
-        </w:rPr>
-        <w:t xml:space="preserve">Farmers can capture and upload clear images of crops. </w:t>
-      </w:r>
-    </w:p>
-    <w:p>
-      <w:pPr>
-        <w:numPr>
-          <w:ilvl w:val="0"/>
-          <w:numId w:val="60"/>
-        </w:numPr>
-        <w:spacing w:before="100" w:beforeAutospacing="1" w:after="100" w:afterAutospacing="1" w:line="240" w:lineRule="auto"/>
-        <w:rPr>
-          <w:rFonts w:ascii="Times New Roman" w:eastAsia="Times New Roman" w:hAnsi="Times New Roman" w:cs="Times New Roman"/>
-          <w:lang w:val="en-IN" w:eastAsia="en-IN"/>
-        </w:rPr>
-      </w:pPr>
-      <w:r>
-        <w:rPr>
-          <w:rFonts w:ascii="Times New Roman" w:eastAsia="Times New Roman" w:hAnsi="Times New Roman" w:cs="Times New Roman"/>
-          <w:lang w:val="en-IN" w:eastAsia="en-IN"/>
-        </w:rPr>
-        <w:t xml:space="preserve">Users understand basic agricultural terms. </w:t>
-      </w:r>
-    </w:p>
-    <w:p>
-      <w:pPr>
-        <w:spacing w:before="100" w:beforeAutospacing="1" w:after="100" w:afterAutospacing="1" w:line="240" w:lineRule="auto"/>
-        <w:rPr>
-          <w:rFonts w:ascii="Times New Roman" w:eastAsia="Times New Roman" w:hAnsi="Times New Roman" w:cs="Times New Roman"/>
-          <w:lang w:val="en-IN" w:eastAsia="en-IN"/>
-        </w:rPr>
-      </w:pPr>
-      <w:r>
-        <w:rPr>
-          <w:rFonts w:ascii="Times New Roman" w:eastAsia="Times New Roman" w:hAnsi="Times New Roman" w:cs="Times New Roman"/>
-          <w:b/>
-          <w:bCs/>
-          <w:sz w:val="27"/>
-          <w:szCs w:val="27"/>
-          <w:lang w:val="en-IN" w:eastAsia="en-IN"/>
-        </w:rPr>
         <w:t>Dependencies</w:t>
       </w:r>
     </w:p>
@@ -2898,26 +2716,6 @@
           <w:lang w:val="en-IN" w:eastAsia="en-IN"/>
         </w:rPr>
         <w:t xml:space="preserve">Weather API (for climate data) </w:t>
-      </w:r>
-    </w:p>
-    <w:p>
-      <w:pPr>
-        <w:numPr>
-          <w:ilvl w:val="1"/>
-          <w:numId w:val="61"/>
-        </w:numPr>
-        <w:spacing w:before="100" w:beforeAutospacing="1" w:after="100" w:afterAutospacing="1" w:line="240" w:lineRule="auto"/>
-        <w:rPr>
-          <w:rFonts w:ascii="Times New Roman" w:eastAsia="Times New Roman" w:hAnsi="Times New Roman" w:cs="Times New Roman"/>
-          <w:lang w:val="en-IN" w:eastAsia="en-IN"/>
-        </w:rPr>
-      </w:pPr>
-      <w:r>
-        <w:rPr>
-          <w:rFonts w:ascii="Times New Roman" w:eastAsia="Times New Roman" w:hAnsi="Times New Roman" w:cs="Times New Roman"/>
-          <w:lang w:val="en-IN" w:eastAsia="en-IN"/>
-        </w:rPr>
-        <w:t xml:space="preserve">Gemini AI API (for disease detection) </w:t>
       </w:r>
     </w:p>
     <w:p>
@@ -4076,7 +3874,7 @@
       </w:tblPr>
       <w:tblGrid>
         <w:gridCol w:w="1928"/>
-        <w:gridCol w:w="4434"/>
+        <w:gridCol w:w="4561"/>
       </w:tblGrid>
       <w:tr>
         <w:trPr>
@@ -4406,7 +4204,23 @@
                 <w:rFonts w:ascii="Times New Roman" w:eastAsia="Times New Roman" w:hAnsi="Times New Roman" w:cs="Times New Roman"/>
                 <w:lang w:val="en-IN" w:eastAsia="en-IN"/>
               </w:rPr>
-              <w:t>Google Gemini AI</w:t>
+              <w:t xml:space="preserve">Trained AI Model, Gemini &amp; </w:t>
+            </w:r>
+            <w:proofErr w:type="spellStart"/>
+            <w:r>
+              <w:rPr>
+                <w:rFonts w:ascii="Times New Roman" w:eastAsia="Times New Roman" w:hAnsi="Times New Roman" w:cs="Times New Roman"/>
+                <w:lang w:val="en-IN" w:eastAsia="en-IN"/>
+              </w:rPr>
+              <w:t>Groq</w:t>
+            </w:r>
+            <w:proofErr w:type="spellEnd"/>
+            <w:r>
+              <w:rPr>
+                <w:rFonts w:ascii="Times New Roman" w:eastAsia="Times New Roman" w:hAnsi="Times New Roman" w:cs="Times New Roman"/>
+                <w:lang w:val="en-IN" w:eastAsia="en-IN"/>
+              </w:rPr>
+              <w:t xml:space="preserve"> (Chat-Bot)</w:t>
             </w:r>
           </w:p>
         </w:tc>
@@ -5027,13 +4841,6 @@
         </w:rPr>
         <w:t xml:space="preserve">The system should support multiple users simultaneously without performance degradation. </w:t>
       </w:r>
-      <w:r>
-        <w:rPr>
-          <w:rFonts w:ascii="Times New Roman" w:eastAsia="Times New Roman" w:hAnsi="Times New Roman" w:cs="Times New Roman"/>
-          <w:lang w:val="en-IN" w:eastAsia="en-IN"/>
-        </w:rPr>
-        <w:t>\</w:t>
-      </w:r>
     </w:p>
     <w:p>
       <w:pPr>
@@ -5799,11 +5606,7 @@
           <w:lang w:val="en-IN" w:eastAsia="en-IN"/>
         </w:rPr>
       </w:pPr>
-    </w:p>
-    <w:p>
-      <w:pPr>
-        <w:spacing w:before="100" w:beforeAutospacing="1" w:after="100" w:afterAutospacing="1" w:line="240" w:lineRule="auto"/>
-        <w:outlineLvl w:val="0"/>
+      <w:r>
         <w:rPr>
           <w:rFonts w:ascii="Times New Roman" w:eastAsia="Times New Roman" w:hAnsi="Times New Roman" w:cs="Times New Roman"/>
           <w:b/>
@@ -5813,138 +5616,6 @@
           <w:szCs w:val="48"/>
           <w:lang w:val="en-IN" w:eastAsia="en-IN"/>
         </w:rPr>
-      </w:pPr>
-    </w:p>
-    <w:p>
-      <w:pPr>
-        <w:spacing w:before="100" w:beforeAutospacing="1" w:after="100" w:afterAutospacing="1" w:line="240" w:lineRule="auto"/>
-        <w:outlineLvl w:val="0"/>
-        <w:rPr>
-          <w:rFonts w:ascii="Times New Roman" w:eastAsia="Times New Roman" w:hAnsi="Times New Roman" w:cs="Times New Roman"/>
-          <w:b/>
-          <w:bCs/>
-          <w:kern w:val="36"/>
-          <w:sz w:val="48"/>
-          <w:szCs w:val="48"/>
-          <w:lang w:val="en-IN" w:eastAsia="en-IN"/>
-        </w:rPr>
-      </w:pPr>
-    </w:p>
-    <w:p>
-      <w:pPr>
-        <w:spacing w:before="100" w:beforeAutospacing="1" w:after="100" w:afterAutospacing="1" w:line="240" w:lineRule="auto"/>
-        <w:outlineLvl w:val="0"/>
-        <w:rPr>
-          <w:rFonts w:ascii="Times New Roman" w:eastAsia="Times New Roman" w:hAnsi="Times New Roman" w:cs="Times New Roman"/>
-          <w:b/>
-          <w:bCs/>
-          <w:kern w:val="36"/>
-          <w:sz w:val="48"/>
-          <w:szCs w:val="48"/>
-          <w:lang w:val="en-IN" w:eastAsia="en-IN"/>
-        </w:rPr>
-      </w:pPr>
-    </w:p>
-    <w:p>
-      <w:pPr>
-        <w:spacing w:before="100" w:beforeAutospacing="1" w:after="100" w:afterAutospacing="1" w:line="240" w:lineRule="auto"/>
-        <w:outlineLvl w:val="0"/>
-        <w:rPr>
-          <w:rFonts w:ascii="Times New Roman" w:eastAsia="Times New Roman" w:hAnsi="Times New Roman" w:cs="Times New Roman"/>
-          <w:b/>
-          <w:bCs/>
-          <w:kern w:val="36"/>
-          <w:sz w:val="48"/>
-          <w:szCs w:val="48"/>
-          <w:lang w:val="en-IN" w:eastAsia="en-IN"/>
-        </w:rPr>
-      </w:pPr>
-    </w:p>
-    <w:p>
-      <w:pPr>
-        <w:spacing w:before="100" w:beforeAutospacing="1" w:after="100" w:afterAutospacing="1" w:line="240" w:lineRule="auto"/>
-        <w:outlineLvl w:val="0"/>
-        <w:rPr>
-          <w:rFonts w:ascii="Times New Roman" w:eastAsia="Times New Roman" w:hAnsi="Times New Roman" w:cs="Times New Roman"/>
-          <w:b/>
-          <w:bCs/>
-          <w:kern w:val="36"/>
-          <w:sz w:val="48"/>
-          <w:szCs w:val="48"/>
-          <w:lang w:val="en-IN" w:eastAsia="en-IN"/>
-        </w:rPr>
-      </w:pPr>
-    </w:p>
-    <w:p>
-      <w:pPr>
-        <w:spacing w:before="100" w:beforeAutospacing="1" w:after="100" w:afterAutospacing="1" w:line="240" w:lineRule="auto"/>
-        <w:outlineLvl w:val="0"/>
-        <w:rPr>
-          <w:rFonts w:ascii="Times New Roman" w:eastAsia="Times New Roman" w:hAnsi="Times New Roman" w:cs="Times New Roman"/>
-          <w:b/>
-          <w:bCs/>
-          <w:kern w:val="36"/>
-          <w:sz w:val="48"/>
-          <w:szCs w:val="48"/>
-          <w:lang w:val="en-IN" w:eastAsia="en-IN"/>
-        </w:rPr>
-      </w:pPr>
-    </w:p>
-    <w:p>
-      <w:pPr>
-        <w:spacing w:before="100" w:beforeAutospacing="1" w:after="100" w:afterAutospacing="1" w:line="240" w:lineRule="auto"/>
-        <w:outlineLvl w:val="0"/>
-        <w:rPr>
-          <w:rFonts w:ascii="Times New Roman" w:eastAsia="Times New Roman" w:hAnsi="Times New Roman" w:cs="Times New Roman"/>
-          <w:b/>
-          <w:bCs/>
-          <w:kern w:val="36"/>
-          <w:sz w:val="48"/>
-          <w:szCs w:val="48"/>
-          <w:lang w:val="en-IN" w:eastAsia="en-IN"/>
-        </w:rPr>
-      </w:pPr>
-    </w:p>
-    <w:p>
-      <w:pPr>
-        <w:spacing w:before="100" w:beforeAutospacing="1" w:after="100" w:afterAutospacing="1" w:line="240" w:lineRule="auto"/>
-        <w:outlineLvl w:val="0"/>
-        <w:rPr>
-          <w:rFonts w:ascii="Times New Roman" w:eastAsia="Times New Roman" w:hAnsi="Times New Roman" w:cs="Times New Roman"/>
-          <w:b/>
-          <w:bCs/>
-          <w:kern w:val="36"/>
-          <w:sz w:val="48"/>
-          <w:szCs w:val="48"/>
-          <w:lang w:val="en-IN" w:eastAsia="en-IN"/>
-        </w:rPr>
-      </w:pPr>
-    </w:p>
-    <w:p>
-      <w:pPr>
-        <w:spacing w:before="100" w:beforeAutospacing="1" w:after="100" w:afterAutospacing="1" w:line="240" w:lineRule="auto"/>
-        <w:outlineLvl w:val="0"/>
-        <w:rPr>
-          <w:rFonts w:ascii="Times New Roman" w:eastAsia="Times New Roman" w:hAnsi="Times New Roman" w:cs="Times New Roman"/>
-          <w:b/>
-          <w:bCs/>
-          <w:kern w:val="36"/>
-          <w:sz w:val="48"/>
-          <w:szCs w:val="48"/>
-          <w:lang w:val="en-IN" w:eastAsia="en-IN"/>
-        </w:rPr>
-      </w:pPr>
-      <w:r>
-        <w:rPr>
-          <w:rFonts w:ascii="Times New Roman" w:eastAsia="Times New Roman" w:hAnsi="Times New Roman" w:cs="Times New Roman"/>
-          <w:b/>
-          <w:bCs/>
-          <w:kern w:val="36"/>
-          <w:sz w:val="48"/>
-          <w:szCs w:val="48"/>
-          <w:lang w:val="en-IN" w:eastAsia="en-IN"/>
-        </w:rPr>
-        <w:lastRenderedPageBreak/>
         <w:t>Appendix A: Glossary</w:t>
       </w:r>
     </w:p>
@@ -6441,6 +6112,7 @@
           <w:bCs/>
           <w:lang w:val="en-IN" w:eastAsia="en-IN"/>
         </w:rPr>
+        <w:lastRenderedPageBreak/>
         <w:t>Data Flow Diagram (DFD)</w:t>
       </w:r>
       <w:r>
@@ -6585,26 +6257,6 @@
           <w:lang w:val="en-IN" w:eastAsia="en-IN"/>
         </w:rPr>
         <w:t>The following issues and future improvements have been identified:</w:t>
-      </w:r>
-    </w:p>
-    <w:p>
-      <w:pPr>
-        <w:numPr>
-          <w:ilvl w:val="0"/>
-          <w:numId w:val="73"/>
-        </w:numPr>
-        <w:spacing w:before="100" w:beforeAutospacing="1" w:after="100" w:afterAutospacing="1" w:line="240" w:lineRule="auto"/>
-        <w:rPr>
-          <w:rFonts w:ascii="Times New Roman" w:eastAsia="Times New Roman" w:hAnsi="Times New Roman" w:cs="Times New Roman"/>
-          <w:lang w:val="en-IN" w:eastAsia="en-IN"/>
-        </w:rPr>
-      </w:pPr>
-      <w:r>
-        <w:rPr>
-          <w:rFonts w:ascii="Times New Roman" w:eastAsia="Times New Roman" w:hAnsi="Times New Roman" w:cs="Times New Roman"/>
-          <w:lang w:val="en-IN" w:eastAsia="en-IN"/>
-        </w:rPr>
-        <w:t xml:space="preserve">Payment gateway integration is not implemented yet. </w:t>
       </w:r>
     </w:p>
     <w:p>
@@ -7785,6 +7437,119 @@
     </w:lvl>
   </w:abstractNum>
   <w:abstractNum w:abstractNumId="7" w15:restartNumberingAfterBreak="0">
+    <w:nsid w:val="0D8732B2"/>
+    <w:multiLevelType w:val="multilevel"/>
+    <w:tmpl w:val="247C132A"/>
+    <w:lvl w:ilvl="0">
+      <w:start w:val="3"/>
+      <w:numFmt w:val="decimal"/>
+      <w:lvlText w:val="%1"/>
+      <w:lvlJc w:val="left"/>
+      <w:pPr>
+        <w:ind w:left="360" w:hanging="360"/>
+      </w:pPr>
+      <w:rPr>
+        <w:rFonts w:hint="default"/>
+      </w:rPr>
+    </w:lvl>
+    <w:lvl w:ilvl="1">
+      <w:start w:val="3"/>
+      <w:numFmt w:val="decimal"/>
+      <w:lvlText w:val="%1.%2"/>
+      <w:lvlJc w:val="left"/>
+      <w:pPr>
+        <w:ind w:left="643" w:hanging="360"/>
+      </w:pPr>
+      <w:rPr>
+        <w:rFonts w:hint="default"/>
+      </w:rPr>
+    </w:lvl>
+    <w:lvl w:ilvl="2">
+      <w:start w:val="1"/>
+      <w:numFmt w:val="decimal"/>
+      <w:lvlText w:val="%1.%2.%3"/>
+      <w:lvlJc w:val="left"/>
+      <w:pPr>
+        <w:ind w:left="1286" w:hanging="720"/>
+      </w:pPr>
+      <w:rPr>
+        <w:rFonts w:hint="default"/>
+      </w:rPr>
+    </w:lvl>
+    <w:lvl w:ilvl="3">
+      <w:start w:val="1"/>
+      <w:numFmt w:val="decimal"/>
+      <w:lvlText w:val="%1.%2.%3.%4"/>
+      <w:lvlJc w:val="left"/>
+      <w:pPr>
+        <w:ind w:left="1569" w:hanging="720"/>
+      </w:pPr>
+      <w:rPr>
+        <w:rFonts w:hint="default"/>
+      </w:rPr>
+    </w:lvl>
+    <w:lvl w:ilvl="4">
+      <w:start w:val="1"/>
+      <w:numFmt w:val="decimal"/>
+      <w:lvlText w:val="%1.%2.%3.%4.%5"/>
+      <w:lvlJc w:val="left"/>
+      <w:pPr>
+        <w:ind w:left="2212" w:hanging="1080"/>
+      </w:pPr>
+      <w:rPr>
+        <w:rFonts w:hint="default"/>
+      </w:rPr>
+    </w:lvl>
+    <w:lvl w:ilvl="5">
+      <w:start w:val="1"/>
+      <w:numFmt w:val="decimal"/>
+      <w:lvlText w:val="%1.%2.%3.%4.%5.%6"/>
+      <w:lvlJc w:val="left"/>
+      <w:pPr>
+        <w:ind w:left="2495" w:hanging="1080"/>
+      </w:pPr>
+      <w:rPr>
+        <w:rFonts w:hint="default"/>
+      </w:rPr>
+    </w:lvl>
+    <w:lvl w:ilvl="6">
+      <w:start w:val="1"/>
+      <w:numFmt w:val="decimal"/>
+      <w:lvlText w:val="%1.%2.%3.%4.%5.%6.%7"/>
+      <w:lvlJc w:val="left"/>
+      <w:pPr>
+        <w:ind w:left="3138" w:hanging="1440"/>
+      </w:pPr>
+      <w:rPr>
+        <w:rFonts w:hint="default"/>
+      </w:rPr>
+    </w:lvl>
+    <w:lvl w:ilvl="7">
+      <w:start w:val="1"/>
+      <w:numFmt w:val="decimal"/>
+      <w:lvlText w:val="%1.%2.%3.%4.%5.%6.%7.%8"/>
+      <w:lvlJc w:val="left"/>
+      <w:pPr>
+        <w:ind w:left="3421" w:hanging="1440"/>
+      </w:pPr>
+      <w:rPr>
+        <w:rFonts w:hint="default"/>
+      </w:rPr>
+    </w:lvl>
+    <w:lvl w:ilvl="8">
+      <w:start w:val="1"/>
+      <w:numFmt w:val="decimal"/>
+      <w:lvlText w:val="%1.%2.%3.%4.%5.%6.%7.%8.%9"/>
+      <w:lvlJc w:val="left"/>
+      <w:pPr>
+        <w:ind w:left="4064" w:hanging="1800"/>
+      </w:pPr>
+      <w:rPr>
+        <w:rFonts w:hint="default"/>
+      </w:rPr>
+    </w:lvl>
+  </w:abstractNum>
+  <w:abstractNum w:abstractNumId="8" w15:restartNumberingAfterBreak="0">
     <w:nsid w:val="0E9808D6"/>
     <w:multiLevelType w:val="multilevel"/>
     <w:tmpl w:val="6E10DEB8"/>
@@ -7933,7 +7698,120 @@
       </w:rPr>
     </w:lvl>
   </w:abstractNum>
-  <w:abstractNum w:abstractNumId="8" w15:restartNumberingAfterBreak="0">
+  <w:abstractNum w:abstractNumId="9" w15:restartNumberingAfterBreak="0">
+    <w:nsid w:val="0F4A39A1"/>
+    <w:multiLevelType w:val="multilevel"/>
+    <w:tmpl w:val="08F60666"/>
+    <w:lvl w:ilvl="0">
+      <w:start w:val="3"/>
+      <w:numFmt w:val="decimal"/>
+      <w:lvlText w:val="%1"/>
+      <w:lvlJc w:val="left"/>
+      <w:pPr>
+        <w:ind w:left="360" w:hanging="360"/>
+      </w:pPr>
+      <w:rPr>
+        <w:rFonts w:hint="default"/>
+      </w:rPr>
+    </w:lvl>
+    <w:lvl w:ilvl="1">
+      <w:start w:val="3"/>
+      <w:numFmt w:val="decimal"/>
+      <w:lvlText w:val="%1.%2"/>
+      <w:lvlJc w:val="left"/>
+      <w:pPr>
+        <w:ind w:left="643" w:hanging="360"/>
+      </w:pPr>
+      <w:rPr>
+        <w:rFonts w:hint="default"/>
+      </w:rPr>
+    </w:lvl>
+    <w:lvl w:ilvl="2">
+      <w:start w:val="1"/>
+      <w:numFmt w:val="decimal"/>
+      <w:lvlText w:val="%1.%2.%3"/>
+      <w:lvlJc w:val="left"/>
+      <w:pPr>
+        <w:ind w:left="1286" w:hanging="720"/>
+      </w:pPr>
+      <w:rPr>
+        <w:rFonts w:hint="default"/>
+      </w:rPr>
+    </w:lvl>
+    <w:lvl w:ilvl="3">
+      <w:start w:val="1"/>
+      <w:numFmt w:val="decimal"/>
+      <w:lvlText w:val="%1.%2.%3.%4"/>
+      <w:lvlJc w:val="left"/>
+      <w:pPr>
+        <w:ind w:left="1569" w:hanging="720"/>
+      </w:pPr>
+      <w:rPr>
+        <w:rFonts w:hint="default"/>
+      </w:rPr>
+    </w:lvl>
+    <w:lvl w:ilvl="4">
+      <w:start w:val="1"/>
+      <w:numFmt w:val="decimal"/>
+      <w:lvlText w:val="%1.%2.%3.%4.%5"/>
+      <w:lvlJc w:val="left"/>
+      <w:pPr>
+        <w:ind w:left="2212" w:hanging="1080"/>
+      </w:pPr>
+      <w:rPr>
+        <w:rFonts w:hint="default"/>
+      </w:rPr>
+    </w:lvl>
+    <w:lvl w:ilvl="5">
+      <w:start w:val="1"/>
+      <w:numFmt w:val="decimal"/>
+      <w:lvlText w:val="%1.%2.%3.%4.%5.%6"/>
+      <w:lvlJc w:val="left"/>
+      <w:pPr>
+        <w:ind w:left="2495" w:hanging="1080"/>
+      </w:pPr>
+      <w:rPr>
+        <w:rFonts w:hint="default"/>
+      </w:rPr>
+    </w:lvl>
+    <w:lvl w:ilvl="6">
+      <w:start w:val="1"/>
+      <w:numFmt w:val="decimal"/>
+      <w:lvlText w:val="%1.%2.%3.%4.%5.%6.%7"/>
+      <w:lvlJc w:val="left"/>
+      <w:pPr>
+        <w:ind w:left="3138" w:hanging="1440"/>
+      </w:pPr>
+      <w:rPr>
+        <w:rFonts w:hint="default"/>
+      </w:rPr>
+    </w:lvl>
+    <w:lvl w:ilvl="7">
+      <w:start w:val="1"/>
+      <w:numFmt w:val="decimal"/>
+      <w:lvlText w:val="%1.%2.%3.%4.%5.%6.%7.%8"/>
+      <w:lvlJc w:val="left"/>
+      <w:pPr>
+        <w:ind w:left="3421" w:hanging="1440"/>
+      </w:pPr>
+      <w:rPr>
+        <w:rFonts w:hint="default"/>
+      </w:rPr>
+    </w:lvl>
+    <w:lvl w:ilvl="8">
+      <w:start w:val="1"/>
+      <w:numFmt w:val="decimal"/>
+      <w:lvlText w:val="%1.%2.%3.%4.%5.%6.%7.%8.%9"/>
+      <w:lvlJc w:val="left"/>
+      <w:pPr>
+        <w:ind w:left="4064" w:hanging="1800"/>
+      </w:pPr>
+      <w:rPr>
+        <w:rFonts w:hint="default"/>
+      </w:rPr>
+    </w:lvl>
+  </w:abstractNum>
+  <w:abstractNum w:abstractNumId="10" w15:restartNumberingAfterBreak="0">
     <w:nsid w:val="0FBA7F1D"/>
     <w:multiLevelType w:val="multilevel"/>
     <w:tmpl w:val="B366BCB8"/>
@@ -8082,7 +7960,7 @@
       </w:rPr>
     </w:lvl>
   </w:abstractNum>
-  <w:abstractNum w:abstractNumId="9" w15:restartNumberingAfterBreak="0">
+  <w:abstractNum w:abstractNumId="11" w15:restartNumberingAfterBreak="0">
     <w:nsid w:val="0FDE78C4"/>
     <w:multiLevelType w:val="multilevel"/>
     <w:tmpl w:val="8410CA84"/>
@@ -8231,7 +8109,7 @@
       </w:rPr>
     </w:lvl>
   </w:abstractNum>
-  <w:abstractNum w:abstractNumId="10" w15:restartNumberingAfterBreak="0">
+  <w:abstractNum w:abstractNumId="12" w15:restartNumberingAfterBreak="0">
     <w:nsid w:val="164163FA"/>
     <w:multiLevelType w:val="multilevel"/>
     <w:tmpl w:val="7E482E24"/>
@@ -8380,7 +8258,7 @@
       </w:rPr>
     </w:lvl>
   </w:abstractNum>
-  <w:abstractNum w:abstractNumId="11" w15:restartNumberingAfterBreak="0">
+  <w:abstractNum w:abstractNumId="13" w15:restartNumberingAfterBreak="0">
     <w:nsid w:val="190C1598"/>
     <w:multiLevelType w:val="multilevel"/>
     <w:tmpl w:val="4AE6BC66"/>
@@ -8529,7 +8407,7 @@
       </w:rPr>
     </w:lvl>
   </w:abstractNum>
-  <w:abstractNum w:abstractNumId="12" w15:restartNumberingAfterBreak="0">
+  <w:abstractNum w:abstractNumId="14" w15:restartNumberingAfterBreak="0">
     <w:nsid w:val="1AC52250"/>
     <w:multiLevelType w:val="multilevel"/>
     <w:tmpl w:val="0B9A6048"/>
@@ -8678,7 +8556,7 @@
       </w:rPr>
     </w:lvl>
   </w:abstractNum>
-  <w:abstractNum w:abstractNumId="13" w15:restartNumberingAfterBreak="0">
+  <w:abstractNum w:abstractNumId="15" w15:restartNumberingAfterBreak="0">
     <w:nsid w:val="1C761D1B"/>
     <w:multiLevelType w:val="multilevel"/>
     <w:tmpl w:val="A7BA2E9A"/>
@@ -8827,7 +8705,7 @@
       </w:rPr>
     </w:lvl>
   </w:abstractNum>
-  <w:abstractNum w:abstractNumId="14" w15:restartNumberingAfterBreak="0">
+  <w:abstractNum w:abstractNumId="16" w15:restartNumberingAfterBreak="0">
     <w:nsid w:val="1FF22E4D"/>
     <w:multiLevelType w:val="multilevel"/>
     <w:tmpl w:val="F3B2A8F0"/>
@@ -8976,7 +8854,7 @@
       </w:rPr>
     </w:lvl>
   </w:abstractNum>
-  <w:abstractNum w:abstractNumId="15" w15:restartNumberingAfterBreak="0">
+  <w:abstractNum w:abstractNumId="17" w15:restartNumberingAfterBreak="0">
     <w:nsid w:val="21642E99"/>
     <w:multiLevelType w:val="multilevel"/>
     <w:tmpl w:val="BCBE725C"/>
@@ -9125,7 +9003,7 @@
       </w:rPr>
     </w:lvl>
   </w:abstractNum>
-  <w:abstractNum w:abstractNumId="16" w15:restartNumberingAfterBreak="0">
+  <w:abstractNum w:abstractNumId="18" w15:restartNumberingAfterBreak="0">
     <w:nsid w:val="2176665C"/>
     <w:multiLevelType w:val="multilevel"/>
     <w:tmpl w:val="2A741E5C"/>
@@ -9274,7 +9152,7 @@
       </w:rPr>
     </w:lvl>
   </w:abstractNum>
-  <w:abstractNum w:abstractNumId="17" w15:restartNumberingAfterBreak="0">
+  <w:abstractNum w:abstractNumId="19" w15:restartNumberingAfterBreak="0">
     <w:nsid w:val="224857F4"/>
     <w:multiLevelType w:val="multilevel"/>
     <w:tmpl w:val="D2025422"/>
@@ -9423,7 +9301,7 @@
       </w:rPr>
     </w:lvl>
   </w:abstractNum>
-  <w:abstractNum w:abstractNumId="18" w15:restartNumberingAfterBreak="0">
+  <w:abstractNum w:abstractNumId="20" w15:restartNumberingAfterBreak="0">
     <w:nsid w:val="23825DF8"/>
     <w:multiLevelType w:val="multilevel"/>
     <w:tmpl w:val="7458D340"/>
@@ -9572,7 +9450,7 @@
       </w:rPr>
     </w:lvl>
   </w:abstractNum>
-  <w:abstractNum w:abstractNumId="19" w15:restartNumberingAfterBreak="0">
+  <w:abstractNum w:abstractNumId="21" w15:restartNumberingAfterBreak="0">
     <w:nsid w:val="24AB5A8D"/>
     <w:multiLevelType w:val="multilevel"/>
     <w:tmpl w:val="5270F99C"/>
@@ -9721,7 +9599,7 @@
       </w:rPr>
     </w:lvl>
   </w:abstractNum>
-  <w:abstractNum w:abstractNumId="20" w15:restartNumberingAfterBreak="0">
+  <w:abstractNum w:abstractNumId="22" w15:restartNumberingAfterBreak="0">
     <w:nsid w:val="27F17EEA"/>
     <w:multiLevelType w:val="multilevel"/>
     <w:tmpl w:val="500A0AD8"/>
@@ -9870,7 +9748,7 @@
       </w:rPr>
     </w:lvl>
   </w:abstractNum>
-  <w:abstractNum w:abstractNumId="21" w15:restartNumberingAfterBreak="0">
+  <w:abstractNum w:abstractNumId="23" w15:restartNumberingAfterBreak="0">
     <w:nsid w:val="2A1E0689"/>
     <w:multiLevelType w:val="multilevel"/>
     <w:tmpl w:val="C1289310"/>
@@ -10019,7 +9897,7 @@
       </w:rPr>
     </w:lvl>
   </w:abstractNum>
-  <w:abstractNum w:abstractNumId="22" w15:restartNumberingAfterBreak="0">
+  <w:abstractNum w:abstractNumId="24" w15:restartNumberingAfterBreak="0">
     <w:nsid w:val="2AEC507D"/>
     <w:multiLevelType w:val="multilevel"/>
     <w:tmpl w:val="09B6F06C"/>
@@ -10132,7 +10010,7 @@
       </w:rPr>
     </w:lvl>
   </w:abstractNum>
-  <w:abstractNum w:abstractNumId="23" w15:restartNumberingAfterBreak="0">
+  <w:abstractNum w:abstractNumId="25" w15:restartNumberingAfterBreak="0">
     <w:nsid w:val="2C240E50"/>
     <w:multiLevelType w:val="multilevel"/>
     <w:tmpl w:val="6B003D2A"/>
@@ -10281,7 +10159,7 @@
       </w:rPr>
     </w:lvl>
   </w:abstractNum>
-  <w:abstractNum w:abstractNumId="24" w15:restartNumberingAfterBreak="0">
+  <w:abstractNum w:abstractNumId="26" w15:restartNumberingAfterBreak="0">
     <w:nsid w:val="2CE33CCE"/>
     <w:multiLevelType w:val="multilevel"/>
     <w:tmpl w:val="C172D98A"/>
@@ -10430,7 +10308,7 @@
       </w:rPr>
     </w:lvl>
   </w:abstractNum>
-  <w:abstractNum w:abstractNumId="25" w15:restartNumberingAfterBreak="0">
+  <w:abstractNum w:abstractNumId="27" w15:restartNumberingAfterBreak="0">
     <w:nsid w:val="2CE51A11"/>
     <w:multiLevelType w:val="multilevel"/>
     <w:tmpl w:val="8A26359E"/>
@@ -10579,7 +10457,7 @@
       </w:rPr>
     </w:lvl>
   </w:abstractNum>
-  <w:abstractNum w:abstractNumId="26" w15:restartNumberingAfterBreak="0">
+  <w:abstractNum w:abstractNumId="28" w15:restartNumberingAfterBreak="0">
     <w:nsid w:val="2D7237DE"/>
     <w:multiLevelType w:val="multilevel"/>
     <w:tmpl w:val="188045A8"/>
@@ -10692,7 +10570,7 @@
       </w:pPr>
     </w:lvl>
   </w:abstractNum>
-  <w:abstractNum w:abstractNumId="27" w15:restartNumberingAfterBreak="0">
+  <w:abstractNum w:abstractNumId="29" w15:restartNumberingAfterBreak="0">
     <w:nsid w:val="30892902"/>
     <w:multiLevelType w:val="multilevel"/>
     <w:tmpl w:val="BA26BB34"/>
@@ -10841,7 +10719,7 @@
       </w:rPr>
     </w:lvl>
   </w:abstractNum>
-  <w:abstractNum w:abstractNumId="28" w15:restartNumberingAfterBreak="0">
+  <w:abstractNum w:abstractNumId="30" w15:restartNumberingAfterBreak="0">
     <w:nsid w:val="314A2DE3"/>
     <w:multiLevelType w:val="multilevel"/>
     <w:tmpl w:val="3EF6DE34"/>
@@ -10990,7 +10868,7 @@
       </w:rPr>
     </w:lvl>
   </w:abstractNum>
-  <w:abstractNum w:abstractNumId="29" w15:restartNumberingAfterBreak="0">
+  <w:abstractNum w:abstractNumId="31" w15:restartNumberingAfterBreak="0">
     <w:nsid w:val="334069D2"/>
     <w:multiLevelType w:val="multilevel"/>
     <w:tmpl w:val="FAB48B32"/>
@@ -11139,7 +11017,7 @@
       </w:rPr>
     </w:lvl>
   </w:abstractNum>
-  <w:abstractNum w:abstractNumId="30" w15:restartNumberingAfterBreak="0">
+  <w:abstractNum w:abstractNumId="32" w15:restartNumberingAfterBreak="0">
     <w:nsid w:val="33835FC9"/>
     <w:multiLevelType w:val="multilevel"/>
     <w:tmpl w:val="E93427E2"/>
@@ -11288,7 +11166,7 @@
       </w:rPr>
     </w:lvl>
   </w:abstractNum>
-  <w:abstractNum w:abstractNumId="31" w15:restartNumberingAfterBreak="0">
+  <w:abstractNum w:abstractNumId="33" w15:restartNumberingAfterBreak="0">
     <w:nsid w:val="34EA4226"/>
     <w:multiLevelType w:val="multilevel"/>
     <w:tmpl w:val="C106A456"/>
@@ -11437,7 +11315,120 @@
       </w:rPr>
     </w:lvl>
   </w:abstractNum>
-  <w:abstractNum w:abstractNumId="32" w15:restartNumberingAfterBreak="0">
+  <w:abstractNum w:abstractNumId="34" w15:restartNumberingAfterBreak="0">
+    <w:nsid w:val="38C94477"/>
+    <w:multiLevelType w:val="multilevel"/>
+    <w:tmpl w:val="A2A4052E"/>
+    <w:lvl w:ilvl="0">
+      <w:start w:val="3"/>
+      <w:numFmt w:val="decimal"/>
+      <w:lvlText w:val="%1"/>
+      <w:lvlJc w:val="left"/>
+      <w:pPr>
+        <w:ind w:left="360" w:hanging="360"/>
+      </w:pPr>
+      <w:rPr>
+        <w:rFonts w:hint="default"/>
+      </w:rPr>
+    </w:lvl>
+    <w:lvl w:ilvl="1">
+      <w:start w:val="3"/>
+      <w:numFmt w:val="decimal"/>
+      <w:lvlText w:val="%1.%2"/>
+      <w:lvlJc w:val="left"/>
+      <w:pPr>
+        <w:ind w:left="1243" w:hanging="360"/>
+      </w:pPr>
+      <w:rPr>
+        <w:rFonts w:hint="default"/>
+      </w:rPr>
+    </w:lvl>
+    <w:lvl w:ilvl="2">
+      <w:start w:val="1"/>
+      <w:numFmt w:val="decimal"/>
+      <w:lvlText w:val="%1.%2.%3"/>
+      <w:lvlJc w:val="left"/>
+      <w:pPr>
+        <w:ind w:left="2486" w:hanging="720"/>
+      </w:pPr>
+      <w:rPr>
+        <w:rFonts w:hint="default"/>
+      </w:rPr>
+    </w:lvl>
+    <w:lvl w:ilvl="3">
+      <w:start w:val="1"/>
+      <w:numFmt w:val="decimal"/>
+      <w:lvlText w:val="%1.%2.%3.%4"/>
+      <w:lvlJc w:val="left"/>
+      <w:pPr>
+        <w:ind w:left="3369" w:hanging="720"/>
+      </w:pPr>
+      <w:rPr>
+        <w:rFonts w:hint="default"/>
+      </w:rPr>
+    </w:lvl>
+    <w:lvl w:ilvl="4">
+      <w:start w:val="1"/>
+      <w:numFmt w:val="decimal"/>
+      <w:lvlText w:val="%1.%2.%3.%4.%5"/>
+      <w:lvlJc w:val="left"/>
+      <w:pPr>
+        <w:ind w:left="4612" w:hanging="1080"/>
+      </w:pPr>
+      <w:rPr>
+        <w:rFonts w:hint="default"/>
+      </w:rPr>
+    </w:lvl>
+    <w:lvl w:ilvl="5">
+      <w:start w:val="1"/>
+      <w:numFmt w:val="decimal"/>
+      <w:lvlText w:val="%1.%2.%3.%4.%5.%6"/>
+      <w:lvlJc w:val="left"/>
+      <w:pPr>
+        <w:ind w:left="5495" w:hanging="1080"/>
+      </w:pPr>
+      <w:rPr>
+        <w:rFonts w:hint="default"/>
+      </w:rPr>
+    </w:lvl>
+    <w:lvl w:ilvl="6">
+      <w:start w:val="1"/>
+      <w:numFmt w:val="decimal"/>
+      <w:lvlText w:val="%1.%2.%3.%4.%5.%6.%7"/>
+      <w:lvlJc w:val="left"/>
+      <w:pPr>
+        <w:ind w:left="6738" w:hanging="1440"/>
+      </w:pPr>
+      <w:rPr>
+        <w:rFonts w:hint="default"/>
+      </w:rPr>
+    </w:lvl>
+    <w:lvl w:ilvl="7">
+      <w:start w:val="1"/>
+      <w:numFmt w:val="decimal"/>
+      <w:lvlText w:val="%1.%2.%3.%4.%5.%6.%7.%8"/>
+      <w:lvlJc w:val="left"/>
+      <w:pPr>
+        <w:ind w:left="7621" w:hanging="1440"/>
+      </w:pPr>
+      <w:rPr>
+        <w:rFonts w:hint="default"/>
+      </w:rPr>
+    </w:lvl>
+    <w:lvl w:ilvl="8">
+      <w:start w:val="1"/>
+      <w:numFmt w:val="decimal"/>
+      <w:lvlText w:val="%1.%2.%3.%4.%5.%6.%7.%8.%9"/>
+      <w:lvlJc w:val="left"/>
+      <w:pPr>
+        <w:ind w:left="8864" w:hanging="1800"/>
+      </w:pPr>
+      <w:rPr>
+        <w:rFonts w:hint="default"/>
+      </w:rPr>
+    </w:lvl>
+  </w:abstractNum>
+  <w:abstractNum w:abstractNumId="35" w15:restartNumberingAfterBreak="0">
     <w:nsid w:val="397872D7"/>
     <w:multiLevelType w:val="multilevel"/>
     <w:tmpl w:val="C7CC71C8"/>
@@ -11586,7 +11577,7 @@
       </w:rPr>
     </w:lvl>
   </w:abstractNum>
-  <w:abstractNum w:abstractNumId="33" w15:restartNumberingAfterBreak="0">
+  <w:abstractNum w:abstractNumId="36" w15:restartNumberingAfterBreak="0">
     <w:nsid w:val="3AB0267E"/>
     <w:multiLevelType w:val="multilevel"/>
     <w:tmpl w:val="F8D48E7E"/>
@@ -11735,7 +11726,7 @@
       </w:rPr>
     </w:lvl>
   </w:abstractNum>
-  <w:abstractNum w:abstractNumId="34" w15:restartNumberingAfterBreak="0">
+  <w:abstractNum w:abstractNumId="37" w15:restartNumberingAfterBreak="0">
     <w:nsid w:val="3CBA6368"/>
     <w:multiLevelType w:val="multilevel"/>
     <w:tmpl w:val="D6E81548"/>
@@ -11884,7 +11875,7 @@
       </w:rPr>
     </w:lvl>
   </w:abstractNum>
-  <w:abstractNum w:abstractNumId="35" w15:restartNumberingAfterBreak="0">
+  <w:abstractNum w:abstractNumId="38" w15:restartNumberingAfterBreak="0">
     <w:nsid w:val="3D7B4618"/>
     <w:multiLevelType w:val="multilevel"/>
     <w:tmpl w:val="A0C2B3FC"/>
@@ -12033,7 +12024,7 @@
       </w:rPr>
     </w:lvl>
   </w:abstractNum>
-  <w:abstractNum w:abstractNumId="36" w15:restartNumberingAfterBreak="0">
+  <w:abstractNum w:abstractNumId="39" w15:restartNumberingAfterBreak="0">
     <w:nsid w:val="40523B88"/>
     <w:multiLevelType w:val="multilevel"/>
     <w:tmpl w:val="371444E8"/>
@@ -12182,7 +12173,7 @@
       </w:rPr>
     </w:lvl>
   </w:abstractNum>
-  <w:abstractNum w:abstractNumId="37" w15:restartNumberingAfterBreak="0">
+  <w:abstractNum w:abstractNumId="40" w15:restartNumberingAfterBreak="0">
     <w:nsid w:val="44647B79"/>
     <w:multiLevelType w:val="multilevel"/>
     <w:tmpl w:val="49F6CFB8"/>
@@ -12331,7 +12322,7 @@
       </w:rPr>
     </w:lvl>
   </w:abstractNum>
-  <w:abstractNum w:abstractNumId="38" w15:restartNumberingAfterBreak="0">
+  <w:abstractNum w:abstractNumId="41" w15:restartNumberingAfterBreak="0">
     <w:nsid w:val="46196D30"/>
     <w:multiLevelType w:val="multilevel"/>
     <w:tmpl w:val="3E70CF80"/>
@@ -12480,7 +12471,7 @@
       </w:rPr>
     </w:lvl>
   </w:abstractNum>
-  <w:abstractNum w:abstractNumId="39" w15:restartNumberingAfterBreak="0">
+  <w:abstractNum w:abstractNumId="42" w15:restartNumberingAfterBreak="0">
     <w:nsid w:val="47A36E91"/>
     <w:multiLevelType w:val="multilevel"/>
     <w:tmpl w:val="0096F4FC"/>
@@ -12629,7 +12620,7 @@
       </w:rPr>
     </w:lvl>
   </w:abstractNum>
-  <w:abstractNum w:abstractNumId="40" w15:restartNumberingAfterBreak="0">
+  <w:abstractNum w:abstractNumId="43" w15:restartNumberingAfterBreak="0">
     <w:nsid w:val="4840110E"/>
     <w:multiLevelType w:val="multilevel"/>
     <w:tmpl w:val="F4F049DE"/>
@@ -12778,7 +12769,7 @@
       </w:rPr>
     </w:lvl>
   </w:abstractNum>
-  <w:abstractNum w:abstractNumId="41" w15:restartNumberingAfterBreak="0">
+  <w:abstractNum w:abstractNumId="44" w15:restartNumberingAfterBreak="0">
     <w:nsid w:val="49D40E7B"/>
     <w:multiLevelType w:val="multilevel"/>
     <w:tmpl w:val="8A66CB56"/>
@@ -12927,7 +12918,7 @@
       </w:rPr>
     </w:lvl>
   </w:abstractNum>
-  <w:abstractNum w:abstractNumId="42" w15:restartNumberingAfterBreak="0">
+  <w:abstractNum w:abstractNumId="45" w15:restartNumberingAfterBreak="0">
     <w:nsid w:val="4A5305C5"/>
     <w:multiLevelType w:val="multilevel"/>
     <w:tmpl w:val="0AD874E0"/>
@@ -13076,7 +13067,7 @@
       </w:rPr>
     </w:lvl>
   </w:abstractNum>
-  <w:abstractNum w:abstractNumId="43" w15:restartNumberingAfterBreak="0">
+  <w:abstractNum w:abstractNumId="46" w15:restartNumberingAfterBreak="0">
     <w:nsid w:val="4BE855B4"/>
     <w:multiLevelType w:val="multilevel"/>
     <w:tmpl w:val="5BC89AEC"/>
@@ -13225,7 +13216,7 @@
       </w:rPr>
     </w:lvl>
   </w:abstractNum>
-  <w:abstractNum w:abstractNumId="44" w15:restartNumberingAfterBreak="0">
+  <w:abstractNum w:abstractNumId="47" w15:restartNumberingAfterBreak="0">
     <w:nsid w:val="4C2D2384"/>
     <w:multiLevelType w:val="multilevel"/>
     <w:tmpl w:val="62F0F3E2"/>
@@ -13374,7 +13365,7 @@
       </w:rPr>
     </w:lvl>
   </w:abstractNum>
-  <w:abstractNum w:abstractNumId="45" w15:restartNumberingAfterBreak="0">
+  <w:abstractNum w:abstractNumId="48" w15:restartNumberingAfterBreak="0">
     <w:nsid w:val="4C8830EB"/>
     <w:multiLevelType w:val="multilevel"/>
     <w:tmpl w:val="D6AC0F5A"/>
@@ -13523,7 +13514,7 @@
       </w:rPr>
     </w:lvl>
   </w:abstractNum>
-  <w:abstractNum w:abstractNumId="46" w15:restartNumberingAfterBreak="0">
+  <w:abstractNum w:abstractNumId="49" w15:restartNumberingAfterBreak="0">
     <w:nsid w:val="4DA33B00"/>
     <w:multiLevelType w:val="multilevel"/>
     <w:tmpl w:val="7ADE29FA"/>
@@ -13672,7 +13663,7 @@
       </w:rPr>
     </w:lvl>
   </w:abstractNum>
-  <w:abstractNum w:abstractNumId="47" w15:restartNumberingAfterBreak="0">
+  <w:abstractNum w:abstractNumId="50" w15:restartNumberingAfterBreak="0">
     <w:nsid w:val="50D539D2"/>
     <w:multiLevelType w:val="multilevel"/>
     <w:tmpl w:val="F5788EFA"/>
@@ -13821,7 +13812,7 @@
       </w:rPr>
     </w:lvl>
   </w:abstractNum>
-  <w:abstractNum w:abstractNumId="48" w15:restartNumberingAfterBreak="0">
+  <w:abstractNum w:abstractNumId="51" w15:restartNumberingAfterBreak="0">
     <w:nsid w:val="528F6F0B"/>
     <w:multiLevelType w:val="multilevel"/>
     <w:tmpl w:val="7C52B5E8"/>
@@ -13970,7 +13961,120 @@
       </w:rPr>
     </w:lvl>
   </w:abstractNum>
-  <w:abstractNum w:abstractNumId="49" w15:restartNumberingAfterBreak="0">
+  <w:abstractNum w:abstractNumId="52" w15:restartNumberingAfterBreak="0">
+    <w:nsid w:val="58207AA5"/>
+    <w:multiLevelType w:val="multilevel"/>
+    <w:tmpl w:val="DBA87294"/>
+    <w:lvl w:ilvl="0">
+      <w:start w:val="3"/>
+      <w:numFmt w:val="decimal"/>
+      <w:lvlText w:val="%1."/>
+      <w:lvlJc w:val="left"/>
+      <w:pPr>
+        <w:ind w:left="384" w:hanging="384"/>
+      </w:pPr>
+      <w:rPr>
+        <w:rFonts w:hint="default"/>
+      </w:rPr>
+    </w:lvl>
+    <w:lvl w:ilvl="1">
+      <w:start w:val="3"/>
+      <w:numFmt w:val="decimal"/>
+      <w:lvlText w:val="%1.%2-"/>
+      <w:lvlJc w:val="left"/>
+      <w:pPr>
+        <w:ind w:left="1603" w:hanging="720"/>
+      </w:pPr>
+      <w:rPr>
+        <w:rFonts w:hint="default"/>
+      </w:rPr>
+    </w:lvl>
+    <w:lvl w:ilvl="2">
+      <w:start w:val="1"/>
+      <w:numFmt w:val="decimal"/>
+      <w:lvlText w:val="%1.%2-%3."/>
+      <w:lvlJc w:val="left"/>
+      <w:pPr>
+        <w:ind w:left="2486" w:hanging="720"/>
+      </w:pPr>
+      <w:rPr>
+        <w:rFonts w:hint="default"/>
+      </w:rPr>
+    </w:lvl>
+    <w:lvl w:ilvl="3">
+      <w:start w:val="1"/>
+      <w:numFmt w:val="decimal"/>
+      <w:lvlText w:val="%1.%2-%3.%4."/>
+      <w:lvlJc w:val="left"/>
+      <w:pPr>
+        <w:ind w:left="3729" w:hanging="1080"/>
+      </w:pPr>
+      <w:rPr>
+        <w:rFonts w:hint="default"/>
+      </w:rPr>
+    </w:lvl>
+    <w:lvl w:ilvl="4">
+      <w:start w:val="1"/>
+      <w:numFmt w:val="decimal"/>
+      <w:lvlText w:val="%1.%2-%3.%4.%5."/>
+      <w:lvlJc w:val="left"/>
+      <w:pPr>
+        <w:ind w:left="4612" w:hanging="1080"/>
+      </w:pPr>
+      <w:rPr>
+        <w:rFonts w:hint="default"/>
+      </w:rPr>
+    </w:lvl>
+    <w:lvl w:ilvl="5">
+      <w:start w:val="1"/>
+      <w:numFmt w:val="decimal"/>
+      <w:lvlText w:val="%1.%2-%3.%4.%5.%6."/>
+      <w:lvlJc w:val="left"/>
+      <w:pPr>
+        <w:ind w:left="5855" w:hanging="1440"/>
+      </w:pPr>
+      <w:rPr>
+        <w:rFonts w:hint="default"/>
+      </w:rPr>
+    </w:lvl>
+    <w:lvl w:ilvl="6">
+      <w:start w:val="1"/>
+      <w:numFmt w:val="decimal"/>
+      <w:lvlText w:val="%1.%2-%3.%4.%5.%6.%7."/>
+      <w:lvlJc w:val="left"/>
+      <w:pPr>
+        <w:ind w:left="6738" w:hanging="1440"/>
+      </w:pPr>
+      <w:rPr>
+        <w:rFonts w:hint="default"/>
+      </w:rPr>
+    </w:lvl>
+    <w:lvl w:ilvl="7">
+      <w:start w:val="1"/>
+      <w:numFmt w:val="decimal"/>
+      <w:lvlText w:val="%1.%2-%3.%4.%5.%6.%7.%8."/>
+      <w:lvlJc w:val="left"/>
+      <w:pPr>
+        <w:ind w:left="7981" w:hanging="1800"/>
+      </w:pPr>
+      <w:rPr>
+        <w:rFonts w:hint="default"/>
+      </w:rPr>
+    </w:lvl>
+    <w:lvl w:ilvl="8">
+      <w:start w:val="1"/>
+      <w:numFmt w:val="decimal"/>
+      <w:lvlText w:val="%1.%2-%3.%4.%5.%6.%7.%8.%9."/>
+      <w:lvlJc w:val="left"/>
+      <w:pPr>
+        <w:ind w:left="8864" w:hanging="1800"/>
+      </w:pPr>
+      <w:rPr>
+        <w:rFonts w:hint="default"/>
+      </w:rPr>
+    </w:lvl>
+  </w:abstractNum>
+  <w:abstractNum w:abstractNumId="53" w15:restartNumberingAfterBreak="0">
     <w:nsid w:val="5904479E"/>
     <w:multiLevelType w:val="multilevel"/>
     <w:tmpl w:val="8B8E4D02"/>
@@ -14119,7 +14223,7 @@
       </w:rPr>
     </w:lvl>
   </w:abstractNum>
-  <w:abstractNum w:abstractNumId="50" w15:restartNumberingAfterBreak="0">
+  <w:abstractNum w:abstractNumId="54" w15:restartNumberingAfterBreak="0">
     <w:nsid w:val="5BB14E6D"/>
     <w:multiLevelType w:val="multilevel"/>
     <w:tmpl w:val="E6E8CE1E"/>
@@ -14268,7 +14372,7 @@
       </w:rPr>
     </w:lvl>
   </w:abstractNum>
-  <w:abstractNum w:abstractNumId="51" w15:restartNumberingAfterBreak="0">
+  <w:abstractNum w:abstractNumId="55" w15:restartNumberingAfterBreak="0">
     <w:nsid w:val="5C8F3520"/>
     <w:multiLevelType w:val="multilevel"/>
     <w:tmpl w:val="8D94FE96"/>
@@ -14417,7 +14521,7 @@
       </w:rPr>
     </w:lvl>
   </w:abstractNum>
-  <w:abstractNum w:abstractNumId="52" w15:restartNumberingAfterBreak="0">
+  <w:abstractNum w:abstractNumId="56" w15:restartNumberingAfterBreak="0">
     <w:nsid w:val="5EB51D9B"/>
     <w:multiLevelType w:val="multilevel"/>
     <w:tmpl w:val="F75E9B08"/>
@@ -14566,7 +14670,7 @@
       </w:rPr>
     </w:lvl>
   </w:abstractNum>
-  <w:abstractNum w:abstractNumId="53" w15:restartNumberingAfterBreak="0">
+  <w:abstractNum w:abstractNumId="57" w15:restartNumberingAfterBreak="0">
     <w:nsid w:val="61803293"/>
     <w:multiLevelType w:val="multilevel"/>
     <w:tmpl w:val="F2B2364E"/>
@@ -14715,7 +14819,7 @@
       </w:rPr>
     </w:lvl>
   </w:abstractNum>
-  <w:abstractNum w:abstractNumId="54" w15:restartNumberingAfterBreak="0">
+  <w:abstractNum w:abstractNumId="58" w15:restartNumberingAfterBreak="0">
     <w:nsid w:val="6435025E"/>
     <w:multiLevelType w:val="multilevel"/>
     <w:tmpl w:val="FA4A7EF8"/>
@@ -14864,7 +14968,7 @@
       </w:rPr>
     </w:lvl>
   </w:abstractNum>
-  <w:abstractNum w:abstractNumId="55" w15:restartNumberingAfterBreak="0">
+  <w:abstractNum w:abstractNumId="59" w15:restartNumberingAfterBreak="0">
     <w:nsid w:val="6A615D0A"/>
     <w:multiLevelType w:val="multilevel"/>
     <w:tmpl w:val="04DA9C96"/>
@@ -15013,7 +15117,7 @@
       </w:rPr>
     </w:lvl>
   </w:abstractNum>
-  <w:abstractNum w:abstractNumId="56" w15:restartNumberingAfterBreak="0">
+  <w:abstractNum w:abstractNumId="60" w15:restartNumberingAfterBreak="0">
     <w:nsid w:val="6B585064"/>
     <w:multiLevelType w:val="multilevel"/>
     <w:tmpl w:val="C9708278"/>
@@ -15162,7 +15266,7 @@
       </w:rPr>
     </w:lvl>
   </w:abstractNum>
-  <w:abstractNum w:abstractNumId="57" w15:restartNumberingAfterBreak="0">
+  <w:abstractNum w:abstractNumId="61" w15:restartNumberingAfterBreak="0">
     <w:nsid w:val="6B684A21"/>
     <w:multiLevelType w:val="multilevel"/>
     <w:tmpl w:val="298E823A"/>
@@ -15275,7 +15379,7 @@
       </w:pPr>
     </w:lvl>
   </w:abstractNum>
-  <w:abstractNum w:abstractNumId="58" w15:restartNumberingAfterBreak="0">
+  <w:abstractNum w:abstractNumId="62" w15:restartNumberingAfterBreak="0">
     <w:nsid w:val="6FD041F2"/>
     <w:multiLevelType w:val="multilevel"/>
     <w:tmpl w:val="4710AE5C"/>
@@ -15424,7 +15528,7 @@
       </w:rPr>
     </w:lvl>
   </w:abstractNum>
-  <w:abstractNum w:abstractNumId="59" w15:restartNumberingAfterBreak="0">
+  <w:abstractNum w:abstractNumId="63" w15:restartNumberingAfterBreak="0">
     <w:nsid w:val="703572C5"/>
     <w:multiLevelType w:val="multilevel"/>
     <w:tmpl w:val="68A86934"/>
@@ -15573,7 +15677,7 @@
       </w:rPr>
     </w:lvl>
   </w:abstractNum>
-  <w:abstractNum w:abstractNumId="60" w15:restartNumberingAfterBreak="0">
+  <w:abstractNum w:abstractNumId="64" w15:restartNumberingAfterBreak="0">
     <w:nsid w:val="71AE7F0D"/>
     <w:multiLevelType w:val="multilevel"/>
     <w:tmpl w:val="EF8A1424"/>
@@ -15722,7 +15826,7 @@
       </w:rPr>
     </w:lvl>
   </w:abstractNum>
-  <w:abstractNum w:abstractNumId="61" w15:restartNumberingAfterBreak="0">
+  <w:abstractNum w:abstractNumId="65" w15:restartNumberingAfterBreak="0">
     <w:nsid w:val="72643448"/>
     <w:multiLevelType w:val="multilevel"/>
     <w:tmpl w:val="D65AB50E"/>
@@ -15871,7 +15975,7 @@
       </w:rPr>
     </w:lvl>
   </w:abstractNum>
-  <w:abstractNum w:abstractNumId="62" w15:restartNumberingAfterBreak="0">
+  <w:abstractNum w:abstractNumId="66" w15:restartNumberingAfterBreak="0">
     <w:nsid w:val="73A713BF"/>
     <w:multiLevelType w:val="multilevel"/>
     <w:tmpl w:val="6956675E"/>
@@ -16020,7 +16124,7 @@
       </w:rPr>
     </w:lvl>
   </w:abstractNum>
-  <w:abstractNum w:abstractNumId="63" w15:restartNumberingAfterBreak="0">
+  <w:abstractNum w:abstractNumId="67" w15:restartNumberingAfterBreak="0">
     <w:nsid w:val="73E02FF6"/>
     <w:multiLevelType w:val="multilevel"/>
     <w:tmpl w:val="3B98A8AE"/>
@@ -16169,7 +16273,7 @@
       </w:rPr>
     </w:lvl>
   </w:abstractNum>
-  <w:abstractNum w:abstractNumId="64" w15:restartNumberingAfterBreak="0">
+  <w:abstractNum w:abstractNumId="68" w15:restartNumberingAfterBreak="0">
     <w:nsid w:val="749F5ACC"/>
     <w:multiLevelType w:val="multilevel"/>
     <w:tmpl w:val="0BA04AAA"/>
@@ -16318,7 +16422,7 @@
       </w:rPr>
     </w:lvl>
   </w:abstractNum>
-  <w:abstractNum w:abstractNumId="65" w15:restartNumberingAfterBreak="0">
+  <w:abstractNum w:abstractNumId="69" w15:restartNumberingAfterBreak="0">
     <w:nsid w:val="74CD2E32"/>
     <w:multiLevelType w:val="multilevel"/>
     <w:tmpl w:val="F9700652"/>
@@ -16467,7 +16571,7 @@
       </w:rPr>
     </w:lvl>
   </w:abstractNum>
-  <w:abstractNum w:abstractNumId="66" w15:restartNumberingAfterBreak="0">
+  <w:abstractNum w:abstractNumId="70" w15:restartNumberingAfterBreak="0">
     <w:nsid w:val="77165B1A"/>
     <w:multiLevelType w:val="multilevel"/>
     <w:tmpl w:val="782C9F1C"/>
@@ -16616,7 +16720,7 @@
       </w:rPr>
     </w:lvl>
   </w:abstractNum>
-  <w:abstractNum w:abstractNumId="67" w15:restartNumberingAfterBreak="0">
+  <w:abstractNum w:abstractNumId="71" w15:restartNumberingAfterBreak="0">
     <w:nsid w:val="776525DD"/>
     <w:multiLevelType w:val="multilevel"/>
     <w:tmpl w:val="298E823A"/>
@@ -16729,7 +16833,7 @@
       </w:pPr>
     </w:lvl>
   </w:abstractNum>
-  <w:abstractNum w:abstractNumId="68" w15:restartNumberingAfterBreak="0">
+  <w:abstractNum w:abstractNumId="72" w15:restartNumberingAfterBreak="0">
     <w:nsid w:val="781C28BF"/>
     <w:multiLevelType w:val="multilevel"/>
     <w:tmpl w:val="BC7EC822"/>
@@ -16878,7 +16982,7 @@
       </w:rPr>
     </w:lvl>
   </w:abstractNum>
-  <w:abstractNum w:abstractNumId="69" w15:restartNumberingAfterBreak="0">
+  <w:abstractNum w:abstractNumId="73" w15:restartNumberingAfterBreak="0">
     <w:nsid w:val="78F35945"/>
     <w:multiLevelType w:val="multilevel"/>
     <w:tmpl w:val="D70446D8"/>
@@ -17027,7 +17131,7 @@
       </w:rPr>
     </w:lvl>
   </w:abstractNum>
-  <w:abstractNum w:abstractNumId="70" w15:restartNumberingAfterBreak="0">
+  <w:abstractNum w:abstractNumId="74" w15:restartNumberingAfterBreak="0">
     <w:nsid w:val="793B248C"/>
     <w:multiLevelType w:val="multilevel"/>
     <w:tmpl w:val="71DC9570"/>
@@ -17176,7 +17280,7 @@
       </w:rPr>
     </w:lvl>
   </w:abstractNum>
-  <w:abstractNum w:abstractNumId="71" w15:restartNumberingAfterBreak="0">
+  <w:abstractNum w:abstractNumId="75" w15:restartNumberingAfterBreak="0">
     <w:nsid w:val="79933D67"/>
     <w:multiLevelType w:val="multilevel"/>
     <w:tmpl w:val="CFA6C336"/>
@@ -17325,7 +17429,7 @@
       </w:rPr>
     </w:lvl>
   </w:abstractNum>
-  <w:abstractNum w:abstractNumId="72" w15:restartNumberingAfterBreak="0">
+  <w:abstractNum w:abstractNumId="76" w15:restartNumberingAfterBreak="0">
     <w:nsid w:val="7C4F33AE"/>
     <w:multiLevelType w:val="multilevel"/>
     <w:tmpl w:val="AF82A1EA"/>
@@ -17478,220 +17582,232 @@
     <w:abstractNumId w:val="6"/>
   </w:num>
   <w:num w:numId="2" w16cid:durableId="301738031">
-    <w:abstractNumId w:val="13"/>
+    <w:abstractNumId w:val="15"/>
   </w:num>
   <w:num w:numId="3" w16cid:durableId="1274360054">
-    <w:abstractNumId w:val="26"/>
+    <w:abstractNumId w:val="28"/>
   </w:num>
   <w:num w:numId="4" w16cid:durableId="613706483">
-    <w:abstractNumId w:val="38"/>
+    <w:abstractNumId w:val="41"/>
   </w:num>
   <w:num w:numId="5" w16cid:durableId="82773223">
+    <w:abstractNumId w:val="60"/>
+  </w:num>
+  <w:num w:numId="6" w16cid:durableId="1480414307">
+    <w:abstractNumId w:val="58"/>
+  </w:num>
+  <w:num w:numId="7" w16cid:durableId="519319308">
+    <w:abstractNumId w:val="46"/>
+  </w:num>
+  <w:num w:numId="8" w16cid:durableId="1777747418">
+    <w:abstractNumId w:val="73"/>
+  </w:num>
+  <w:num w:numId="9" w16cid:durableId="1271007452">
+    <w:abstractNumId w:val="14"/>
+  </w:num>
+  <w:num w:numId="10" w16cid:durableId="1683626965">
+    <w:abstractNumId w:val="10"/>
+  </w:num>
+  <w:num w:numId="11" w16cid:durableId="1949192522">
+    <w:abstractNumId w:val="37"/>
+  </w:num>
+  <w:num w:numId="12" w16cid:durableId="1988774629">
+    <w:abstractNumId w:val="69"/>
+  </w:num>
+  <w:num w:numId="13" w16cid:durableId="1126697290">
+    <w:abstractNumId w:val="64"/>
+  </w:num>
+  <w:num w:numId="14" w16cid:durableId="1508254940">
+    <w:abstractNumId w:val="8"/>
+  </w:num>
+  <w:num w:numId="15" w16cid:durableId="1053501433">
+    <w:abstractNumId w:val="65"/>
+  </w:num>
+  <w:num w:numId="16" w16cid:durableId="861675446">
+    <w:abstractNumId w:val="40"/>
+  </w:num>
+  <w:num w:numId="17" w16cid:durableId="966350409">
+    <w:abstractNumId w:val="20"/>
+  </w:num>
+  <w:num w:numId="18" w16cid:durableId="2067530749">
+    <w:abstractNumId w:val="62"/>
+  </w:num>
+  <w:num w:numId="19" w16cid:durableId="2131894526">
+    <w:abstractNumId w:val="61"/>
+  </w:num>
+  <w:num w:numId="20" w16cid:durableId="1771664060">
+    <w:abstractNumId w:val="32"/>
+  </w:num>
+  <w:num w:numId="21" w16cid:durableId="239993164">
+    <w:abstractNumId w:val="29"/>
+  </w:num>
+  <w:num w:numId="22" w16cid:durableId="1404639267">
+    <w:abstractNumId w:val="16"/>
+  </w:num>
+  <w:num w:numId="23" w16cid:durableId="157768096">
+    <w:abstractNumId w:val="42"/>
+  </w:num>
+  <w:num w:numId="24" w16cid:durableId="296450935">
+    <w:abstractNumId w:val="74"/>
+  </w:num>
+  <w:num w:numId="25" w16cid:durableId="1545409395">
+    <w:abstractNumId w:val="22"/>
+  </w:num>
+  <w:num w:numId="26" w16cid:durableId="1309633372">
+    <w:abstractNumId w:val="17"/>
+  </w:num>
+  <w:num w:numId="27" w16cid:durableId="648369003">
     <w:abstractNumId w:val="56"/>
   </w:num>
-  <w:num w:numId="6" w16cid:durableId="1480414307">
-    <w:abstractNumId w:val="54"/>
-  </w:num>
-  <w:num w:numId="7" w16cid:durableId="519319308">
-    <w:abstractNumId w:val="43"/>
-  </w:num>
-  <w:num w:numId="8" w16cid:durableId="1777747418">
-    <w:abstractNumId w:val="69"/>
-  </w:num>
-  <w:num w:numId="9" w16cid:durableId="1271007452">
-    <w:abstractNumId w:val="12"/>
-  </w:num>
-  <w:num w:numId="10" w16cid:durableId="1683626965">
-    <w:abstractNumId w:val="8"/>
-  </w:num>
-  <w:num w:numId="11" w16cid:durableId="1949192522">
-    <w:abstractNumId w:val="34"/>
-  </w:num>
-  <w:num w:numId="12" w16cid:durableId="1988774629">
-    <w:abstractNumId w:val="65"/>
-  </w:num>
-  <w:num w:numId="13" w16cid:durableId="1126697290">
-    <w:abstractNumId w:val="60"/>
-  </w:num>
-  <w:num w:numId="14" w16cid:durableId="1508254940">
-    <w:abstractNumId w:val="7"/>
-  </w:num>
-  <w:num w:numId="15" w16cid:durableId="1053501433">
-    <w:abstractNumId w:val="61"/>
-  </w:num>
-  <w:num w:numId="16" w16cid:durableId="861675446">
-    <w:abstractNumId w:val="37"/>
-  </w:num>
-  <w:num w:numId="17" w16cid:durableId="966350409">
-    <w:abstractNumId w:val="18"/>
-  </w:num>
-  <w:num w:numId="18" w16cid:durableId="2067530749">
-    <w:abstractNumId w:val="58"/>
-  </w:num>
-  <w:num w:numId="19" w16cid:durableId="2131894526">
-    <w:abstractNumId w:val="57"/>
-  </w:num>
-  <w:num w:numId="20" w16cid:durableId="1771664060">
-    <w:abstractNumId w:val="30"/>
-  </w:num>
-  <w:num w:numId="21" w16cid:durableId="239993164">
-    <w:abstractNumId w:val="27"/>
-  </w:num>
-  <w:num w:numId="22" w16cid:durableId="1404639267">
-    <w:abstractNumId w:val="14"/>
-  </w:num>
-  <w:num w:numId="23" w16cid:durableId="157768096">
-    <w:abstractNumId w:val="39"/>
-  </w:num>
-  <w:num w:numId="24" w16cid:durableId="296450935">
-    <w:abstractNumId w:val="70"/>
-  </w:num>
-  <w:num w:numId="25" w16cid:durableId="1545409395">
-    <w:abstractNumId w:val="20"/>
-  </w:num>
-  <w:num w:numId="26" w16cid:durableId="1309633372">
-    <w:abstractNumId w:val="15"/>
-  </w:num>
-  <w:num w:numId="27" w16cid:durableId="648369003">
-    <w:abstractNumId w:val="52"/>
-  </w:num>
   <w:num w:numId="28" w16cid:durableId="1022322211">
-    <w:abstractNumId w:val="62"/>
+    <w:abstractNumId w:val="66"/>
   </w:num>
   <w:num w:numId="29" w16cid:durableId="745030227">
     <w:abstractNumId w:val="3"/>
   </w:num>
   <w:num w:numId="30" w16cid:durableId="92552692">
-    <w:abstractNumId w:val="68"/>
+    <w:abstractNumId w:val="72"/>
   </w:num>
   <w:num w:numId="31" w16cid:durableId="830485529">
-    <w:abstractNumId w:val="16"/>
+    <w:abstractNumId w:val="18"/>
   </w:num>
   <w:num w:numId="32" w16cid:durableId="813179042">
     <w:abstractNumId w:val="1"/>
   </w:num>
   <w:num w:numId="33" w16cid:durableId="1015612975">
-    <w:abstractNumId w:val="24"/>
+    <w:abstractNumId w:val="26"/>
   </w:num>
   <w:num w:numId="34" w16cid:durableId="1388994346">
     <w:abstractNumId w:val="4"/>
   </w:num>
   <w:num w:numId="35" w16cid:durableId="1800876700">
-    <w:abstractNumId w:val="53"/>
+    <w:abstractNumId w:val="57"/>
   </w:num>
   <w:num w:numId="36" w16cid:durableId="954098576">
-    <w:abstractNumId w:val="17"/>
+    <w:abstractNumId w:val="19"/>
   </w:num>
   <w:num w:numId="37" w16cid:durableId="590939360">
-    <w:abstractNumId w:val="71"/>
+    <w:abstractNumId w:val="75"/>
   </w:num>
   <w:num w:numId="38" w16cid:durableId="258102778">
-    <w:abstractNumId w:val="29"/>
+    <w:abstractNumId w:val="31"/>
   </w:num>
   <w:num w:numId="39" w16cid:durableId="800460075">
-    <w:abstractNumId w:val="46"/>
+    <w:abstractNumId w:val="49"/>
   </w:num>
   <w:num w:numId="40" w16cid:durableId="780609625">
-    <w:abstractNumId w:val="59"/>
+    <w:abstractNumId w:val="63"/>
   </w:num>
   <w:num w:numId="41" w16cid:durableId="2037656123">
     <w:abstractNumId w:val="5"/>
   </w:num>
   <w:num w:numId="42" w16cid:durableId="1072973833">
+    <w:abstractNumId w:val="51"/>
+  </w:num>
+  <w:num w:numId="43" w16cid:durableId="72817663">
+    <w:abstractNumId w:val="25"/>
+  </w:num>
+  <w:num w:numId="44" w16cid:durableId="944996341">
+    <w:abstractNumId w:val="35"/>
+  </w:num>
+  <w:num w:numId="45" w16cid:durableId="922104794">
+    <w:abstractNumId w:val="27"/>
+  </w:num>
+  <w:num w:numId="46" w16cid:durableId="1613904105">
+    <w:abstractNumId w:val="59"/>
+  </w:num>
+  <w:num w:numId="47" w16cid:durableId="2042048566">
+    <w:abstractNumId w:val="68"/>
+  </w:num>
+  <w:num w:numId="48" w16cid:durableId="1927108778">
+    <w:abstractNumId w:val="47"/>
+  </w:num>
+  <w:num w:numId="49" w16cid:durableId="563685763">
+    <w:abstractNumId w:val="44"/>
+  </w:num>
+  <w:num w:numId="50" w16cid:durableId="738406364">
+    <w:abstractNumId w:val="45"/>
+  </w:num>
+  <w:num w:numId="51" w16cid:durableId="38945172">
+    <w:abstractNumId w:val="39"/>
+  </w:num>
+  <w:num w:numId="52" w16cid:durableId="53741239">
+    <w:abstractNumId w:val="13"/>
+  </w:num>
+  <w:num w:numId="53" w16cid:durableId="401411049">
     <w:abstractNumId w:val="48"/>
   </w:num>
-  <w:num w:numId="43" w16cid:durableId="72817663">
-    <w:abstractNumId w:val="23"/>
+  <w:num w:numId="54" w16cid:durableId="1017542728">
+    <w:abstractNumId w:val="12"/>
   </w:num>
-  <w:num w:numId="44" w16cid:durableId="944996341">
-    <w:abstractNumId w:val="32"/>
+  <w:num w:numId="55" w16cid:durableId="948468699">
+    <w:abstractNumId w:val="38"/>
   </w:num>
-  <w:num w:numId="45" w16cid:durableId="922104794">
-    <w:abstractNumId w:val="25"/>
-  </w:num>
-  <w:num w:numId="46" w16cid:durableId="1613904105">
-    <w:abstractNumId w:val="55"/>
-  </w:num>
-  <w:num w:numId="47" w16cid:durableId="2042048566">
-    <w:abstractNumId w:val="64"/>
-  </w:num>
-  <w:num w:numId="48" w16cid:durableId="1927108778">
-    <w:abstractNumId w:val="44"/>
-  </w:num>
-  <w:num w:numId="49" w16cid:durableId="563685763">
-    <w:abstractNumId w:val="41"/>
-  </w:num>
-  <w:num w:numId="50" w16cid:durableId="738406364">
-    <w:abstractNumId w:val="42"/>
-  </w:num>
-  <w:num w:numId="51" w16cid:durableId="38945172">
-    <w:abstractNumId w:val="36"/>
-  </w:num>
-  <w:num w:numId="52" w16cid:durableId="53741239">
+  <w:num w:numId="56" w16cid:durableId="1382439239">
     <w:abstractNumId w:val="11"/>
   </w:num>
-  <w:num w:numId="53" w16cid:durableId="401411049">
-    <w:abstractNumId w:val="45"/>
-  </w:num>
-  <w:num w:numId="54" w16cid:durableId="1017542728">
-    <w:abstractNumId w:val="10"/>
-  </w:num>
-  <w:num w:numId="55" w16cid:durableId="948468699">
-    <w:abstractNumId w:val="35"/>
-  </w:num>
-  <w:num w:numId="56" w16cid:durableId="1382439239">
-    <w:abstractNumId w:val="9"/>
-  </w:num>
   <w:num w:numId="57" w16cid:durableId="84542336">
-    <w:abstractNumId w:val="33"/>
+    <w:abstractNumId w:val="36"/>
   </w:num>
   <w:num w:numId="58" w16cid:durableId="1177428437">
     <w:abstractNumId w:val="0"/>
   </w:num>
   <w:num w:numId="59" w16cid:durableId="1333027988">
-    <w:abstractNumId w:val="49"/>
+    <w:abstractNumId w:val="53"/>
   </w:num>
   <w:num w:numId="60" w16cid:durableId="877936063">
-    <w:abstractNumId w:val="51"/>
+    <w:abstractNumId w:val="55"/>
   </w:num>
   <w:num w:numId="61" w16cid:durableId="2107722953">
-    <w:abstractNumId w:val="72"/>
+    <w:abstractNumId w:val="76"/>
   </w:num>
   <w:num w:numId="62" w16cid:durableId="756176210">
-    <w:abstractNumId w:val="67"/>
+    <w:abstractNumId w:val="71"/>
   </w:num>
   <w:num w:numId="63" w16cid:durableId="2029023218">
-    <w:abstractNumId w:val="22"/>
+    <w:abstractNumId w:val="24"/>
   </w:num>
   <w:num w:numId="64" w16cid:durableId="1972207394">
-    <w:abstractNumId w:val="50"/>
+    <w:abstractNumId w:val="54"/>
   </w:num>
   <w:num w:numId="65" w16cid:durableId="2104060565">
     <w:abstractNumId w:val="2"/>
   </w:num>
   <w:num w:numId="66" w16cid:durableId="980574045">
-    <w:abstractNumId w:val="19"/>
+    <w:abstractNumId w:val="21"/>
   </w:num>
   <w:num w:numId="67" w16cid:durableId="1227570431">
-    <w:abstractNumId w:val="66"/>
+    <w:abstractNumId w:val="70"/>
   </w:num>
   <w:num w:numId="68" w16cid:durableId="1186476830">
-    <w:abstractNumId w:val="47"/>
+    <w:abstractNumId w:val="50"/>
   </w:num>
   <w:num w:numId="69" w16cid:durableId="204366438">
-    <w:abstractNumId w:val="40"/>
+    <w:abstractNumId w:val="43"/>
   </w:num>
   <w:num w:numId="70" w16cid:durableId="186532295">
-    <w:abstractNumId w:val="31"/>
+    <w:abstractNumId w:val="33"/>
   </w:num>
   <w:num w:numId="71" w16cid:durableId="1130634788">
-    <w:abstractNumId w:val="63"/>
+    <w:abstractNumId w:val="67"/>
   </w:num>
   <w:num w:numId="72" w16cid:durableId="146820849">
-    <w:abstractNumId w:val="28"/>
+    <w:abstractNumId w:val="30"/>
   </w:num>
   <w:num w:numId="73" w16cid:durableId="572005992">
-    <w:abstractNumId w:val="21"/>
+    <w:abstractNumId w:val="23"/>
+  </w:num>
+  <w:num w:numId="74" w16cid:durableId="1489786517">
+    <w:abstractNumId w:val="7"/>
+  </w:num>
+  <w:num w:numId="75" w16cid:durableId="2022199500">
+    <w:abstractNumId w:val="34"/>
+  </w:num>
+  <w:num w:numId="76" w16cid:durableId="1797334623">
+    <w:abstractNumId w:val="9"/>
+  </w:num>
+  <w:num w:numId="77" w16cid:durableId="238832599">
+    <w:abstractNumId w:val="52"/>
   </w:num>
 </w:numbering>
 </file>

</xml_diff>